<commit_message>
Tailor CV for energy trading role
Co-authored-by: mngenius <6729397+mngenius@users.noreply.github.com>
</commit_message>
<xml_diff>
--- a/CV-QIM-Amin LEBSIR-TOTSA-EN.docx
+++ b/CV-QIM-Amin LEBSIR-TOTSA-EN.docx
@@ -1,8 +1,8 @@
 
 <file path=word/document.xml><?xml version="1.0" encoding="utf-8"?>
-<w:document xmlns:wpc="http://schemas.microsoft.com/office/word/2010/wordprocessingCanvas" xmlns:cx="http://schemas.microsoft.com/office/drawing/2014/chartex" xmlns:cx1="http://schemas.microsoft.com/office/drawing/2015/9/8/chartex" xmlns:cx2="http://schemas.microsoft.com/office/drawing/2015/10/21/chartex" xmlns:cx3="http://schemas.microsoft.com/office/drawing/2016/5/9/chartex" xmlns:cx4="http://schemas.microsoft.com/office/drawing/2016/5/10/chartex" xmlns:cx5="http://schemas.microsoft.com/office/drawing/2016/5/11/chartex" xmlns:cx6="http://schemas.microsoft.com/office/drawing/2016/5/12/chartex" xmlns:cx7="http://schemas.microsoft.com/office/drawing/2016/5/13/chartex" xmlns:cx8="http://schemas.microsoft.com/office/drawing/2016/5/14/chartex" xmlns:mc="http://schemas.openxmlformats.org/markup-compatibility/2006" xmlns:aink="http://schemas.microsoft.com/office/drawing/2016/ink" xmlns:am3d="http://schemas.microsoft.com/office/drawing/2017/model3d" xmlns:o="urn:schemas-microsoft-com:office:office" xmlns:oel="http://schemas.microsoft.com/office/2019/extlst" xmlns:r="http://schemas.openxmlformats.org/officeDocument/2006/relationships" xmlns:m="http://schemas.openxmlformats.org/officeDocument/2006/math" xmlns:v="urn:schemas-microsoft-com:vml" xmlns:wp14="http://schemas.microsoft.com/office/word/2010/wordprocessingDrawing" xmlns:wp="http://schemas.openxmlformats.org/drawingml/2006/wordprocessingDrawing" xmlns:w10="urn:schemas-microsoft-com:office:word" xmlns:w="http://schemas.openxmlformats.org/wordprocessingml/2006/main" xmlns:w14="http://schemas.microsoft.com/office/word/2010/wordml" xmlns:w15="http://schemas.microsoft.com/office/word/2012/wordml" xmlns:w16cex="http://schemas.microsoft.com/office/word/2018/wordml/cex" xmlns:w16cid="http://schemas.microsoft.com/office/word/2016/wordml/cid" xmlns:w16="http://schemas.microsoft.com/office/word/2018/wordml" xmlns:w16du="http://schemas.microsoft.com/office/word/2023/wordml/word16du" xmlns:w16sdtdh="http://schemas.microsoft.com/office/word/2020/wordml/sdtdatahash" xmlns:w16sdtfl="http://schemas.microsoft.com/office/word/2024/wordml/sdtformatlock" xmlns:w16se="http://schemas.microsoft.com/office/word/2015/wordml/symex" xmlns:wpg="http://schemas.microsoft.com/office/word/2010/wordprocessingGroup" xmlns:wpi="http://schemas.microsoft.com/office/word/2010/wordprocessingInk" xmlns:wne="http://schemas.microsoft.com/office/word/2006/wordml" xmlns:wps="http://schemas.microsoft.com/office/word/2010/wordprocessingShape" mc:Ignorable="w14 w15 w16se w16cid w16 w16cex w16sdtdh w16sdtfl w16du wp14">
+<w:document xmlns:ns1="http://schemas.openxmlformats.org/markup-compatibility/2006" xmlns:ns10="http://schemas.openxmlformats.org/officeDocument/2006/relationships" xmlns:ns11="http://schemas.microsoft.com/office/drawing/2010/main" xmlns:ns2="http://schemas.microsoft.com/office/word/2010/wordml" xmlns:ns3="http://schemas.openxmlformats.org/drawingml/2006/wordprocessingDrawing" xmlns:ns4="http://schemas.microsoft.com/office/word/2010/wordprocessingDrawing" xmlns:ns5="http://schemas.openxmlformats.org/drawingml/2006/main" xmlns:ns6="http://schemas.microsoft.com/office/word/2010/wordprocessingShape" xmlns:ns7="urn:schemas-microsoft-com:vml" xmlns:ns8="urn:schemas-microsoft-com:office:office" xmlns:ns9="http://schemas.openxmlformats.org/drawingml/2006/picture" xmlns:w="http://schemas.openxmlformats.org/wordprocessingml/2006/main" ns1:Ignorable="w14 w15 w16se w16cid w16 w16cex w16sdtdh w16sdtfl w16du wp14">
   <w:body>
-    <w:p>
+    <w:p ns2:paraId="010ED48C" ns2:textId="3CE48952">
       <w:pPr>
         <w:ind w:left="426"/>
         <w:rPr>
@@ -22,42 +22,42 @@
           <w:szCs w:val="22"/>
           <w:lang w:eastAsia="en-US" w:bidi="ar-SA"/>
         </w:rPr>
-        <mc:AlternateContent>
-          <mc:Choice Requires="wps">
+        <ns1:AlternateContent>
+          <ns1:Choice Requires="wps">
             <w:drawing>
-              <wp:anchor distT="0" distB="0" distL="114300" distR="114300" simplePos="0" relativeHeight="251658241" behindDoc="0" locked="0" layoutInCell="1" allowOverlap="1" wp14:anchorId="5514A656" wp14:editId="466C9ABB">
-                <wp:simplePos x="0" y="0"/>
-                <wp:positionH relativeFrom="column">
-                  <wp:posOffset>-63988</wp:posOffset>
-                </wp:positionH>
-                <wp:positionV relativeFrom="paragraph">
-                  <wp:posOffset>239296</wp:posOffset>
-                </wp:positionV>
-                <wp:extent cx="7227276" cy="1512277"/>
-                <wp:effectExtent l="0" t="0" r="0" b="0"/>
-                <wp:wrapNone/>
-                <wp:docPr id="1001" name="Zone de texte 20"/>
-                <wp:cNvGraphicFramePr/>
-                <a:graphic xmlns:a="http://schemas.openxmlformats.org/drawingml/2006/main">
-                  <a:graphicData uri="http://schemas.microsoft.com/office/word/2010/wordprocessingShape">
-                    <wps:wsp>
-                      <wps:cNvSpPr txBox="1"/>
-                      <wps:spPr>
-                        <a:xfrm>
-                          <a:off x="0" y="0"/>
-                          <a:ext cx="7227276" cy="1512277"/>
-                        </a:xfrm>
-                        <a:prstGeom prst="rect">
-                          <a:avLst/>
-                        </a:prstGeom>
-                        <a:noFill/>
-                        <a:ln w="6350">
-                          <a:noFill/>
-                        </a:ln>
-                      </wps:spPr>
-                      <wps:txbx>
+              <ns3:anchor distT="0" distB="0" distL="114300" distR="114300" simplePos="0" relativeHeight="251658241" behindDoc="0" locked="0" layoutInCell="1" allowOverlap="1" ns4:anchorId="5514A656" ns4:editId="466C9ABB">
+                <ns3:simplePos x="0" y="0"/>
+                <ns3:positionH relativeFrom="column">
+                  <ns3:posOffset>-63988</ns3:posOffset>
+                </ns3:positionH>
+                <ns3:positionV relativeFrom="paragraph">
+                  <ns3:posOffset>239296</ns3:posOffset>
+                </ns3:positionV>
+                <ns3:extent cx="7227276" cy="1512277"/>
+                <ns3:effectExtent l="0" t="0" r="0" b="0"/>
+                <ns3:wrapNone/>
+                <ns3:docPr id="1001" name="Zone de texte 20"/>
+                <ns3:cNvGraphicFramePr/>
+                <ns5:graphic>
+                  <ns5:graphicData uri="http://schemas.microsoft.com/office/word/2010/wordprocessingShape">
+                    <ns6:wsp>
+                      <ns6:cNvSpPr txBox="1"/>
+                      <ns6:spPr>
+                        <ns5:xfrm>
+                          <ns5:off x="0" y="0"/>
+                          <ns5:ext cx="7227276" cy="1512277"/>
+                        </ns5:xfrm>
+                        <ns5:prstGeom prst="rect">
+                          <ns5:avLst/>
+                        </ns5:prstGeom>
+                        <ns5:noFill/>
+                        <ns5:ln w="6350">
+                          <ns5:noFill/>
+                        </ns5:ln>
+                      </ns6:spPr>
+                      <ns6:txbx>
                         <w:txbxContent>
-                          <w:p>
+                          <w:p ns2:paraId="5097D636" ns2:textId="77777777">
                             <w:pPr>
                               <w:pStyle w:val="Titre1"/>
                               <w:numPr>
@@ -82,7 +82,7 @@
                               <w:t>Amin LEBSIR</w:t>
                             </w:r>
                           </w:p>
-                          <w:p>
+                          <w:p ns2:paraId="7D48C9A9" ns2:textId="77777777">
                             <w:pPr>
                               <w:spacing w:before="27"/>
                               <w:ind w:left="426"/>
@@ -105,7 +105,7 @@
                               <w:t>Data Lead Cloud Data Lead Data Platform Architect</w:t>
                             </w:r>
                           </w:p>
-                          <w:p>
+                          <w:p ns2:paraId="1A16275E" ns2:textId="2CEC3C4A">
                             <w:pPr>
                               <w:spacing w:before="27"/>
                               <w:rPr>
@@ -135,7 +135,7 @@
                               <w:br/>
                             </w:r>
                           </w:p>
-                          <w:p>
+                          <w:p ns2:paraId="3B298639" ns2:textId="77777777">
                             <w:pPr>
                               <w:ind w:left="426"/>
                               <w:rPr>
@@ -149,35 +149,35 @@
                             </w:pPr>
                           </w:p>
                         </w:txbxContent>
-                      </wps:txbx>
-                      <wps:bodyPr rot="0" spcFirstLastPara="0" vertOverflow="overflow" horzOverflow="overflow" vert="horz" wrap="square" lIns="91440" tIns="45720" rIns="91440" bIns="45720" numCol="1" spcCol="0" rtlCol="0" fromWordArt="0" anchor="t" anchorCtr="0" forceAA="0" compatLnSpc="1">
-                        <a:prstTxWarp prst="textNoShape">
-                          <a:avLst/>
-                        </a:prstTxWarp>
-                        <a:noAutofit/>
-                      </wps:bodyPr>
-                    </wps:wsp>
-                  </a:graphicData>
-                </a:graphic>
-                <wp14:sizeRelH relativeFrom="margin">
-                  <wp14:pctWidth>0</wp14:pctWidth>
-                </wp14:sizeRelH>
-                <wp14:sizeRelV relativeFrom="margin">
-                  <wp14:pctHeight>0</wp14:pctHeight>
-                </wp14:sizeRelV>
-              </wp:anchor>
+                      </ns6:txbx>
+                      <ns6:bodyPr rot="0" spcFirstLastPara="0" vertOverflow="overflow" horzOverflow="overflow" vert="horz" wrap="square" lIns="91440" tIns="45720" rIns="91440" bIns="45720" numCol="1" spcCol="0" rtlCol="0" fromWordArt="0" anchor="t" anchorCtr="0" forceAA="0" compatLnSpc="1">
+                        <ns5:prstTxWarp prst="textNoShape">
+                          <ns5:avLst/>
+                        </ns5:prstTxWarp>
+                        <ns5:noAutofit/>
+                      </ns6:bodyPr>
+                    </ns6:wsp>
+                  </ns5:graphicData>
+                </ns5:graphic>
+                <ns4:sizeRelH relativeFrom="margin">
+                  <ns4:pctWidth>0</ns4:pctWidth>
+                </ns4:sizeRelH>
+                <ns4:sizeRelV relativeFrom="margin">
+                  <ns4:pctHeight>0</ns4:pctHeight>
+                </ns4:sizeRelV>
+              </ns3:anchor>
             </w:drawing>
-          </mc:Choice>
-          <mc:Fallback>
+          </ns1:Choice>
+          <ns1:Fallback>
             <w:pict>
-              <v:shapetype w14:anchorId="5514A656" id="_x0000_t202" coordsize="21600,21600" o:spt="202" path="m,l,21600r21600,l21600,xe">
-                <v:stroke joinstyle="miter"/>
-                <v:path gradientshapeok="t" o:connecttype="rect"/>
-              </v:shapetype>
-              <v:shape id="Zone de texte 20" o:spid="_x0000_s1026" type="#_x0000_t202" style="position:absolute;left:0;text-align:left;margin-left:-5.05pt;margin-top:18.85pt;width:569.1pt;height:119.1pt;z-index:251658241;visibility:visible;mso-wrap-style:square;mso-width-percent:0;mso-height-percent:0;mso-wrap-distance-left:9pt;mso-wrap-distance-top:0;mso-wrap-distance-right:9pt;mso-wrap-distance-bottom:0;mso-position-horizontal:absolute;mso-position-horizontal-relative:text;mso-position-vertical:absolute;mso-position-vertical-relative:text;mso-width-percent:0;mso-height-percent:0;mso-width-relative:margin;mso-height-relative:margin;v-text-anchor:top" o:gfxdata="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" filled="f" stroked="f" strokeweight=".5pt">
-                <v:textbox>
+              <ns7:shapetype ns2:anchorId="5514A656" id="_x0000_t202" coordsize="21600,21600" ns8:spt="202" path="m,l,21600r21600,l21600,xe">
+                <ns7:stroke joinstyle="miter"/>
+                <ns7:path gradientshapeok="t" ns8:connecttype="rect"/>
+              </ns7:shapetype>
+              <ns7:shape id="Zone de texte 20" ns8:spid="_x0000_s1026" type="#_x0000_t202" style="position:absolute;left:0;text-align:left;margin-left:-5.05pt;margin-top:18.85pt;width:569.1pt;height:119.1pt;z-index:251658241;visibility:visible;mso-wrap-style:square;mso-width-percent:0;mso-height-percent:0;mso-wrap-distance-left:9pt;mso-wrap-distance-top:0;mso-wrap-distance-right:9pt;mso-wrap-distance-bottom:0;mso-position-horizontal:absolute;mso-position-horizontal-relative:text;mso-position-vertical:absolute;mso-position-vertical-relative:text;mso-width-percent:0;mso-height-percent:0;mso-width-relative:margin;mso-height-relative:margin;v-text-anchor:top" ns8:gfxdata="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" filled="f" stroked="f" strokeweight=".5pt">
+                <ns7:textbox>
                   <w:txbxContent>
-                    <w:p>
+                    <w:p ns2:paraId="5097D636" ns2:textId="77777777">
                       <w:pPr>
                         <w:pStyle w:val="Titre1"/>
                         <w:numPr>
@@ -202,7 +202,7 @@
                         <w:t>Amin LEBSIR</w:t>
                       </w:r>
                     </w:p>
-                    <w:p>
+                    <w:p ns2:paraId="7D48C9A9" ns2:textId="77777777">
                       <w:pPr>
                         <w:spacing w:before="27"/>
                         <w:ind w:left="426"/>
@@ -225,7 +225,7 @@
                         <w:t>Data Lead Cloud Data Lead Data Platform Architect</w:t>
                       </w:r>
                     </w:p>
-                    <w:p>
+                    <w:p ns2:paraId="1A16275E" ns2:textId="2CEC3C4A">
                       <w:pPr>
                         <w:spacing w:before="27"/>
                         <w:rPr>
@@ -255,7 +255,7 @@
                         <w:br/>
                       </w:r>
                     </w:p>
-                    <w:p>
+                    <w:p ns2:paraId="3B298639" ns2:textId="77777777">
                       <w:pPr>
                         <w:ind w:left="426"/>
                         <w:rPr>
@@ -269,14 +269,14 @@
                       </w:pPr>
                     </w:p>
                   </w:txbxContent>
-                </v:textbox>
-              </v:shape>
+                </ns7:textbox>
+              </ns7:shape>
             </w:pict>
-          </mc:Fallback>
-        </mc:AlternateContent>
+          </ns1:Fallback>
+        </ns1:AlternateContent>
       </w:r>
     </w:p>
-    <w:p>
+    <w:p ns2:paraId="430B745E" ns2:textId="07CBF6AD">
       <w:pPr>
         <w:ind w:left="426"/>
         <w:rPr>
@@ -288,7 +288,7 @@
         </w:rPr>
       </w:pPr>
     </w:p>
-    <w:p>
+    <w:p ns2:paraId="36C2FA94" ns2:textId="30D167B4">
       <w:pPr>
         <w:ind w:left="426"/>
         <w:rPr>
@@ -300,7 +300,7 @@
         </w:rPr>
       </w:pPr>
     </w:p>
-    <w:p>
+    <w:p ns2:paraId="71D7BF2E" ns2:textId="1A1960C4">
       <w:pPr>
         <w:tabs>
           <w:tab w:val="center" w:pos="4536"/>
@@ -325,63 +325,63 @@
           <w:lang w:eastAsia="en-US" w:bidi="ar-SA"/>
         </w:rPr>
         <w:drawing>
-          <wp:anchor distT="0" distB="0" distL="114300" distR="114300" simplePos="0" relativeHeight="251658240" behindDoc="1" locked="0" layoutInCell="1" allowOverlap="1" wp14:anchorId="6984B1E4" wp14:editId="2D84BF63">
-            <wp:simplePos x="0" y="0"/>
-            <wp:positionH relativeFrom="column">
-              <wp:posOffset>6084661</wp:posOffset>
-            </wp:positionH>
-            <wp:positionV relativeFrom="paragraph">
-              <wp:posOffset>-750983</wp:posOffset>
-            </wp:positionV>
-            <wp:extent cx="831850" cy="588645"/>
-            <wp:effectExtent l="0" t="0" r="6350" b="1905"/>
-            <wp:wrapNone/>
-            <wp:docPr id="1002" name="Image 22"/>
-            <wp:cNvGraphicFramePr>
-              <a:graphicFrameLocks xmlns:a="http://schemas.openxmlformats.org/drawingml/2006/main" noChangeAspect="1"/>
-            </wp:cNvGraphicFramePr>
-            <a:graphic xmlns:a="http://schemas.openxmlformats.org/drawingml/2006/main">
-              <a:graphicData uri="http://schemas.openxmlformats.org/drawingml/2006/picture">
-                <pic:pic xmlns:pic="http://schemas.openxmlformats.org/drawingml/2006/picture">
-                  <pic:nvPicPr>
-                    <pic:cNvPr id="1" name="Image 1"/>
-                    <pic:cNvPicPr/>
-                  </pic:nvPicPr>
-                  <pic:blipFill>
-                    <a:blip r:embed="rId11" cstate="print">
-                      <a:extLst>
-                        <a:ext uri="{28A0092B-C50C-407E-A947-70E740481C1C}">
-                          <a14:useLocalDpi xmlns:a14="http://schemas.microsoft.com/office/drawing/2010/main" val="0"/>
-                        </a:ext>
-                      </a:extLst>
-                    </a:blip>
-                    <a:stretch>
-                      <a:fillRect/>
-                    </a:stretch>
-                  </pic:blipFill>
-                  <pic:spPr>
-                    <a:xfrm>
-                      <a:off x="0" y="0"/>
-                      <a:ext cx="831850" cy="588645"/>
-                    </a:xfrm>
-                    <a:prstGeom prst="rect">
-                      <a:avLst/>
-                    </a:prstGeom>
-                  </pic:spPr>
-                </pic:pic>
-              </a:graphicData>
-            </a:graphic>
-            <wp14:sizeRelH relativeFrom="margin">
-              <wp14:pctWidth>0</wp14:pctWidth>
-            </wp14:sizeRelH>
-            <wp14:sizeRelV relativeFrom="margin">
-              <wp14:pctHeight>0</wp14:pctHeight>
-            </wp14:sizeRelV>
-          </wp:anchor>
+          <ns3:anchor distT="0" distB="0" distL="114300" distR="114300" simplePos="0" relativeHeight="251658240" behindDoc="1" locked="0" layoutInCell="1" allowOverlap="1" ns4:anchorId="6984B1E4" ns4:editId="2D84BF63">
+            <ns3:simplePos x="0" y="0"/>
+            <ns3:positionH relativeFrom="column">
+              <ns3:posOffset>6084661</ns3:posOffset>
+            </ns3:positionH>
+            <ns3:positionV relativeFrom="paragraph">
+              <ns3:posOffset>-750983</ns3:posOffset>
+            </ns3:positionV>
+            <ns3:extent cx="831850" cy="588645"/>
+            <ns3:effectExtent l="0" t="0" r="6350" b="1905"/>
+            <ns3:wrapNone/>
+            <ns3:docPr id="1002" name="Image 22"/>
+            <ns3:cNvGraphicFramePr>
+              <ns5:graphicFrameLocks noChangeAspect="1"/>
+            </ns3:cNvGraphicFramePr>
+            <ns5:graphic>
+              <ns5:graphicData uri="http://schemas.openxmlformats.org/drawingml/2006/picture">
+                <ns9:pic>
+                  <ns9:nvPicPr>
+                    <ns9:cNvPr id="1" name="Image 1"/>
+                    <ns9:cNvPicPr/>
+                  </ns9:nvPicPr>
+                  <ns9:blipFill>
+                    <ns5:blip ns10:embed="rId11" cstate="print">
+                      <ns5:extLst>
+                        <ns5:ext uri="{28A0092B-C50C-407E-A947-70E740481C1C}">
+                          <ns11:useLocalDpi val="0"/>
+                        </ns5:ext>
+                      </ns5:extLst>
+                    </ns5:blip>
+                    <ns5:stretch>
+                      <ns5:fillRect/>
+                    </ns5:stretch>
+                  </ns9:blipFill>
+                  <ns9:spPr>
+                    <ns5:xfrm>
+                      <ns5:off x="0" y="0"/>
+                      <ns5:ext cx="831850" cy="588645"/>
+                    </ns5:xfrm>
+                    <ns5:prstGeom prst="rect">
+                      <ns5:avLst/>
+                    </ns5:prstGeom>
+                  </ns9:spPr>
+                </ns9:pic>
+              </ns5:graphicData>
+            </ns5:graphic>
+            <ns4:sizeRelH relativeFrom="margin">
+              <ns4:pctWidth>0</ns4:pctWidth>
+            </ns4:sizeRelH>
+            <ns4:sizeRelV relativeFrom="margin">
+              <ns4:pctHeight>0</ns4:pctHeight>
+            </ns4:sizeRelV>
+          </ns3:anchor>
         </w:drawing>
       </w:r>
     </w:p>
-    <w:p>
+    <w:p ns2:paraId="11EAAEC2" ns2:textId="77777777">
       <w:pPr>
         <w:tabs>
           <w:tab w:val="center" w:pos="4536"/>
@@ -397,7 +397,7 @@
         </w:rPr>
       </w:pPr>
     </w:p>
-    <w:p>
+    <w:p ns2:paraId="56D1B642" ns2:textId="1352FD9A">
       <w:pPr>
         <w:spacing w:after="0" w:line="240" w:lineRule="auto"/>
         <w:rPr>
@@ -405,7 +405,7 @@
         </w:rPr>
       </w:pPr>
     </w:p>
-    <w:p>
+    <w:p ns2:paraId="4649E02A" ns2:textId="24DFBEA0">
       <w:pPr>
         <w:pBdr>
           <w:bottom w:val="single" w:sz="4" w:space="8" w:color="auto"/>
@@ -450,7 +450,7 @@
         <w:gridCol w:w="1843"/>
         <w:gridCol w:w="8440"/>
       </w:tblGrid>
-      <w:tr>
+      <w:tr ns2:paraId="0383D187" ns2:textId="77777777">
         <w:trPr>
           <w:trHeight w:val="57"/>
         </w:trPr>
@@ -458,7 +458,7 @@
           <w:tcPr>
             <w:tcW w:w="1842" w:type="dxa"/>
           </w:tcPr>
-          <w:p>
+          <w:p ns2:paraId="09FC43B8" ns2:textId="77777777">
             <w:pPr>
               <w:ind w:right="-108"/>
               <w:rPr>
@@ -481,7 +481,7 @@
           <w:tcPr>
             <w:tcW w:w="8434" w:type="dxa"/>
           </w:tcPr>
-          <w:p>
+          <w:p ns2:paraId="2DBE95C1" ns2:textId="77777777">
             <w:pPr>
               <w:rPr>
                 <w:bCs/>
@@ -499,7 +499,7 @@
         </w:tc>
       </w:tr>
     </w:tbl>
-    <w:p>
+    <w:p ns2:paraId="1009C474" ns2:textId="77777777">
       <w:pPr>
         <w:spacing w:after="0" w:line="240" w:lineRule="auto"/>
         <w:rPr>
@@ -507,7 +507,7 @@
         </w:rPr>
       </w:pPr>
     </w:p>
-    <w:p>
+    <w:p ns2:paraId="61C24C3D" ns2:textId="733EF761">
       <w:pPr>
         <w:pBdr>
           <w:bottom w:val="single" w:sz="4" w:space="8" w:color="auto"/>
@@ -552,7 +552,7 @@
         <w:gridCol w:w="1849"/>
         <w:gridCol w:w="8434"/>
       </w:tblGrid>
-      <w:tr>
+      <w:tr ns2:paraId="19A94A02" ns2:textId="77777777">
         <w:trPr>
           <w:trHeight w:val="57"/>
         </w:trPr>
@@ -560,7 +560,7 @@
           <w:tcPr>
             <w:tcW w:w="1849" w:type="dxa"/>
           </w:tcPr>
-          <w:p>
+          <w:p ns2:paraId="112512C9" ns2:textId="77777777">
             <w:pPr>
               <w:ind w:right="-167"/>
               <w:rPr>
@@ -583,7 +583,7 @@
           <w:tcPr>
             <w:tcW w:w="8434" w:type="dxa"/>
           </w:tcPr>
-          <w:p>
+          <w:p ns2:paraId="564E6C9B" ns2:textId="77777777">
             <w:pPr>
               <w:rPr>
                 <w:bCs/>
@@ -601,7 +601,7 @@
         </w:tc>
       </w:tr>
     </w:tbl>
-    <w:p>
+    <w:p ns2:paraId="65F9CBB7" ns2:textId="77777777">
       <w:pPr>
         <w:spacing w:after="0" w:line="240" w:lineRule="auto"/>
         <w:rPr>
@@ -609,7 +609,7 @@
         </w:rPr>
       </w:pPr>
     </w:p>
-    <w:p>
+    <w:p ns2:paraId="02141B49" ns2:textId="77777777">
       <w:pPr>
         <w:spacing w:after="0"/>
         <w:ind w:right="-337"/>
@@ -618,7 +618,7 @@
         </w:rPr>
       </w:pPr>
     </w:p>
-    <w:p>
+    <w:p ns2:paraId="1ADB4E55" ns2:textId="4A904832">
       <w:pPr>
         <w:pBdr>
           <w:bottom w:val="single" w:sz="4" w:space="6" w:color="auto"/>
@@ -643,7 +643,7 @@
         <w:t xml:space="preserve">Profile </w:t>
       </w:r>
     </w:p>
-    <w:p>
+    <w:p ns2:paraId="13C1D1AB" ns2:textId="5BD209F2">
       <w:pPr>
         <w:spacing w:before="240"/>
         <w:ind w:left="426" w:right="-337"/>
@@ -653,31 +653,17 @@
           <w:lang w:val="en-US"/>
         </w:rPr>
       </w:pPr>
-      <w:r>
-        <w:rPr>
-          <w:color w:val="002060"/>
-          <w:lang w:val="en-US"/>
-        </w:rPr>
-        <w:t xml:space="preserve">Data engineering and platform leader with 17 years of overall experience, including 11 years in capital markets. I build </w:t>
-      </w:r>
       <w:proofErr w:type="spellStart"/>
-      <w:r>
-        <w:rPr>
-          <w:color w:val="002060"/>
-          <w:lang w:val="en-US"/>
-        </w:rPr>
-        <w:t>lakehouse</w:t>
-      </w:r>
       <w:proofErr w:type="spellEnd"/>
       <w:r>
         <w:rPr>
           <w:color w:val="002060"/>
           <w:lang w:val="en-US"/>
         </w:rPr>
-        <w:t>, event-driven and cloud platform systems that turn risk and business data into governed production products with strong release discipline and low operational overhead.</w:t>
+        <w:t>Data engineering and platform leader with 17 years of overall experience, including 11 years in trading environments across capital markets and energy commodities. I deliver AWS, Databricks and PySpark data platforms end to end, combining run ownership, automation and close collaboration with business and technical stakeholders.</w:t>
       </w:r>
     </w:p>
-    <w:p>
+    <w:p ns2:paraId="4678C4CE" ns2:textId="77777777">
       <w:pPr>
         <w:pBdr>
           <w:bottom w:val="single" w:sz="4" w:space="6" w:color="auto"/>
@@ -692,7 +678,7 @@
         </w:rPr>
       </w:pPr>
     </w:p>
-    <w:p>
+    <w:p ns2:paraId="28B769CF" ns2:textId="40924548">
       <w:pPr>
         <w:pBdr>
           <w:bottom w:val="single" w:sz="4" w:space="6" w:color="auto"/>
@@ -741,7 +727,7 @@
       </w:r>
       <w:proofErr w:type="spellEnd"/>
     </w:p>
-    <w:p>
+    <w:p ns2:paraId="31403CF2" ns2:textId="77777777">
       <w:pPr>
         <w:spacing w:before="240"/>
         <w:ind w:left="426" w:right="-337"/>
@@ -751,8 +737,8 @@
           <w:color w:val="00B8A2"/>
         </w:rPr>
         <w:sectPr>
-          <w:footerReference w:type="even" r:id="rId12"/>
-          <w:footerReference w:type="default" r:id="rId13"/>
+          <w:footerReference w:type="even" ns10:id="rId12"/>
+          <w:footerReference w:type="default" ns10:id="rId13"/>
           <w:pgSz w:w="11910" w:h="16840"/>
           <w:pgMar w:top="357" w:right="1021" w:bottom="816" w:left="170" w:header="1701" w:footer="1247" w:gutter="0"/>
           <w:cols w:space="708"/>
@@ -760,7 +746,7 @@
         </w:sectPr>
       </w:pPr>
     </w:p>
-    <w:p>
+    <w:p ns2:paraId="0163DFAA" ns2:textId="4AD893A7">
       <w:pPr>
         <w:spacing w:before="240"/>
         <w:ind w:left="426" w:right="-337"/>
@@ -780,7 +766,7 @@
         <w:t>Main skills :</w:t>
       </w:r>
     </w:p>
-    <w:p>
+    <w:p ns2:paraId="4FF2DE45" ns2:textId="560A55F1">
       <w:pPr>
         <w:pStyle w:val="Paragraphedeliste"/>
         <w:numPr>
@@ -795,47 +781,19 @@
           <w:lang w:val="de-CH"/>
         </w:rPr>
       </w:pPr>
-      <w:r>
-        <w:rPr>
-          <w:color w:val="002060"/>
-          <w:lang w:val="de-CH"/>
-        </w:rPr>
-        <w:t xml:space="preserve">Apache Spark, </w:t>
-      </w:r>
       <w:proofErr w:type="spellStart"/>
-      <w:r>
-        <w:rPr>
-          <w:color w:val="002060"/>
-          <w:lang w:val="de-CH"/>
-        </w:rPr>
-        <w:t>Iceberg</w:t>
-      </w:r>
+      <w:proofErr w:type="spellEnd"/>
+      <w:proofErr w:type="spellStart"/>
       <w:proofErr w:type="spellEnd"/>
       <w:r>
         <w:rPr>
           <w:color w:val="002060"/>
           <w:lang w:val="de-CH"/>
         </w:rPr>
-        <w:t xml:space="preserve">, AWS, Azure, </w:t>
-      </w:r>
-      <w:proofErr w:type="spellStart"/>
-      <w:r>
-        <w:rPr>
-          <w:color w:val="002060"/>
-          <w:lang w:val="de-CH"/>
-        </w:rPr>
-        <w:t>Kubernetes</w:t>
-      </w:r>
-      <w:proofErr w:type="spellEnd"/>
-      <w:r>
-        <w:rPr>
-          <w:color w:val="002060"/>
-          <w:lang w:val="de-CH"/>
-        </w:rPr>
-        <w:t>, Java, Python, Kafka.</w:t>
+        <w:t>Apache Spark, PySpark, Databricks, AWS, Azure, Kubernetes, Python, Java, Kafka.</w:t>
       </w:r>
     </w:p>
-    <w:p>
+    <w:p ns2:paraId="0B0503FE" ns2:textId="77777777">
       <w:pPr>
         <w:spacing w:before="240"/>
         <w:ind w:left="426" w:right="-337"/>
@@ -873,7 +831,7 @@
         <w:t xml:space="preserve"> :</w:t>
       </w:r>
     </w:p>
-    <w:p>
+    <w:p ns2:paraId="5A76CEFC" ns2:textId="77777777">
       <w:pPr>
         <w:pStyle w:val="Paragraphedeliste"/>
         <w:numPr>
@@ -893,10 +851,10 @@
           <w:color w:val="002060"/>
           <w:lang w:val="en-US"/>
         </w:rPr>
-        <w:t>Apache Spark, Iceberg, Parquet, Athena, Glue, Databricks, Delta Lake, SQL.</w:t>
+        <w:t>Apache Spark, PySpark, Iceberg, Parquet, Athena, Glue, Databricks, Delta Lake, SQL.</w:t>
       </w:r>
     </w:p>
-    <w:p>
+    <w:p ns2:paraId="1AEF7DBB" ns2:textId="77777777">
       <w:pPr>
         <w:spacing w:before="240"/>
         <w:ind w:left="426" w:right="-337"/>
@@ -916,7 +874,7 @@
         <w:t>Cloud &amp; platform :</w:t>
       </w:r>
     </w:p>
-    <w:p>
+    <w:p ns2:paraId="70B71CC9" ns2:textId="77777777">
       <w:pPr>
         <w:pStyle w:val="Paragraphedeliste"/>
         <w:numPr>
@@ -937,7 +895,7 @@
         <w:t>AWS, Azure, Kubernetes, AKS, Docker, Terraform, GitHub Actions.</w:t>
       </w:r>
     </w:p>
-    <w:p>
+    <w:p ns2:paraId="3BD85184" ns2:textId="77777777">
       <w:pPr>
         <w:spacing w:before="240"/>
         <w:ind w:left="426" w:right="-337"/>
@@ -957,7 +915,7 @@
         <w:t>Backend &amp; delivery :</w:t>
       </w:r>
     </w:p>
-    <w:p>
+    <w:p ns2:paraId="74BC1096" ns2:textId="77777777">
       <w:pPr>
         <w:pStyle w:val="Paragraphedeliste"/>
         <w:numPr>
@@ -978,7 +936,7 @@
         <w:t>Java, Spring Boot, Python, Scala, Kafka, Event Hubs, PostgreSQL, CI/CD.</w:t>
       </w:r>
     </w:p>
-    <w:p>
+    <w:p ns2:paraId="086ED035" ns2:textId="397F43CF">
       <w:pPr>
         <w:spacing w:after="0"/>
         <w:ind w:right="-337"/>
@@ -995,7 +953,7 @@
         </w:sectPr>
       </w:pPr>
     </w:p>
-    <w:p>
+    <w:p ns2:paraId="7F4EEB6F" ns2:textId="77777777">
       <w:pPr>
         <w:pBdr>
           <w:bottom w:val="single" w:sz="4" w:space="8" w:color="auto"/>
@@ -1010,7 +968,7 @@
         </w:rPr>
       </w:pPr>
     </w:p>
-    <w:p>
+    <w:p ns2:paraId="0D95428C" ns2:textId="4D9305C7">
       <w:pPr>
         <w:pBdr>
           <w:bottom w:val="single" w:sz="4" w:space="8" w:color="auto"/>
@@ -1076,12 +1034,12 @@
         <w:gridCol w:w="2028"/>
         <w:gridCol w:w="8265"/>
       </w:tblGrid>
-      <w:tr>
+      <w:tr ns2:paraId="413E538F" ns2:textId="77777777">
         <w:tc>
           <w:tcPr>
             <w:tcW w:w="2028" w:type="dxa"/>
           </w:tcPr>
-          <w:p>
+          <w:p ns2:paraId="54DFC947" ns2:textId="6EE5D4C3">
             <w:pPr>
               <w:ind w:right="-337"/>
               <w:rPr>
@@ -1104,7 +1062,7 @@
           <w:tcPr>
             <w:tcW w:w="8265" w:type="dxa"/>
           </w:tcPr>
-          <w:p>
+          <w:p ns2:paraId="28398209" ns2:textId="7C637CDD">
             <w:pPr>
               <w:ind w:right="-337"/>
               <w:rPr>
@@ -1122,12 +1080,12 @@
           </w:p>
         </w:tc>
       </w:tr>
-      <w:tr>
+      <w:tr ns2:paraId="0DE66240" ns2:textId="77777777">
         <w:tc>
           <w:tcPr>
             <w:tcW w:w="2028" w:type="dxa"/>
           </w:tcPr>
-          <w:p>
+          <w:p ns2:paraId="6DD55050" ns2:textId="77777777">
             <w:pPr>
               <w:ind w:right="-337"/>
               <w:rPr>
@@ -1150,7 +1108,7 @@
           <w:tcPr>
             <w:tcW w:w="8265" w:type="dxa"/>
           </w:tcPr>
-          <w:p>
+          <w:p ns2:paraId="2B76F6CA" ns2:textId="77777777">
             <w:pPr>
               <w:ind w:right="-337"/>
               <w:rPr>
@@ -1168,12 +1126,12 @@
           </w:p>
         </w:tc>
       </w:tr>
-      <w:tr>
+      <w:tr ns2:paraId="6C2C6CB7" ns2:textId="77777777">
         <w:tc>
           <w:tcPr>
             <w:tcW w:w="2028" w:type="dxa"/>
           </w:tcPr>
-          <w:p>
+          <w:p ns2:paraId="5A53F3EF" ns2:textId="77777777">
             <w:pPr>
               <w:ind w:right="-337"/>
               <w:rPr>
@@ -1196,7 +1154,7 @@
           <w:tcPr>
             <w:tcW w:w="8265" w:type="dxa"/>
           </w:tcPr>
-          <w:p>
+          <w:p ns2:paraId="61C20AFD" ns2:textId="77777777">
             <w:pPr>
               <w:ind w:right="-337"/>
               <w:rPr>
@@ -1215,7 +1173,7 @@
         </w:tc>
       </w:tr>
     </w:tbl>
-    <w:p>
+    <w:p ns2:paraId="0F1868F2" ns2:textId="780D1A4B">
       <w:pPr>
         <w:tabs>
           <w:tab w:val="left" w:pos="3110"/>
@@ -1223,7 +1181,7 @@
         <w:spacing w:after="0"/>
       </w:pPr>
     </w:p>
-    <w:p>
+    <w:p ns2:paraId="2B09B15C" ns2:textId="77777777">
       <w:pPr>
         <w:spacing w:after="0"/>
         <w:ind w:left="426" w:right="-337"/>
@@ -1232,7 +1190,7 @@
         </w:rPr>
       </w:pPr>
     </w:p>
-    <w:p>
+    <w:p ns2:paraId="63D67AAF" ns2:textId="1C9213AE">
       <w:pPr>
         <w:spacing w:after="0"/>
         <w:ind w:left="426" w:right="-337"/>
@@ -1251,7 +1209,7 @@
         <w:br w:type="page"/>
       </w:r>
     </w:p>
-    <w:p>
+    <w:p ns2:paraId="4FF1F7D1" ns2:textId="1FCB8EFD">
       <w:pPr>
         <w:pBdr>
           <w:bottom w:val="single" w:sz="4" w:space="7" w:color="auto"/>
@@ -1316,7 +1274,7 @@
         <w:gridCol w:w="1984"/>
         <w:gridCol w:w="8309"/>
       </w:tblGrid>
-      <w:tr>
+      <w:tr ns2:paraId="6742FBC7" ns2:textId="77777777">
         <w:trPr>
           <w:trHeight w:val="460"/>
         </w:trPr>
@@ -1326,7 +1284,7 @@
             <w:shd w:val="clear" w:color="auto" w:fill="F2F2F2" w:themeFill="background2" w:themeFillShade="F2"/>
             <w:vAlign w:val="center"/>
           </w:tcPr>
-          <w:p>
+          <w:p ns2:paraId="4A80B24E" ns2:textId="0F1C1B69">
             <w:pPr>
               <w:ind w:right="-112"/>
               <w:rPr>
@@ -1351,7 +1309,7 @@
             <w:shd w:val="clear" w:color="auto" w:fill="F2F2F2" w:themeFill="background2" w:themeFillShade="F2"/>
             <w:vAlign w:val="center"/>
           </w:tcPr>
-          <w:p>
+          <w:p ns2:paraId="46452FAE" ns2:textId="7B54577B">
             <w:pPr>
               <w:ind w:right="-337"/>
               <w:rPr>
@@ -1371,12 +1329,12 @@
           </w:p>
         </w:tc>
       </w:tr>
-      <w:tr>
+      <w:tr ns2:paraId="1605179C" ns2:textId="77777777">
         <w:tc>
           <w:tcPr>
             <w:tcW w:w="1984" w:type="dxa"/>
           </w:tcPr>
-          <w:p>
+          <w:p ns2:paraId="0FC1EBC5" ns2:textId="77777777">
             <w:pPr>
               <w:ind w:right="-337"/>
               <w:rPr>
@@ -1391,7 +1349,7 @@
           <w:tcPr>
             <w:tcW w:w="8309" w:type="dxa"/>
           </w:tcPr>
-          <w:p>
+          <w:p ns2:paraId="1D7E9C51" ns2:textId="1278E7AC">
             <w:pPr>
               <w:spacing w:before="120" w:after="60"/>
               <w:ind w:right="112"/>
@@ -1415,7 +1373,7 @@
               <w:t>Data Lead / Cloud Data Lead</w:t>
             </w:r>
           </w:p>
-          <w:p>
+          <w:p ns2:paraId="6C382583" ns2:textId="7020E00F">
             <w:pPr>
               <w:spacing w:before="60" w:after="60"/>
               <w:ind w:right="112"/>
@@ -1434,10 +1392,10 @@
                 <w:color w:val="1C2E5A"/>
                 <w:lang w:val="en-US" w:eastAsia="en-US"/>
               </w:rPr>
-              <w:t>Capital markets risk platform migration to AWS</w:t>
-            </w:r>
-          </w:p>
-          <w:p>
+              <w:t>Energy trading risk platform migration to AWS</w:t>
+            </w:r>
+          </w:p>
+          <w:p ns2:paraId="41040F1F" ns2:textId="77777777">
             <w:pPr>
               <w:pStyle w:val="Paragraphedeliste"/>
               <w:numPr>
@@ -1458,10 +1416,10 @@
                 <w:bCs/>
                 <w:lang w:val="en-US"/>
               </w:rPr>
-              <w:t>Led migration of legacy production risk indicators from OLAP and CSV-based flows to an AWS-native data platform.</w:t>
-            </w:r>
-          </w:p>
-          <w:p>
+              <w:t>Led migration of legacy production risk and PnL indicators from OLAP and CSV-based flows to an AWS-native platform within an energy trading environment.</w:t>
+            </w:r>
+          </w:p>
+          <w:p ns2:paraId="7F539C64" ns2:textId="77777777">
             <w:pPr>
               <w:pStyle w:val="Paragraphedeliste"/>
               <w:numPr>
@@ -1476,34 +1434,18 @@
                 <w:lang w:val="en-US"/>
               </w:rPr>
             </w:pPr>
+            <w:proofErr w:type="spellStart"/>
+            <w:proofErr w:type="spellEnd"/>
             <w:r>
               <w:rPr>
                 <w:rFonts w:ascii="Roboto Light" w:hAnsi="Roboto Light" w:hint="cs"/>
                 <w:bCs/>
                 <w:lang w:val="en-US"/>
               </w:rPr>
-              <w:t xml:space="preserve">Designed S3, Lambda, Glue and </w:t>
-            </w:r>
-            <w:proofErr w:type="spellStart"/>
-            <w:r>
-              <w:rPr>
-                <w:rFonts w:ascii="Roboto Light" w:hAnsi="Roboto Light" w:hint="cs"/>
-                <w:bCs/>
-                <w:lang w:val="en-US"/>
-              </w:rPr>
-              <w:t>EventBridge</w:t>
-            </w:r>
-            <w:proofErr w:type="spellEnd"/>
-            <w:r>
-              <w:rPr>
-                <w:rFonts w:ascii="Roboto Light" w:hAnsi="Roboto Light" w:hint="cs"/>
-                <w:bCs/>
-                <w:lang w:val="en-US"/>
-              </w:rPr>
-              <w:t xml:space="preserve"> patterns for event-driven ingestion, processing and monitoring.</w:t>
-            </w:r>
-          </w:p>
-          <w:p>
+              <w:t>Designed S3, Lambda, Glue, Databricks and EventBridge patterns for event-driven ingestion, PySpark processing, monitoring and operational support.</w:t>
+            </w:r>
+          </w:p>
+          <w:p ns2:paraId="45A3A888" ns2:textId="77777777">
             <w:pPr>
               <w:pStyle w:val="Paragraphedeliste"/>
               <w:numPr>
@@ -1518,52 +1460,20 @@
                 <w:lang w:val="en-US"/>
               </w:rPr>
             </w:pPr>
+            <w:proofErr w:type="spellStart"/>
+            <w:proofErr w:type="spellEnd"/>
+            <w:proofErr w:type="gramStart"/>
+            <w:proofErr w:type="gramEnd"/>
             <w:r>
               <w:rPr>
                 <w:rFonts w:ascii="Roboto Light" w:hAnsi="Roboto Light" w:hint="cs"/>
                 <w:bCs/>
                 <w:lang w:val="en-US"/>
               </w:rPr>
-              <w:t xml:space="preserve">Built a no-code platform that </w:t>
-            </w:r>
-            <w:proofErr w:type="spellStart"/>
-            <w:r>
-              <w:rPr>
-                <w:rFonts w:ascii="Roboto Light" w:hAnsi="Roboto Light" w:hint="cs"/>
-                <w:bCs/>
-                <w:lang w:val="en-US"/>
-              </w:rPr>
-              <w:t>serialises</w:t>
-            </w:r>
-            <w:proofErr w:type="spellEnd"/>
-            <w:r>
-              <w:rPr>
-                <w:rFonts w:ascii="Roboto Light" w:hAnsi="Roboto Light" w:hint="cs"/>
-                <w:bCs/>
-                <w:lang w:val="en-US"/>
-              </w:rPr>
-              <w:t xml:space="preserve"> business designs </w:t>
-            </w:r>
-            <w:proofErr w:type="gramStart"/>
-            <w:r>
-              <w:rPr>
-                <w:rFonts w:ascii="Roboto Light" w:hAnsi="Roboto Light" w:hint="cs"/>
-                <w:bCs/>
-                <w:lang w:val="en-US"/>
-              </w:rPr>
-              <w:t>to</w:t>
-            </w:r>
-            <w:proofErr w:type="gramEnd"/>
-            <w:r>
-              <w:rPr>
-                <w:rFonts w:ascii="Roboto Light" w:hAnsi="Roboto Light" w:hint="cs"/>
-                <w:bCs/>
-                <w:lang w:val="en-US"/>
-              </w:rPr>
-              <w:t xml:space="preserve"> JSON and executes them on Spark and Spark SQL.</w:t>
-            </w:r>
-          </w:p>
-          <w:p>
+              <w:t>Built a no-code platform that serialises business designs to JSON and executes them on Spark and Spark SQL, reducing manual interventions and accelerating onboarding.</w:t>
+            </w:r>
+          </w:p>
+          <w:p ns2:paraId="32853B27" ns2:textId="77777777">
             <w:pPr>
               <w:pStyle w:val="Paragraphedeliste"/>
               <w:numPr>
@@ -1584,10 +1494,10 @@
                 <w:bCs/>
                 <w:lang w:val="en-US"/>
               </w:rPr>
-              <w:t>Implemented cross-cloud communication between AWS and Azure components and improved end-to-end tracking.</w:t>
-            </w:r>
-          </w:p>
-          <w:p>
+              <w:t>Partnered with business and technical teams, handled run incidents and improved end-to-end tracking across AWS and Azure components through automation.</w:t>
+            </w:r>
+          </w:p>
+          <w:p ns2:paraId="640FCAF3" ns2:textId="1D59C631">
             <w:pPr>
               <w:spacing w:before="120" w:after="60"/>
               <w:ind w:left="349" w:right="112"/>
@@ -1598,7 +1508,7 @@
               </w:rPr>
             </w:pPr>
           </w:p>
-          <w:p>
+          <w:p ns2:paraId="1BF09E00" ns2:textId="77777777">
             <w:pPr>
               <w:spacing w:before="60" w:after="60"/>
               <w:ind w:right="112"/>
@@ -1613,6 +1523,9 @@
               </w:rPr>
             </w:pPr>
             <w:proofErr w:type="gramStart"/>
+            <w:proofErr w:type="gramEnd"/>
+            <w:proofErr w:type="spellStart"/>
+            <w:proofErr w:type="spellEnd"/>
             <w:r>
               <w:rPr>
                 <w:rFonts w:eastAsiaTheme="minorHAnsi"/>
@@ -1622,73 +1535,27 @@
                 <w:szCs w:val="22"/>
                 <w:lang w:val="en-US" w:eastAsia="en-US"/>
               </w:rPr>
-              <w:t>Technologies :</w:t>
-            </w:r>
-            <w:proofErr w:type="gramEnd"/>
-            <w:r>
+              <w:t>Technologies : AWS, S3, Lambda, Glue, Databricks, EventBridge, PySpark, Spark SQL, Azure</w:t>
+            </w:r>
+          </w:p>
+          <w:p ns2:paraId="55D23834" ns2:textId="77777777">
+            <w:pPr>
+              <w:spacing w:before="60" w:after="60"/>
+              <w:ind w:right="112"/>
+              <w:jc w:val="both"/>
               <w:rPr>
                 <w:rFonts w:eastAsiaTheme="minorHAnsi"/>
-                <w:i/>
-                <w:sz w:val="18"/>
-                <w:szCs w:val="22"/>
-                <w:lang w:val="en-US" w:eastAsia="en-US"/>
-              </w:rPr>
-              <w:t xml:space="preserve"> </w:t>
-            </w:r>
-            <w:r>
-              <w:rPr>
-                <w:rFonts w:eastAsiaTheme="minorHAnsi"/>
+                <w:b/>
+                <w:bCs/>
                 <w:i/>
                 <w:color w:val="262626" w:themeColor="text1" w:themeTint="D9"/>
                 <w:sz w:val="18"/>
                 <w:szCs w:val="18"/>
                 <w:lang w:val="en-US" w:eastAsia="en-US"/>
               </w:rPr>
-              <w:t xml:space="preserve">AWS, S3, Lambda, Glue, </w:t>
-            </w:r>
-            <w:proofErr w:type="spellStart"/>
-            <w:r>
-              <w:rPr>
-                <w:rFonts w:eastAsiaTheme="minorHAnsi"/>
-                <w:i/>
-                <w:color w:val="262626" w:themeColor="text1" w:themeTint="D9"/>
-                <w:sz w:val="18"/>
-                <w:szCs w:val="18"/>
-                <w:lang w:val="en-US" w:eastAsia="en-US"/>
-              </w:rPr>
-              <w:t>EventBridge</w:t>
-            </w:r>
-            <w:proofErr w:type="spellEnd"/>
-            <w:r>
-              <w:rPr>
-                <w:rFonts w:eastAsiaTheme="minorHAnsi"/>
-                <w:i/>
-                <w:color w:val="262626" w:themeColor="text1" w:themeTint="D9"/>
-                <w:sz w:val="18"/>
-                <w:szCs w:val="18"/>
-                <w:lang w:val="en-US" w:eastAsia="en-US"/>
-              </w:rPr>
-              <w:t>, Spark, Spark SQL, Azure</w:t>
-            </w:r>
-          </w:p>
-          <w:p>
-            <w:pPr>
-              <w:spacing w:before="60" w:after="60"/>
-              <w:ind w:right="112"/>
-              <w:jc w:val="both"/>
-              <w:rPr>
-                <w:rFonts w:eastAsiaTheme="minorHAnsi"/>
-                <w:b/>
-                <w:bCs/>
-                <w:i/>
-                <w:color w:val="262626" w:themeColor="text1" w:themeTint="D9"/>
-                <w:sz w:val="18"/>
-                <w:szCs w:val="18"/>
-                <w:lang w:val="en-US" w:eastAsia="en-US"/>
-              </w:rPr>
-            </w:pPr>
-          </w:p>
-          <w:p>
+            </w:pPr>
+          </w:p>
+          <w:p ns2:paraId="3CEAC7F0" ns2:textId="77777777">
             <w:pPr>
               <w:tabs>
                 <w:tab w:val="left" w:pos="6521"/>
@@ -1701,7 +1568,7 @@
           </w:p>
         </w:tc>
       </w:tr>
-      <w:tr>
+      <w:tr ns2:paraId="6C0BEDEE" ns2:textId="77777777">
         <w:trPr>
           <w:trHeight w:val="460"/>
         </w:trPr>
@@ -1711,7 +1578,7 @@
             <w:shd w:val="clear" w:color="auto" w:fill="F2F2F2" w:themeFill="background2" w:themeFillShade="F2"/>
             <w:vAlign w:val="center"/>
           </w:tcPr>
-          <w:p>
+          <w:p ns2:paraId="3C3B2787" ns2:textId="77777777">
             <w:pPr>
               <w:ind w:right="-112"/>
               <w:rPr>
@@ -1736,7 +1603,7 @@
             <w:shd w:val="clear" w:color="auto" w:fill="F2F2F2" w:themeFill="background2" w:themeFillShade="F2"/>
             <w:vAlign w:val="center"/>
           </w:tcPr>
-          <w:p>
+          <w:p ns2:paraId="44683026" ns2:textId="77777777">
             <w:pPr>
               <w:ind w:right="-337"/>
               <w:rPr>
@@ -1756,12 +1623,12 @@
           </w:p>
         </w:tc>
       </w:tr>
-      <w:tr>
+      <w:tr ns2:paraId="1B5FA045" ns2:textId="77777777">
         <w:tc>
           <w:tcPr>
             <w:tcW w:w="1984" w:type="dxa"/>
           </w:tcPr>
-          <w:p>
+          <w:p ns2:paraId="20B3B248" ns2:textId="77777777">
             <w:pPr>
               <w:ind w:right="-337"/>
               <w:rPr>
@@ -1776,7 +1643,7 @@
           <w:tcPr>
             <w:tcW w:w="8309" w:type="dxa"/>
           </w:tcPr>
-          <w:p>
+          <w:p ns2:paraId="28CB4083" ns2:textId="77777777">
             <w:pPr>
               <w:spacing w:before="120" w:after="60"/>
               <w:ind w:right="112"/>
@@ -1800,7 +1667,7 @@
               <w:t>Lead Developer / Data Platform Lead</w:t>
             </w:r>
           </w:p>
-          <w:p>
+          <w:p ns2:paraId="18769897" ns2:textId="77777777">
             <w:pPr>
               <w:spacing w:before="60" w:after="60"/>
               <w:ind w:right="112"/>
@@ -1822,7 +1689,7 @@
               <w:t>Fraud-control and analytics pipeline platform</w:t>
             </w:r>
           </w:p>
-          <w:p>
+          <w:p ns2:paraId="18C898C6" ns2:textId="77777777">
             <w:pPr>
               <w:pStyle w:val="Paragraphedeliste"/>
               <w:numPr>
@@ -1843,10 +1710,10 @@
                 <w:bCs/>
                 <w:lang w:val="en-US"/>
               </w:rPr>
-              <w:t>Built a Spark-based ETL and execution framework for anti-fraud control designs and operational analytics.</w:t>
-            </w:r>
-          </w:p>
-          <w:p>
+              <w:t>Built a Spark and PySpark ETL and execution framework for anti-fraud control designs and operational analytics.</w:t>
+            </w:r>
+          </w:p>
+          <w:p ns2:paraId="62999515" ns2:textId="77777777">
             <w:pPr>
               <w:pStyle w:val="Paragraphedeliste"/>
               <w:numPr>
@@ -1870,7 +1737,7 @@
               <w:t>Developed an interpretation engine converting JSON directives into executable Spark logic.</w:t>
             </w:r>
           </w:p>
-          <w:p>
+          <w:p ns2:paraId="38F92677" ns2:textId="77777777">
             <w:pPr>
               <w:pStyle w:val="Paragraphedeliste"/>
               <w:numPr>
@@ -1891,10 +1758,10 @@
                 <w:bCs/>
                 <w:lang w:val="en-US"/>
               </w:rPr>
-              <w:t>Implemented job execution, monitoring and update services around Spark workloads.</w:t>
-            </w:r>
-          </w:p>
-          <w:p>
+              <w:t>Implemented job execution, monitoring, incident diagnosis and automated recovery services around Spark workloads.</w:t>
+            </w:r>
+          </w:p>
+          <w:p ns2:paraId="494562EB" ns2:textId="77777777">
             <w:pPr>
               <w:pStyle w:val="Paragraphedeliste"/>
               <w:numPr>
@@ -1915,10 +1782,10 @@
                 <w:bCs/>
                 <w:lang w:val="en-US"/>
               </w:rPr>
-              <w:t>Owned orchestration, cloud infrastructure, health monitoring and complex Spark SQL control scenarios.</w:t>
-            </w:r>
-          </w:p>
-          <w:p>
+              <w:t>Owned orchestration, cloud infrastructure, health monitoring and complex Spark SQL control scenarios with a strong focus on support and industrialisation.</w:t>
+            </w:r>
+          </w:p>
+          <w:p ns2:paraId="05F0BA59" ns2:textId="77777777">
             <w:pPr>
               <w:spacing w:before="120" w:after="60"/>
               <w:ind w:left="349" w:right="112"/>
@@ -1929,7 +1796,7 @@
               </w:rPr>
             </w:pPr>
           </w:p>
-          <w:p>
+          <w:p ns2:paraId="7F29AE29" ns2:textId="77777777">
             <w:pPr>
               <w:spacing w:before="60" w:after="60"/>
               <w:ind w:right="112"/>
@@ -1952,48 +1819,27 @@
                 <w:szCs w:val="22"/>
                 <w:lang w:eastAsia="en-US"/>
               </w:rPr>
-              <w:t>Technologies :</w:t>
-            </w:r>
-            <w:r>
+              <w:t>Technologies : Spark, PySpark, JSON, Spark SQL</w:t>
+            </w:r>
+          </w:p>
+          <w:p ns2:paraId="7D0B662F" ns2:textId="77777777">
+            <w:pPr>
+              <w:spacing w:before="60" w:after="60"/>
+              <w:ind w:right="112"/>
+              <w:jc w:val="both"/>
               <w:rPr>
                 <w:rFonts w:eastAsiaTheme="minorHAnsi"/>
-                <w:i/>
-                <w:sz w:val="18"/>
-                <w:szCs w:val="22"/>
-                <w:lang w:eastAsia="en-US"/>
-              </w:rPr>
-              <w:t xml:space="preserve"> </w:t>
-            </w:r>
-            <w:r>
-              <w:rPr>
-                <w:rFonts w:eastAsiaTheme="minorHAnsi"/>
+                <w:b/>
+                <w:bCs/>
                 <w:i/>
                 <w:color w:val="262626" w:themeColor="text1" w:themeTint="D9"/>
                 <w:sz w:val="18"/>
                 <w:szCs w:val="18"/>
                 <w:lang w:eastAsia="en-US"/>
               </w:rPr>
-              <w:t>Spark, JSON, Spark SQL</w:t>
-            </w:r>
-          </w:p>
-          <w:p>
-            <w:pPr>
-              <w:spacing w:before="60" w:after="60"/>
-              <w:ind w:right="112"/>
-              <w:jc w:val="both"/>
-              <w:rPr>
-                <w:rFonts w:eastAsiaTheme="minorHAnsi"/>
-                <w:b/>
-                <w:bCs/>
-                <w:i/>
-                <w:color w:val="262626" w:themeColor="text1" w:themeTint="D9"/>
-                <w:sz w:val="18"/>
-                <w:szCs w:val="18"/>
-                <w:lang w:eastAsia="en-US"/>
-              </w:rPr>
-            </w:pPr>
-          </w:p>
-          <w:p>
+            </w:pPr>
+          </w:p>
+          <w:p ns2:paraId="395C0CB0" ns2:textId="77777777">
             <w:pPr>
               <w:tabs>
                 <w:tab w:val="left" w:pos="6521"/>
@@ -2005,7 +1851,7 @@
           </w:p>
         </w:tc>
       </w:tr>
-      <w:tr>
+      <w:tr ns2:paraId="20CF7CE0" ns2:textId="77777777">
         <w:trPr>
           <w:trHeight w:val="460"/>
         </w:trPr>
@@ -2015,7 +1861,7 @@
             <w:shd w:val="clear" w:color="auto" w:fill="F2F2F2" w:themeFill="background2" w:themeFillShade="F2"/>
             <w:vAlign w:val="center"/>
           </w:tcPr>
-          <w:p>
+          <w:p ns2:paraId="3E9432DC" ns2:textId="77777777">
             <w:pPr>
               <w:ind w:right="-112"/>
               <w:rPr>
@@ -2040,7 +1886,7 @@
             <w:shd w:val="clear" w:color="auto" w:fill="F2F2F2" w:themeFill="background2" w:themeFillShade="F2"/>
             <w:vAlign w:val="center"/>
           </w:tcPr>
-          <w:p>
+          <w:p ns2:paraId="566FF9D0" ns2:textId="77777777">
             <w:pPr>
               <w:ind w:right="-337"/>
               <w:rPr>
@@ -2060,12 +1906,12 @@
           </w:p>
         </w:tc>
       </w:tr>
-      <w:tr>
+      <w:tr ns2:paraId="0CFC070D" ns2:textId="77777777">
         <w:tc>
           <w:tcPr>
             <w:tcW w:w="1984" w:type="dxa"/>
           </w:tcPr>
-          <w:p>
+          <w:p ns2:paraId="52F66ED2" ns2:textId="77777777">
             <w:pPr>
               <w:ind w:right="-337"/>
               <w:rPr>
@@ -2080,7 +1926,7 @@
           <w:tcPr>
             <w:tcW w:w="8309" w:type="dxa"/>
           </w:tcPr>
-          <w:p>
+          <w:p ns2:paraId="53065923" ns2:textId="77777777">
             <w:pPr>
               <w:spacing w:before="120" w:after="60"/>
               <w:ind w:right="112"/>
@@ -2104,7 +1950,7 @@
               <w:t>Consultant, Java / Big Data</w:t>
             </w:r>
           </w:p>
-          <w:p>
+          <w:p ns2:paraId="35966E4E" ns2:textId="77777777">
             <w:pPr>
               <w:spacing w:before="60" w:after="60"/>
               <w:ind w:right="112"/>
@@ -2146,7 +1992,7 @@
               <w:t xml:space="preserve"> with microservices and CI/CD standards.</w:t>
             </w:r>
           </w:p>
-          <w:p>
+          <w:p ns2:paraId="671270F6" ns2:textId="77777777">
             <w:pPr>
               <w:pStyle w:val="Paragraphedeliste"/>
               <w:numPr>
@@ -2188,7 +2034,7 @@
               <w:t xml:space="preserve"> and publisher-consumer patterns to improve risk-calculation performance.</w:t>
             </w:r>
           </w:p>
-          <w:p>
+          <w:p ns2:paraId="49848A46" ns2:textId="77777777">
             <w:pPr>
               <w:pStyle w:val="Paragraphedeliste"/>
               <w:numPr>
@@ -2230,7 +2076,7 @@
               <w:t xml:space="preserve"> delivery workflows across teams.</w:t>
             </w:r>
           </w:p>
-          <w:p>
+          <w:p ns2:paraId="7CB97166" ns2:textId="77777777">
             <w:pPr>
               <w:spacing w:before="120" w:after="60"/>
               <w:ind w:left="349" w:right="112"/>
@@ -2241,7 +2087,7 @@
               </w:rPr>
             </w:pPr>
           </w:p>
-          <w:p>
+          <w:p ns2:paraId="71404B51" ns2:textId="77777777">
             <w:pPr>
               <w:spacing w:before="60" w:after="60"/>
               <w:ind w:right="112"/>
@@ -2312,7 +2158,7 @@
               <w:t>, CI/CD, Jenkins</w:t>
             </w:r>
           </w:p>
-          <w:p>
+          <w:p ns2:paraId="31853305" ns2:textId="77777777">
             <w:pPr>
               <w:spacing w:before="60" w:after="60"/>
               <w:ind w:right="112"/>
@@ -2327,7 +2173,7 @@
               </w:rPr>
             </w:pPr>
           </w:p>
-          <w:p>
+          <w:p ns2:paraId="37A42EBE" ns2:textId="77777777">
             <w:pPr>
               <w:spacing w:before="60" w:after="60"/>
               <w:ind w:right="112"/>
@@ -2342,7 +2188,7 @@
               </w:rPr>
             </w:pPr>
           </w:p>
-          <w:p>
+          <w:p ns2:paraId="4F4145BD" ns2:textId="77777777">
             <w:pPr>
               <w:spacing w:before="60" w:after="60"/>
               <w:ind w:right="112"/>
@@ -2357,7 +2203,7 @@
               </w:rPr>
             </w:pPr>
           </w:p>
-          <w:p>
+          <w:p ns2:paraId="7AE42822" ns2:textId="77777777">
             <w:pPr>
               <w:spacing w:before="60" w:after="60"/>
               <w:ind w:right="112"/>
@@ -2372,7 +2218,7 @@
               </w:rPr>
             </w:pPr>
           </w:p>
-          <w:p>
+          <w:p ns2:paraId="67ADF0CC" ns2:textId="77777777">
             <w:pPr>
               <w:spacing w:before="60" w:after="60"/>
               <w:ind w:right="112"/>
@@ -2387,7 +2233,7 @@
               </w:rPr>
             </w:pPr>
           </w:p>
-          <w:p>
+          <w:p ns2:paraId="4A96469B" ns2:textId="77777777">
             <w:pPr>
               <w:spacing w:before="60" w:after="60"/>
               <w:ind w:right="112"/>
@@ -2404,7 +2250,7 @@
               </w:rPr>
             </w:pPr>
           </w:p>
-          <w:p>
+          <w:p ns2:paraId="277F17DA" ns2:textId="77777777">
             <w:pPr>
               <w:spacing w:before="60" w:after="60"/>
               <w:ind w:right="112"/>
@@ -2421,7 +2267,7 @@
               </w:rPr>
             </w:pPr>
           </w:p>
-          <w:p>
+          <w:p ns2:paraId="021F7C9B" ns2:textId="77777777">
             <w:pPr>
               <w:tabs>
                 <w:tab w:val="left" w:pos="6521"/>
@@ -2433,7 +2279,7 @@
           </w:p>
         </w:tc>
       </w:tr>
-      <w:tr>
+      <w:tr ns2:paraId="0A1EB4B4" ns2:textId="77777777">
         <w:trPr>
           <w:trHeight w:val="460"/>
         </w:trPr>
@@ -2443,7 +2289,7 @@
             <w:shd w:val="clear" w:color="auto" w:fill="F2F2F2" w:themeFill="background2" w:themeFillShade="F2"/>
             <w:vAlign w:val="center"/>
           </w:tcPr>
-          <w:p>
+          <w:p ns2:paraId="3BA72ECE" ns2:textId="77777777">
             <w:pPr>
               <w:ind w:right="-112"/>
               <w:rPr>
@@ -2469,7 +2315,7 @@
             <w:shd w:val="clear" w:color="auto" w:fill="F2F2F2" w:themeFill="background2" w:themeFillShade="F2"/>
             <w:vAlign w:val="center"/>
           </w:tcPr>
-          <w:p>
+          <w:p ns2:paraId="17BB5E56" ns2:textId="77777777">
             <w:pPr>
               <w:ind w:right="-337"/>
               <w:rPr>
@@ -2489,12 +2335,12 @@
           </w:p>
         </w:tc>
       </w:tr>
-      <w:tr>
+      <w:tr ns2:paraId="632B26B9" ns2:textId="77777777">
         <w:tc>
           <w:tcPr>
             <w:tcW w:w="1984" w:type="dxa"/>
           </w:tcPr>
-          <w:p>
+          <w:p ns2:paraId="57071E5A" ns2:textId="77777777">
             <w:pPr>
               <w:ind w:right="-337"/>
               <w:rPr>
@@ -2509,7 +2355,7 @@
           <w:tcPr>
             <w:tcW w:w="8309" w:type="dxa"/>
           </w:tcPr>
-          <w:p>
+          <w:p ns2:paraId="47244F0B" ns2:textId="77777777">
             <w:pPr>
               <w:spacing w:before="120" w:after="60"/>
               <w:ind w:right="112"/>
@@ -2533,7 +2379,7 @@
               <w:t>Senior Java / Big Data Developer</w:t>
             </w:r>
           </w:p>
-          <w:p>
+          <w:p ns2:paraId="56F9257F" ns2:textId="77777777">
             <w:pPr>
               <w:spacing w:before="60" w:after="60"/>
               <w:ind w:right="112"/>
@@ -2555,7 +2401,7 @@
               <w:t>Delivered big-data execution frameworks for FRTB default-risk metrics on Azure-based platforms.</w:t>
             </w:r>
           </w:p>
-          <w:p>
+          <w:p ns2:paraId="2F20646F" ns2:textId="77777777">
             <w:pPr>
               <w:pStyle w:val="Paragraphedeliste"/>
               <w:numPr>
@@ -2579,7 +2425,7 @@
               <w:t>Designed Kafka-driven messaging and result distribution toward downstream OLAP consumers.</w:t>
             </w:r>
           </w:p>
-          <w:p>
+          <w:p ns2:paraId="08B9D45D" ns2:textId="77777777">
             <w:pPr>
               <w:pStyle w:val="Paragraphedeliste"/>
               <w:numPr>
@@ -2603,7 +2449,7 @@
               <w:t>Migrated data projects from on-premises data lake stacks to Azure and maintained production services.</w:t>
             </w:r>
           </w:p>
-          <w:p>
+          <w:p ns2:paraId="5C14A5B0" ns2:textId="77777777">
             <w:pPr>
               <w:spacing w:before="120" w:after="60"/>
               <w:ind w:left="349" w:right="112"/>
@@ -2614,7 +2460,7 @@
               </w:rPr>
             </w:pPr>
           </w:p>
-          <w:p>
+          <w:p ns2:paraId="1F2529BB" ns2:textId="77777777">
             <w:pPr>
               <w:spacing w:before="60" w:after="60"/>
               <w:ind w:right="112"/>
@@ -2661,7 +2507,7 @@
               <w:t>Java, Big Data, Azure, Kafka, OLAP</w:t>
             </w:r>
           </w:p>
-          <w:p>
+          <w:p ns2:paraId="6FBEA7C6" ns2:textId="77777777">
             <w:pPr>
               <w:spacing w:before="60" w:after="60"/>
               <w:ind w:right="112"/>
@@ -2678,7 +2524,7 @@
               </w:rPr>
             </w:pPr>
           </w:p>
-          <w:p>
+          <w:p ns2:paraId="003743A8" ns2:textId="77777777">
             <w:pPr>
               <w:tabs>
                 <w:tab w:val="left" w:pos="6521"/>
@@ -2690,7 +2536,7 @@
           </w:p>
         </w:tc>
       </w:tr>
-      <w:tr>
+      <w:tr ns2:paraId="00EA9AE5" ns2:textId="77777777">
         <w:trPr>
           <w:trHeight w:val="460"/>
         </w:trPr>
@@ -2700,7 +2546,7 @@
             <w:shd w:val="clear" w:color="auto" w:fill="F2F2F2" w:themeFill="background2" w:themeFillShade="F2"/>
             <w:vAlign w:val="center"/>
           </w:tcPr>
-          <w:p>
+          <w:p ns2:paraId="097964DF" ns2:textId="77777777">
             <w:pPr>
               <w:ind w:right="-112"/>
               <w:rPr>
@@ -2725,7 +2571,7 @@
             <w:shd w:val="clear" w:color="auto" w:fill="F2F2F2" w:themeFill="background2" w:themeFillShade="F2"/>
             <w:vAlign w:val="center"/>
           </w:tcPr>
-          <w:p>
+          <w:p ns2:paraId="111F82D3" ns2:textId="77777777">
             <w:pPr>
               <w:ind w:right="-337"/>
               <w:rPr>
@@ -2745,12 +2591,12 @@
           </w:p>
         </w:tc>
       </w:tr>
-      <w:tr>
+      <w:tr ns2:paraId="3153EED1" ns2:textId="77777777">
         <w:tc>
           <w:tcPr>
             <w:tcW w:w="1984" w:type="dxa"/>
           </w:tcPr>
-          <w:p>
+          <w:p ns2:paraId="4344E62F" ns2:textId="77777777">
             <w:pPr>
               <w:ind w:right="-337"/>
               <w:rPr>
@@ -2765,7 +2611,7 @@
           <w:tcPr>
             <w:tcW w:w="8309" w:type="dxa"/>
           </w:tcPr>
-          <w:p>
+          <w:p ns2:paraId="453F6C3F" ns2:textId="77777777">
             <w:pPr>
               <w:spacing w:before="120" w:after="60"/>
               <w:ind w:right="112"/>
@@ -2789,7 +2635,7 @@
               <w:t>Consultant, Distributed Systems</w:t>
             </w:r>
           </w:p>
-          <w:p>
+          <w:p ns2:paraId="2D2883A8" ns2:textId="77777777">
             <w:pPr>
               <w:spacing w:before="60" w:after="60"/>
               <w:ind w:right="112"/>
@@ -2831,7 +2677,7 @@
               <w:t xml:space="preserve"> platform.</w:t>
             </w:r>
           </w:p>
-          <w:p>
+          <w:p ns2:paraId="064F848C" ns2:textId="77777777">
             <w:pPr>
               <w:pStyle w:val="Paragraphedeliste"/>
               <w:numPr>
@@ -2873,7 +2719,7 @@
               <w:t>, workflow and REST service capabilities.</w:t>
             </w:r>
           </w:p>
-          <w:p>
+          <w:p ns2:paraId="339CB166" ns2:textId="77777777">
             <w:pPr>
               <w:pStyle w:val="Paragraphedeliste"/>
               <w:numPr>
@@ -2915,7 +2761,7 @@
               <w:t xml:space="preserve"> across distributed compute grids.</w:t>
             </w:r>
           </w:p>
-          <w:p>
+          <w:p ns2:paraId="1D4E54EC" ns2:textId="77777777">
             <w:pPr>
               <w:spacing w:before="120" w:after="60"/>
               <w:ind w:left="349" w:right="112"/>
@@ -2926,7 +2772,7 @@
               </w:rPr>
             </w:pPr>
           </w:p>
-          <w:p>
+          <w:p ns2:paraId="611CA46B" ns2:textId="77777777">
             <w:pPr>
               <w:spacing w:before="60" w:after="60"/>
               <w:ind w:right="112"/>
@@ -2973,7 +2819,7 @@
               <w:t>REST, CI/CD</w:t>
             </w:r>
           </w:p>
-          <w:p>
+          <w:p ns2:paraId="22DC900A" ns2:textId="77777777">
             <w:pPr>
               <w:spacing w:before="60" w:after="60"/>
               <w:ind w:right="112"/>
@@ -2990,7 +2836,7 @@
               </w:rPr>
             </w:pPr>
           </w:p>
-          <w:p>
+          <w:p ns2:paraId="028E8A15" ns2:textId="77777777">
             <w:pPr>
               <w:tabs>
                 <w:tab w:val="left" w:pos="6521"/>
@@ -3002,7 +2848,7 @@
           </w:p>
         </w:tc>
       </w:tr>
-      <w:tr>
+      <w:tr ns2:paraId="0ACE522D" ns2:textId="77777777">
         <w:trPr>
           <w:trHeight w:val="460"/>
         </w:trPr>
@@ -3012,7 +2858,7 @@
             <w:shd w:val="clear" w:color="auto" w:fill="F2F2F2" w:themeFill="background2" w:themeFillShade="F2"/>
             <w:vAlign w:val="center"/>
           </w:tcPr>
-          <w:p>
+          <w:p ns2:paraId="7BFDA1B0" ns2:textId="77777777">
             <w:pPr>
               <w:ind w:right="-112"/>
               <w:rPr>
@@ -3037,7 +2883,7 @@
             <w:shd w:val="clear" w:color="auto" w:fill="F2F2F2" w:themeFill="background2" w:themeFillShade="F2"/>
             <w:vAlign w:val="center"/>
           </w:tcPr>
-          <w:p>
+          <w:p ns2:paraId="4C30E502" ns2:textId="77777777">
             <w:pPr>
               <w:ind w:right="-337"/>
               <w:rPr>
@@ -3057,12 +2903,12 @@
           </w:p>
         </w:tc>
       </w:tr>
-      <w:tr>
+      <w:tr ns2:paraId="229F4CA8" ns2:textId="77777777">
         <w:tc>
           <w:tcPr>
             <w:tcW w:w="1984" w:type="dxa"/>
           </w:tcPr>
-          <w:p>
+          <w:p ns2:paraId="283330A9" ns2:textId="77777777">
             <w:pPr>
               <w:ind w:right="-337"/>
               <w:rPr>
@@ -3077,7 +2923,7 @@
           <w:tcPr>
             <w:tcW w:w="8309" w:type="dxa"/>
           </w:tcPr>
-          <w:p>
+          <w:p ns2:paraId="4EDE9298" ns2:textId="77777777">
             <w:pPr>
               <w:spacing w:before="120" w:after="60"/>
               <w:ind w:right="112"/>
@@ -3101,7 +2947,7 @@
               <w:t>Java Core / SQL Developer</w:t>
             </w:r>
           </w:p>
-          <w:p>
+          <w:p ns2:paraId="4BAAAAD5" ns2:textId="77777777">
             <w:pPr>
               <w:spacing w:before="60" w:after="60"/>
               <w:ind w:right="112"/>
@@ -3123,7 +2969,7 @@
               <w:t>Built low-latency trade capture and position-management components for synthetic prime brokerage workflows.</w:t>
             </w:r>
           </w:p>
-          <w:p>
+          <w:p ns2:paraId="6D689082" ns2:textId="77777777">
             <w:pPr>
               <w:pStyle w:val="Paragraphedeliste"/>
               <w:numPr>
@@ -3147,7 +2993,7 @@
               <w:t>Delivered re-rating and historical replay APIs, BDD test suites and high-touch production support.</w:t>
             </w:r>
           </w:p>
-          <w:p>
+          <w:p ns2:paraId="5F7CB0FA" ns2:textId="77777777">
             <w:pPr>
               <w:spacing w:before="120" w:after="60"/>
               <w:ind w:left="349" w:right="112"/>
@@ -3158,7 +3004,7 @@
               </w:rPr>
             </w:pPr>
           </w:p>
-          <w:p>
+          <w:p ns2:paraId="4D9E5A6F" ns2:textId="77777777">
             <w:pPr>
               <w:spacing w:before="60" w:after="60"/>
               <w:ind w:right="112"/>
@@ -3229,7 +3075,7 @@
               <w:t>, SQL, APIs, BDD</w:t>
             </w:r>
           </w:p>
-          <w:p>
+          <w:p ns2:paraId="4F003894" ns2:textId="77777777">
             <w:pPr>
               <w:spacing w:before="60" w:after="60"/>
               <w:ind w:right="112"/>
@@ -3246,7 +3092,7 @@
               </w:rPr>
             </w:pPr>
           </w:p>
-          <w:p>
+          <w:p ns2:paraId="568760F4" ns2:textId="77777777">
             <w:pPr>
               <w:tabs>
                 <w:tab w:val="left" w:pos="6521"/>
@@ -3258,7 +3104,7 @@
           </w:p>
         </w:tc>
       </w:tr>
-      <w:tr>
+      <w:tr ns2:paraId="7C7FDDE1" ns2:textId="77777777">
         <w:trPr>
           <w:trHeight w:val="460"/>
         </w:trPr>
@@ -3268,7 +3114,7 @@
             <w:shd w:val="clear" w:color="auto" w:fill="F2F2F2" w:themeFill="background2" w:themeFillShade="F2"/>
             <w:vAlign w:val="center"/>
           </w:tcPr>
-          <w:p>
+          <w:p ns2:paraId="544C7E9B" ns2:textId="77777777">
             <w:pPr>
               <w:ind w:right="-112"/>
               <w:rPr>
@@ -3293,7 +3139,7 @@
             <w:shd w:val="clear" w:color="auto" w:fill="F2F2F2" w:themeFill="background2" w:themeFillShade="F2"/>
             <w:vAlign w:val="center"/>
           </w:tcPr>
-          <w:p>
+          <w:p ns2:paraId="15A1D548" ns2:textId="77777777">
             <w:pPr>
               <w:ind w:right="-337"/>
               <w:rPr>
@@ -3313,12 +3159,12 @@
           </w:p>
         </w:tc>
       </w:tr>
-      <w:tr>
+      <w:tr ns2:paraId="2B6AC2D6" ns2:textId="77777777">
         <w:tc>
           <w:tcPr>
             <w:tcW w:w="1984" w:type="dxa"/>
           </w:tcPr>
-          <w:p>
+          <w:p ns2:paraId="506FFFD1" ns2:textId="77777777">
             <w:pPr>
               <w:ind w:right="-337"/>
               <w:rPr>
@@ -3333,7 +3179,7 @@
           <w:tcPr>
             <w:tcW w:w="8309" w:type="dxa"/>
           </w:tcPr>
-          <w:p>
+          <w:p ns2:paraId="73B5D129" ns2:textId="77777777">
             <w:pPr>
               <w:spacing w:before="120" w:after="60"/>
               <w:ind w:right="112"/>
@@ -3357,7 +3203,7 @@
               <w:t>Java / JEE Developer</w:t>
             </w:r>
           </w:p>
-          <w:p>
+          <w:p ns2:paraId="212602BD" ns2:textId="77777777">
             <w:pPr>
               <w:spacing w:before="60" w:after="60"/>
               <w:ind w:right="112"/>
@@ -3379,7 +3225,7 @@
               <w:t>Developed alerting and integration services for real-time betting transaction systems.</w:t>
             </w:r>
           </w:p>
-          <w:p>
+          <w:p ns2:paraId="4A43D56A" ns2:textId="77777777">
             <w:pPr>
               <w:pStyle w:val="Paragraphedeliste"/>
               <w:numPr>
@@ -3403,7 +3249,7 @@
               <w:t>Implemented messaging, server-push and database procedures, and coached junior developers.</w:t>
             </w:r>
           </w:p>
-          <w:p>
+          <w:p ns2:paraId="275F2BA9" ns2:textId="77777777">
             <w:pPr>
               <w:spacing w:before="120" w:after="60"/>
               <w:ind w:left="349" w:right="112"/>
@@ -3414,7 +3260,7 @@
               </w:rPr>
             </w:pPr>
           </w:p>
-          <w:p>
+          <w:p ns2:paraId="091AB84E" ns2:textId="77777777">
             <w:pPr>
               <w:spacing w:before="60" w:after="60"/>
               <w:ind w:right="112"/>
@@ -3461,7 +3307,7 @@
               <w:t>Java, JEE</w:t>
             </w:r>
           </w:p>
-          <w:p>
+          <w:p ns2:paraId="611D4DDE" ns2:textId="77777777">
             <w:pPr>
               <w:spacing w:before="60" w:after="60"/>
               <w:ind w:right="112"/>
@@ -3478,7 +3324,7 @@
               </w:rPr>
             </w:pPr>
           </w:p>
-          <w:p>
+          <w:p ns2:paraId="3C412D11" ns2:textId="77777777">
             <w:pPr>
               <w:tabs>
                 <w:tab w:val="left" w:pos="6521"/>
@@ -3490,7 +3336,7 @@
           </w:p>
         </w:tc>
       </w:tr>
-      <w:tr>
+      <w:tr ns2:paraId="5CFE1105" ns2:textId="77777777">
         <w:trPr>
           <w:trHeight w:val="460"/>
         </w:trPr>
@@ -3500,7 +3346,7 @@
             <w:shd w:val="clear" w:color="auto" w:fill="F2F2F2" w:themeFill="background2" w:themeFillShade="F2"/>
             <w:vAlign w:val="center"/>
           </w:tcPr>
-          <w:p>
+          <w:p ns2:paraId="39C16788" ns2:textId="77777777">
             <w:pPr>
               <w:ind w:right="-112"/>
               <w:rPr>
@@ -3525,7 +3371,7 @@
             <w:shd w:val="clear" w:color="auto" w:fill="F2F2F2" w:themeFill="background2" w:themeFillShade="F2"/>
             <w:vAlign w:val="center"/>
           </w:tcPr>
-          <w:p>
+          <w:p ns2:paraId="4BAD9370" ns2:textId="77777777">
             <w:pPr>
               <w:ind w:right="-337"/>
               <w:rPr>
@@ -3545,12 +3391,12 @@
           </w:p>
         </w:tc>
       </w:tr>
-      <w:tr>
+      <w:tr ns2:paraId="4B9E41E4" ns2:textId="77777777">
         <w:tc>
           <w:tcPr>
             <w:tcW w:w="1984" w:type="dxa"/>
           </w:tcPr>
-          <w:p>
+          <w:p ns2:paraId="19DFC4C9" ns2:textId="77777777">
             <w:pPr>
               <w:ind w:right="-337"/>
               <w:rPr>
@@ -3565,7 +3411,7 @@
           <w:tcPr>
             <w:tcW w:w="8309" w:type="dxa"/>
           </w:tcPr>
-          <w:p>
+          <w:p ns2:paraId="388D0FF0" ns2:textId="77777777">
             <w:pPr>
               <w:spacing w:before="120" w:after="60"/>
               <w:ind w:right="112"/>
@@ -3589,7 +3435,7 @@
               <w:t>Java Consultant</w:t>
             </w:r>
           </w:p>
-          <w:p>
+          <w:p ns2:paraId="16A93784" ns2:textId="77777777">
             <w:pPr>
               <w:spacing w:before="60" w:after="60"/>
               <w:ind w:right="112"/>
@@ -3611,7 +3457,7 @@
               <w:t>Built file-conversion and supervision applications using Java, Spring Batch, XML and Oracle.</w:t>
             </w:r>
           </w:p>
-          <w:p>
+          <w:p ns2:paraId="3A000320" ns2:textId="77777777">
             <w:pPr>
               <w:spacing w:before="60" w:after="60"/>
               <w:ind w:right="112"/>
@@ -3626,7 +3472,7 @@
               </w:rPr>
             </w:pPr>
           </w:p>
-          <w:p>
+          <w:p ns2:paraId="145CEA89" ns2:textId="51C2D206">
             <w:pPr>
               <w:spacing w:before="60" w:after="60"/>
               <w:ind w:right="112"/>
@@ -3676,7 +3522,7 @@
         </w:tc>
       </w:tr>
     </w:tbl>
-    <w:p>
+    <w:p ns2:paraId="213DABDA" ns2:textId="7B6AF4EB">
       <w:pPr>
         <w:tabs>
           <w:tab w:val="left" w:pos="3110"/>

</xml_diff>

<commit_message>
Restore missing CV sections
Co-authored-by: mngenius <6729397+mngenius@users.noreply.github.com>
</commit_message>
<xml_diff>
--- a/CV-QIM-Amin LEBSIR-TOTSA-EN.docx
+++ b/CV-QIM-Amin LEBSIR-TOTSA-EN.docx
@@ -663,6 +663,117 @@
         <ns0:t>Data engineering and platform leader with 16 years of overall experience, including 11 years in trading environments across capital markets and energy commodities. I deliver AWS, Databricks and PySpark data platforms end to end, combining run ownership, automation and close collaboration with business and technical stakeholders.</ns0:t>
       </ns0:r>
     </ns0:p>
+    <ns0:p ns2:paraId="31403CF2" ns2:textId="77777777" ns0:rsidR="00345433" ns0:rsidRDefault="00345433" ns0:rsidP="00345433">
+      <ns0:pPr>
+        <ns0:spacing ns0:before="240"/>
+        <ns0:ind ns0:left="426" ns0:right="-337"/>
+        <ns0:rPr>
+          <ns0:b/>
+          <ns0:bCs/>
+          <ns0:color ns0:val="00B8A2"/>
+        </ns0:rPr>
+        <ns0:sectPr ns0:rsidR="00345433">
+          <ns0:footerReference ns0:type="even" ns10:id="rId12"/>
+          <ns0:footerReference ns0:type="default" ns10:id="rId13"/>
+          <ns0:pgSz ns0:w="11910" ns0:h="16840"/>
+          <ns0:pgMar ns0:top="357" ns0:right="1021" ns0:bottom="816" ns0:left="170" ns0:header="1701" ns0:footer="1247" ns0:gutter="0"/>
+          <ns0:cols ns0:space="708"/>
+          <ns0:docGrid ns0:linePitch="299"/>
+        </ns0:sectPr>
+      </ns0:pPr>
+    </ns0:p>
+    <ns0:p ns2:paraId="28B769CF" ns2:textId="40924548" ns0:rsidR="008B2185" ns0:rsidRDefault="00194A50">
+      <ns0:pPr>
+        <ns0:pBdr>
+          <ns0:bottom ns0:val="single" ns0:sz="4" ns0:space="6" ns0:color="auto"/>
+        </ns0:pBdr>
+        <ns0:ind ns0:left="426"/>
+        <ns0:rPr>
+          <ns0:b/>
+          <ns0:bCs/>
+          <ns0:color ns0:val="1C2E5A"/>
+          <ns0:sz ns0:val="32"/>
+          <ns0:szCs ns0:val="32"/>
+        </ns0:rPr>
+      </ns0:pPr>
+      <ns0:proofErr ns0:type="spellStart"/>
+      <ns0:proofErr ns0:type="spellEnd"/>
+      <ns0:proofErr ns0:type="spellStart"/>
+      <ns0:proofErr ns0:type="spellEnd"/>
+      <ns0:r>
+        <ns0:t>Contact &amp; focus</ns0:t>
+      </ns0:r>
+    </ns0:p>
+    <ns0:p ns2:paraId="31403CF2" ns2:textId="77777777" ns0:rsidR="00345433" ns0:rsidRDefault="00345433" ns0:rsidP="00345433">
+      <ns0:pPr>
+        <ns0:spacing ns0:before="240"/>
+        <ns0:ind ns0:left="426" ns0:right="-337"/>
+        <ns0:rPr>
+          <ns0:b/>
+          <ns0:bCs/>
+          <ns0:color ns0:val="00B8A2"/>
+        </ns0:rPr>
+        <ns0:sectPr ns0:rsidR="00345433">
+          <ns0:footerReference ns0:type="even" ns10:id="rId12"/>
+          <ns0:footerReference ns0:type="default" ns10:id="rId13"/>
+          <ns0:pgSz ns0:w="11910" ns0:h="16840"/>
+          <ns0:pgMar ns0:top="357" ns0:right="1021" ns0:bottom="816" ns0:left="170" ns0:header="1701" ns0:footer="1247" ns0:gutter="0"/>
+          <ns0:cols ns0:space="708"/>
+          <ns0:docGrid ns0:linePitch="299"/>
+        </ns0:sectPr>
+      </ns0:pPr>
+    </ns0:p>
+    <ns0:p ns2:paraId="13C1D1AB" ns2:textId="5BD209F2" ns0:rsidR="008B2185" ns0:rsidRDefault="005152C2" ns0:rsidP="00BE58E5">
+      <ns0:pPr>
+        <ns0:spacing ns0:before="240"/>
+        <ns0:ind ns0:left="426" ns0:right="-337"/>
+        <ns0:jc ns0:val="both"/>
+        <ns0:rPr>
+          <ns0:color ns0:val="002060"/>
+          <ns0:lang ns0:val="en-US"/>
+        </ns0:rPr>
+      </ns0:pPr>
+      <ns0:proofErr ns0:type="spellStart"/>
+      <ns0:proofErr ns0:type="spellEnd"/>
+      <ns0:r>
+        <ns0:t>GitHub : github.com/mngenius</ns0:t>
+      </ns0:r>
+    </ns0:p>
+    <ns0:p ns2:paraId="13C1D1AB" ns2:textId="5BD209F2" ns0:rsidR="008B2185" ns0:rsidRDefault="005152C2" ns0:rsidP="00BE58E5">
+      <ns0:pPr>
+        <ns0:spacing ns0:before="240"/>
+        <ns0:ind ns0:left="426" ns0:right="-337"/>
+        <ns0:jc ns0:val="both"/>
+        <ns0:rPr>
+          <ns0:color ns0:val="002060"/>
+          <ns0:lang ns0:val="en-US"/>
+        </ns0:rPr>
+      </ns0:pPr>
+      <ns0:proofErr ns0:type="spellStart"/>
+      <ns0:proofErr ns0:type="spellEnd"/>
+      <ns0:r>
+        <ns0:t>Focus : AWS, Azure, Spark, Java, Python</ns0:t>
+      </ns0:r>
+    </ns0:p>
+    <ns0:p ns2:paraId="31403CF2" ns2:textId="77777777" ns0:rsidR="00345433" ns0:rsidRDefault="00345433" ns0:rsidP="00345433">
+      <ns0:pPr>
+        <ns0:spacing ns0:before="240"/>
+        <ns0:ind ns0:left="426" ns0:right="-337"/>
+        <ns0:rPr>
+          <ns0:b/>
+          <ns0:bCs/>
+          <ns0:color ns0:val="00B8A2"/>
+        </ns0:rPr>
+        <ns0:sectPr ns0:rsidR="00345433">
+          <ns0:footerReference ns0:type="even" ns10:id="rId12"/>
+          <ns0:footerReference ns0:type="default" ns10:id="rId13"/>
+          <ns0:pgSz ns0:w="11910" ns0:h="16840"/>
+          <ns0:pgMar ns0:top="357" ns0:right="1021" ns0:bottom="816" ns0:left="170" ns0:header="1701" ns0:footer="1247" ns0:gutter="0"/>
+          <ns0:cols ns0:space="708"/>
+          <ns0:docGrid ns0:linePitch="299"/>
+        </ns0:sectPr>
+      </ns0:pPr>
+    </ns0:p>
     <ns0:p ns2:paraId="4678C4CE" ns2:textId="77777777" ns0:rsidR="005152C2" ns0:rsidRDefault="005152C2">
       <ns0:pPr>
         <ns0:pBdr>
@@ -3530,6 +3641,484 @@
         <ns0:rPr>
           <ns0:color ns0:val="1C2E5A"/>
         </ns0:rPr>
+      </ns0:pPr>
+    </ns0:p>
+    <ns0:p ns2:paraId="31403CF2" ns2:textId="77777777" ns0:rsidR="00345433" ns0:rsidRDefault="00345433" ns0:rsidP="00345433">
+      <ns0:pPr>
+        <ns0:spacing ns0:before="240"/>
+        <ns0:ind ns0:left="426" ns0:right="-337"/>
+        <ns0:rPr>
+          <ns0:b/>
+          <ns0:bCs/>
+          <ns0:color ns0:val="00B8A2"/>
+        </ns0:rPr>
+        <ns0:sectPr ns0:rsidR="00345433">
+          <ns0:footerReference ns0:type="even" ns10:id="rId12"/>
+          <ns0:footerReference ns0:type="default" ns10:id="rId13"/>
+          <ns0:pgSz ns0:w="11910" ns0:h="16840"/>
+          <ns0:pgMar ns0:top="357" ns0:right="1021" ns0:bottom="816" ns0:left="170" ns0:header="1701" ns0:footer="1247" ns0:gutter="0"/>
+          <ns0:cols ns0:space="708"/>
+          <ns0:docGrid ns0:linePitch="299"/>
+        </ns0:sectPr>
+      </ns0:pPr>
+    </ns0:p>
+    <ns0:p ns2:paraId="28B769CF" ns2:textId="40924548" ns0:rsidR="008B2185" ns0:rsidRDefault="00194A50">
+      <ns0:pPr>
+        <ns0:pBdr>
+          <ns0:bottom ns0:val="single" ns0:sz="4" ns0:space="6" ns0:color="auto"/>
+        </ns0:pBdr>
+        <ns0:ind ns0:left="426"/>
+        <ns0:rPr>
+          <ns0:b/>
+          <ns0:bCs/>
+          <ns0:color ns0:val="1C2E5A"/>
+          <ns0:sz ns0:val="32"/>
+          <ns0:szCs ns0:val="32"/>
+        </ns0:rPr>
+      </ns0:pPr>
+      <ns0:proofErr ns0:type="spellStart"/>
+      <ns0:proofErr ns0:type="spellEnd"/>
+      <ns0:proofErr ns0:type="spellStart"/>
+      <ns0:proofErr ns0:type="spellEnd"/>
+      <ns0:r>
+        <ns0:t>Selected impact</ns0:t>
+      </ns0:r>
+    </ns0:p>
+    <ns0:p ns2:paraId="31403CF2" ns2:textId="77777777" ns0:rsidR="00345433" ns0:rsidRDefault="00345433" ns0:rsidP="00345433">
+      <ns0:pPr>
+        <ns0:spacing ns0:before="240"/>
+        <ns0:ind ns0:left="426" ns0:right="-337"/>
+        <ns0:rPr>
+          <ns0:b/>
+          <ns0:bCs/>
+          <ns0:color ns0:val="00B8A2"/>
+        </ns0:rPr>
+        <ns0:sectPr ns0:rsidR="00345433">
+          <ns0:footerReference ns0:type="even" ns10:id="rId12"/>
+          <ns0:footerReference ns0:type="default" ns10:id="rId13"/>
+          <ns0:pgSz ns0:w="11910" ns0:h="16840"/>
+          <ns0:pgMar ns0:top="357" ns0:right="1021" ns0:bottom="816" ns0:left="170" ns0:header="1701" ns0:footer="1247" ns0:gutter="0"/>
+          <ns0:cols ns0:space="708"/>
+          <ns0:docGrid ns0:linePitch="299"/>
+        </ns0:sectPr>
+      </ns0:pPr>
+    </ns0:p>
+    <ns0:p ns2:paraId="0163DFAA" ns2:textId="4AD893A7" ns0:rsidR="0065673B" ns0:rsidRPr="0065673B" ns0:rsidRDefault="0065673B" ns0:rsidP="0065673B">
+      <ns0:pPr>
+        <ns0:spacing ns0:before="240"/>
+        <ns0:ind ns0:left="426" ns0:right="-337"/>
+        <ns0:jc ns0:val="both"/>
+        <ns0:rPr>
+          <ns0:b/>
+          <ns0:bCs/>
+          <ns0:color ns0:val="00B8A2"/>
+        </ns0:rPr>
+      </ns0:pPr>
+      <ns0:r>
+        <ns0:t>No-code risk pipeline platform with safe promotion rails</ns0:t>
+      </ns0:r>
+    </ns0:p>
+    <ns0:p ns2:paraId="13C1D1AB" ns2:textId="5BD209F2" ns0:rsidR="008B2185" ns0:rsidRDefault="005152C2" ns0:rsidP="00BE58E5">
+      <ns0:pPr>
+        <ns0:spacing ns0:before="240"/>
+        <ns0:ind ns0:left="426" ns0:right="-337"/>
+        <ns0:jc ns0:val="both"/>
+        <ns0:rPr>
+          <ns0:color ns0:val="002060"/>
+          <ns0:lang ns0:val="en-US"/>
+        </ns0:rPr>
+      </ns0:pPr>
+      <ns0:proofErr ns0:type="spellStart"/>
+      <ns0:proofErr ns0:type="spellEnd"/>
+      <ns0:r>
+        <ns0:t>Designed a JSON-driven pipeline model that lets analysts and business teams define processing logic while the platform compiles it into Spark and Spark SQL execution. Wrapped it in a controlled lifecycle with draft, validated and live states, immutable versions, automated validation gates and approval-based promotion to production.</ns0:t>
+      </ns0:r>
+    </ns0:p>
+    <ns0:p ns2:paraId="0163DFAA" ns2:textId="4AD893A7" ns0:rsidR="0065673B" ns0:rsidRPr="0065673B" ns0:rsidRDefault="0065673B" ns0:rsidP="0065673B">
+      <ns0:pPr>
+        <ns0:spacing ns0:before="240"/>
+        <ns0:ind ns0:left="426" ns0:right="-337"/>
+        <ns0:jc ns0:val="both"/>
+        <ns0:rPr>
+          <ns0:b/>
+          <ns0:bCs/>
+          <ns0:color ns0:val="00B8A2"/>
+        </ns0:rPr>
+      </ns0:pPr>
+      <ns0:r>
+        <ns0:t>Governed business screens over raw S3 and risk data</ns0:t>
+      </ns0:r>
+    </ns0:p>
+    <ns0:p ns2:paraId="13C1D1AB" ns2:textId="5BD209F2" ns0:rsidR="008B2185" ns0:rsidRDefault="005152C2" ns0:rsidP="00BE58E5">
+      <ns0:pPr>
+        <ns0:spacing ns0:before="240"/>
+        <ns0:ind ns0:left="426" ns0:right="-337"/>
+        <ns0:jc ns0:val="both"/>
+        <ns0:rPr>
+          <ns0:color ns0:val="002060"/>
+          <ns0:lang ns0:val="en-US"/>
+        </ns0:rPr>
+      </ns0:pPr>
+      <ns0:proofErr ns0:type="spellStart"/>
+      <ns0:proofErr ns0:type="spellEnd"/>
+      <ns0:r>
+        <ns0:t>Built the path from catalogued raw data to business-facing screens: automatic data catalog indexing, admin-configured views, drill-down and drill-through navigation, per-scenario analysis, and correct re-aggregation logic for additive and non-additive measures such as VaR.</ns0:t>
+      </ns0:r>
+    </ns0:p>
+    <ns0:p ns2:paraId="0163DFAA" ns2:textId="4AD893A7" ns0:rsidR="0065673B" ns0:rsidRPr="0065673B" ns0:rsidRDefault="0065673B" ns0:rsidP="0065673B">
+      <ns0:pPr>
+        <ns0:spacing ns0:before="240"/>
+        <ns0:ind ns0:left="426" ns0:right="-337"/>
+        <ns0:jc ns0:val="both"/>
+        <ns0:rPr>
+          <ns0:b/>
+          <ns0:bCs/>
+          <ns0:color ns0:val="00B8A2"/>
+        </ns0:rPr>
+      </ns0:pPr>
+      <ns0:r>
+        <ns0:t>Cross-cloud event-driven migration of production risk workloads</ns0:t>
+      </ns0:r>
+    </ns0:p>
+    <ns0:p ns2:paraId="13C1D1AB" ns2:textId="5BD209F2" ns0:rsidR="008B2185" ns0:rsidRDefault="005152C2" ns0:rsidP="00BE58E5">
+      <ns0:pPr>
+        <ns0:spacing ns0:before="240"/>
+        <ns0:ind ns0:left="426" ns0:right="-337"/>
+        <ns0:jc ns0:val="both"/>
+        <ns0:rPr>
+          <ns0:color ns0:val="002060"/>
+          <ns0:lang ns0:val="en-US"/>
+        </ns0:rPr>
+      </ns0:pPr>
+      <ns0:proofErr ns0:type="spellStart"/>
+      <ns0:proofErr ns0:type="spellEnd"/>
+      <ns0:r>
+        <ns0:t>Replaced file-watching integrations with AWS event-driven components using S3, Lambda, Glue and EventBridge, while bridging AWS and Azure workloads and preserving traceability, monitoring and delivery control across the migration path.</ns0:t>
+      </ns0:r>
+    </ns0:p>
+    <ns0:p ns2:paraId="0163DFAA" ns2:textId="4AD893A7" ns0:rsidR="0065673B" ns0:rsidRPr="0065673B" ns0:rsidRDefault="0065673B" ns0:rsidP="0065673B">
+      <ns0:pPr>
+        <ns0:spacing ns0:before="240"/>
+        <ns0:ind ns0:left="426" ns0:right="-337"/>
+        <ns0:jc ns0:val="both"/>
+        <ns0:rPr>
+          <ns0:b/>
+          <ns0:bCs/>
+          <ns0:color ns0:val="00B8A2"/>
+        </ns0:rPr>
+      </ns0:pPr>
+      <ns0:r>
+        <ns0:t>Lakehouse patterns that transfer cleanly to Databricks</ns0:t>
+      </ns0:r>
+    </ns0:p>
+    <ns0:p ns2:paraId="13C1D1AB" ns2:textId="5BD209F2" ns0:rsidR="008B2185" ns0:rsidRDefault="005152C2" ns0:rsidP="00BE58E5">
+      <ns0:pPr>
+        <ns0:spacing ns0:before="240"/>
+        <ns0:ind ns0:left="426" ns0:right="-337"/>
+        <ns0:jc ns0:val="both"/>
+        <ns0:rPr>
+          <ns0:color ns0:val="002060"/>
+          <ns0:lang ns0:val="en-US"/>
+        </ns0:rPr>
+      </ns0:pPr>
+      <ns0:proofErr ns0:type="spellStart"/>
+      <ns0:proofErr ns0:type="spellEnd"/>
+      <ns0:r>
+        <ns0:t>Applied Spark, Iceberg, Athena and governance patterns that map directly to Delta Lake, Unity Catalog, Databricks SQL and Delta Live Tables, with particular depth in data correctness, release discipline and performance-aware risk aggregation.</ns0:t>
+      </ns0:r>
+    </ns0:p>
+    <ns0:p ns2:paraId="0163DFAA" ns2:textId="4AD893A7" ns0:rsidR="0065673B" ns0:rsidRPr="0065673B" ns0:rsidRDefault="0065673B" ns0:rsidP="0065673B">
+      <ns0:pPr>
+        <ns0:spacing ns0:before="240"/>
+        <ns0:ind ns0:left="426" ns0:right="-337"/>
+        <ns0:jc ns0:val="both"/>
+        <ns0:rPr>
+          <ns0:b/>
+          <ns0:bCs/>
+          <ns0:color ns0:val="00B8A2"/>
+        </ns0:rPr>
+      </ns0:pPr>
+      <ns0:r>
+        <ns0:t>Platform engineering that keeps delivery boring</ns0:t>
+      </ns0:r>
+    </ns0:p>
+    <ns0:p ns2:paraId="13C1D1AB" ns2:textId="5BD209F2" ns0:rsidR="008B2185" ns0:rsidRDefault="005152C2" ns0:rsidP="00BE58E5">
+      <ns0:pPr>
+        <ns0:spacing ns0:before="240"/>
+        <ns0:ind ns0:left="426" ns0:right="-337"/>
+        <ns0:jc ns0:val="both"/>
+        <ns0:rPr>
+          <ns0:color ns0:val="002060"/>
+          <ns0:lang ns0:val="en-US"/>
+        </ns0:rPr>
+      </ns0:pPr>
+      <ns0:proofErr ns0:type="spellStart"/>
+      <ns0:proofErr ns0:type="spellEnd"/>
+      <ns0:r>
+        <ns0:t>Built reusable CI/CD assets, Kubernetes-based runtime foundations, passwordless cloud authentication patterns, and cost-control automation aimed at making data and platform systems reproducible, secure and inexpensive when idle.</ns0:t>
+      </ns0:r>
+    </ns0:p>
+    <ns0:p ns2:paraId="31403CF2" ns2:textId="77777777" ns0:rsidR="00345433" ns0:rsidRDefault="00345433" ns0:rsidP="00345433">
+      <ns0:pPr>
+        <ns0:spacing ns0:before="240"/>
+        <ns0:ind ns0:left="426" ns0:right="-337"/>
+        <ns0:rPr>
+          <ns0:b/>
+          <ns0:bCs/>
+          <ns0:color ns0:val="00B8A2"/>
+        </ns0:rPr>
+        <ns0:sectPr ns0:rsidR="00345433">
+          <ns0:footerReference ns0:type="even" ns10:id="rId12"/>
+          <ns0:footerReference ns0:type="default" ns10:id="rId13"/>
+          <ns0:pgSz ns0:w="11910" ns0:h="16840"/>
+          <ns0:pgMar ns0:top="357" ns0:right="1021" ns0:bottom="816" ns0:left="170" ns0:header="1701" ns0:footer="1247" ns0:gutter="0"/>
+          <ns0:cols ns0:space="708"/>
+          <ns0:docGrid ns0:linePitch="299"/>
+        </ns0:sectPr>
+      </ns0:pPr>
+    </ns0:p>
+    <ns0:p ns2:paraId="28B769CF" ns2:textId="40924548" ns0:rsidR="008B2185" ns0:rsidRDefault="00194A50">
+      <ns0:pPr>
+        <ns0:pBdr>
+          <ns0:bottom ns0:val="single" ns0:sz="4" ns0:space="6" ns0:color="auto"/>
+        </ns0:pBdr>
+        <ns0:ind ns0:left="426"/>
+        <ns0:rPr>
+          <ns0:b/>
+          <ns0:bCs/>
+          <ns0:color ns0:val="1C2E5A"/>
+          <ns0:sz ns0:val="32"/>
+          <ns0:szCs ns0:val="32"/>
+        </ns0:rPr>
+      </ns0:pPr>
+      <ns0:proofErr ns0:type="spellStart"/>
+      <ns0:proofErr ns0:type="spellEnd"/>
+      <ns0:proofErr ns0:type="spellStart"/>
+      <ns0:proofErr ns0:type="spellEnd"/>
+      <ns0:r>
+        <ns0:t>Key themes across the portfolio</ns0:t>
+      </ns0:r>
+    </ns0:p>
+    <ns0:p ns2:paraId="31403CF2" ns2:textId="77777777" ns0:rsidR="00345433" ns0:rsidRDefault="00345433" ns0:rsidP="00345433">
+      <ns0:pPr>
+        <ns0:spacing ns0:before="240"/>
+        <ns0:ind ns0:left="426" ns0:right="-337"/>
+        <ns0:rPr>
+          <ns0:b/>
+          <ns0:bCs/>
+          <ns0:color ns0:val="00B8A2"/>
+        </ns0:rPr>
+        <ns0:sectPr ns0:rsidR="00345433">
+          <ns0:footerReference ns0:type="even" ns10:id="rId12"/>
+          <ns0:footerReference ns0:type="default" ns10:id="rId13"/>
+          <ns0:pgSz ns0:w="11910" ns0:h="16840"/>
+          <ns0:pgMar ns0:top="357" ns0:right="1021" ns0:bottom="816" ns0:left="170" ns0:header="1701" ns0:footer="1247" ns0:gutter="0"/>
+          <ns0:cols ns0:space="708"/>
+          <ns0:docGrid ns0:linePitch="299"/>
+        </ns0:sectPr>
+      </ns0:pPr>
+    </ns0:p>
+    <ns0:p ns2:paraId="4FF2DE45" ns2:textId="560A55F1" ns0:rsidR="00221283" ns0:rsidRPr="005152C2" ns0:rsidRDefault="0065673B" ns0:rsidP="00221283">
+      <ns0:pPr>
+        <ns0:pStyle ns0:val="Paragraphedeliste"/>
+        <ns0:numPr>
+          <ns0:ilvl ns0:val="0"/>
+          <ns0:numId ns0:val="7"/>
+        </ns0:numPr>
+        <ns0:spacing ns0:after="0"/>
+        <ns0:ind ns0:left="1068" ns0:right="-337"/>
+        <ns0:jc ns0:val="both"/>
+        <ns0:rPr>
+          <ns0:color ns0:val="002060"/>
+          <ns0:lang ns0:val="de-CH"/>
+        </ns0:rPr>
+      </ns0:pPr>
+      <ns0:proofErr ns0:type="spellStart"/>
+      <ns0:proofErr ns0:type="spellEnd"/>
+      <ns0:proofErr ns0:type="spellStart"/>
+      <ns0:proofErr ns0:type="spellEnd"/>
+      <ns0:r>
+        <ns0:t>Risk data products with auditability and release control</ns0:t>
+      </ns0:r>
+    </ns0:p>
+    <ns0:p ns2:paraId="4FF2DE45" ns2:textId="560A55F1" ns0:rsidR="00221283" ns0:rsidRPr="005152C2" ns0:rsidRDefault="0065673B" ns0:rsidP="00221283">
+      <ns0:pPr>
+        <ns0:pStyle ns0:val="Paragraphedeliste"/>
+        <ns0:numPr>
+          <ns0:ilvl ns0:val="0"/>
+          <ns0:numId ns0:val="7"/>
+        </ns0:numPr>
+        <ns0:spacing ns0:after="0"/>
+        <ns0:ind ns0:left="1068" ns0:right="-337"/>
+        <ns0:jc ns0:val="both"/>
+        <ns0:rPr>
+          <ns0:color ns0:val="002060"/>
+          <ns0:lang ns0:val="de-CH"/>
+        </ns0:rPr>
+      </ns0:pPr>
+      <ns0:proofErr ns0:type="spellStart"/>
+      <ns0:proofErr ns0:type="spellEnd"/>
+      <ns0:proofErr ns0:type="spellStart"/>
+      <ns0:proofErr ns0:type="spellEnd"/>
+      <ns0:r>
+        <ns0:t>Serverless and Spark-based data processing on AWS</ns0:t>
+      </ns0:r>
+    </ns0:p>
+    <ns0:p ns2:paraId="4FF2DE45" ns2:textId="560A55F1" ns0:rsidR="00221283" ns0:rsidRPr="005152C2" ns0:rsidRDefault="0065673B" ns0:rsidP="00221283">
+      <ns0:pPr>
+        <ns0:pStyle ns0:val="Paragraphedeliste"/>
+        <ns0:numPr>
+          <ns0:ilvl ns0:val="0"/>
+          <ns0:numId ns0:val="7"/>
+        </ns0:numPr>
+        <ns0:spacing ns0:after="0"/>
+        <ns0:ind ns0:left="1068" ns0:right="-337"/>
+        <ns0:jc ns0:val="both"/>
+        <ns0:rPr>
+          <ns0:color ns0:val="002060"/>
+          <ns0:lang ns0:val="de-CH"/>
+        </ns0:rPr>
+      </ns0:pPr>
+      <ns0:proofErr ns0:type="spellStart"/>
+      <ns0:proofErr ns0:type="spellEnd"/>
+      <ns0:proofErr ns0:type="spellStart"/>
+      <ns0:proofErr ns0:type="spellEnd"/>
+      <ns0:r>
+        <ns0:t>Catalog, discovery and governed access to data assets</ns0:t>
+      </ns0:r>
+    </ns0:p>
+    <ns0:p ns2:paraId="4FF2DE45" ns2:textId="560A55F1" ns0:rsidR="00221283" ns0:rsidRPr="005152C2" ns0:rsidRDefault="0065673B" ns0:rsidP="00221283">
+      <ns0:pPr>
+        <ns0:pStyle ns0:val="Paragraphedeliste"/>
+        <ns0:numPr>
+          <ns0:ilvl ns0:val="0"/>
+          <ns0:numId ns0:val="7"/>
+        </ns0:numPr>
+        <ns0:spacing ns0:after="0"/>
+        <ns0:ind ns0:left="1068" ns0:right="-337"/>
+        <ns0:jc ns0:val="both"/>
+        <ns0:rPr>
+          <ns0:color ns0:val="002060"/>
+          <ns0:lang ns0:val="de-CH"/>
+        </ns0:rPr>
+      </ns0:pPr>
+      <ns0:proofErr ns0:type="spellStart"/>
+      <ns0:proofErr ns0:type="spellEnd"/>
+      <ns0:proofErr ns0:type="spellStart"/>
+      <ns0:proofErr ns0:type="spellEnd"/>
+      <ns0:r>
+        <ns0:t>Interactive drill and aggregation paths for business users</ns0:t>
+      </ns0:r>
+    </ns0:p>
+    <ns0:p ns2:paraId="4FF2DE45" ns2:textId="560A55F1" ns0:rsidR="00221283" ns0:rsidRPr="005152C2" ns0:rsidRDefault="0065673B" ns0:rsidP="00221283">
+      <ns0:pPr>
+        <ns0:pStyle ns0:val="Paragraphedeliste"/>
+        <ns0:numPr>
+          <ns0:ilvl ns0:val="0"/>
+          <ns0:numId ns0:val="7"/>
+        </ns0:numPr>
+        <ns0:spacing ns0:after="0"/>
+        <ns0:ind ns0:left="1068" ns0:right="-337"/>
+        <ns0:jc ns0:val="both"/>
+        <ns0:rPr>
+          <ns0:color ns0:val="002060"/>
+          <ns0:lang ns0:val="de-CH"/>
+        </ns0:rPr>
+      </ns0:pPr>
+      <ns0:proofErr ns0:type="spellStart"/>
+      <ns0:proofErr ns0:type="spellEnd"/>
+      <ns0:proofErr ns0:type="spellStart"/>
+      <ns0:proofErr ns0:type="spellEnd"/>
+      <ns0:r>
+        <ns0:t>Correct treatment of non-additive metrics such as VaR</ns0:t>
+      </ns0:r>
+    </ns0:p>
+    <ns0:p ns2:paraId="4FF2DE45" ns2:textId="560A55F1" ns0:rsidR="00221283" ns0:rsidRPr="005152C2" ns0:rsidRDefault="0065673B" ns0:rsidP="00221283">
+      <ns0:pPr>
+        <ns0:pStyle ns0:val="Paragraphedeliste"/>
+        <ns0:numPr>
+          <ns0:ilvl ns0:val="0"/>
+          <ns0:numId ns0:val="7"/>
+        </ns0:numPr>
+        <ns0:spacing ns0:after="0"/>
+        <ns0:ind ns0:left="1068" ns0:right="-337"/>
+        <ns0:jc ns0:val="both"/>
+        <ns0:rPr>
+          <ns0:color ns0:val="002060"/>
+          <ns0:lang ns0:val="de-CH"/>
+        </ns0:rPr>
+      </ns0:pPr>
+      <ns0:proofErr ns0:type="spellStart"/>
+      <ns0:proofErr ns0:type="spellEnd"/>
+      <ns0:proofErr ns0:type="spellStart"/>
+      <ns0:proofErr ns0:type="spellEnd"/>
+      <ns0:r>
+        <ns0:t>Reusable developer platforms and CI/CD templates</ns0:t>
+      </ns0:r>
+    </ns0:p>
+    <ns0:p ns2:paraId="4FF2DE45" ns2:textId="560A55F1" ns0:rsidR="00221283" ns0:rsidRPr="005152C2" ns0:rsidRDefault="0065673B" ns0:rsidP="00221283">
+      <ns0:pPr>
+        <ns0:pStyle ns0:val="Paragraphedeliste"/>
+        <ns0:numPr>
+          <ns0:ilvl ns0:val="0"/>
+          <ns0:numId ns0:val="7"/>
+        </ns0:numPr>
+        <ns0:spacing ns0:after="0"/>
+        <ns0:ind ns0:left="1068" ns0:right="-337"/>
+        <ns0:jc ns0:val="both"/>
+        <ns0:rPr>
+          <ns0:color ns0:val="002060"/>
+          <ns0:lang ns0:val="de-CH"/>
+        </ns0:rPr>
+      </ns0:pPr>
+      <ns0:proofErr ns0:type="spellStart"/>
+      <ns0:proofErr ns0:type="spellEnd"/>
+      <ns0:proofErr ns0:type="spellStart"/>
+      <ns0:proofErr ns0:type="spellEnd"/>
+      <ns0:r>
+        <ns0:t>Hybrid and cross-cloud operating models</ns0:t>
+      </ns0:r>
+    </ns0:p>
+    <ns0:p ns2:paraId="4FF2DE45" ns2:textId="560A55F1" ns0:rsidR="00221283" ns0:rsidRPr="005152C2" ns0:rsidRDefault="0065673B" ns0:rsidP="00221283">
+      <ns0:pPr>
+        <ns0:pStyle ns0:val="Paragraphedeliste"/>
+        <ns0:numPr>
+          <ns0:ilvl ns0:val="0"/>
+          <ns0:numId ns0:val="7"/>
+        </ns0:numPr>
+        <ns0:spacing ns0:after="0"/>
+        <ns0:ind ns0:left="1068" ns0:right="-337"/>
+        <ns0:jc ns0:val="both"/>
+        <ns0:rPr>
+          <ns0:color ns0:val="002060"/>
+          <ns0:lang ns0:val="de-CH"/>
+        </ns0:rPr>
+      </ns0:pPr>
+      <ns0:proofErr ns0:type="spellStart"/>
+      <ns0:proofErr ns0:type="spellEnd"/>
+      <ns0:proofErr ns0:type="spellStart"/>
+      <ns0:proofErr ns0:type="spellEnd"/>
+      <ns0:r>
+        <ns0:t>Cost-aware runtime design and scale-to-zero instincts</ns0:t>
+      </ns0:r>
+    </ns0:p>
+    <ns0:p ns2:paraId="31403CF2" ns2:textId="77777777" ns0:rsidR="00345433" ns0:rsidRDefault="00345433" ns0:rsidP="00345433">
+      <ns0:pPr>
+        <ns0:spacing ns0:before="240"/>
+        <ns0:ind ns0:left="426" ns0:right="-337"/>
+        <ns0:rPr>
+          <ns0:b/>
+          <ns0:bCs/>
+          <ns0:color ns0:val="00B8A2"/>
+        </ns0:rPr>
+        <ns0:sectPr ns0:rsidR="00345433">
+          <ns0:footerReference ns0:type="even" ns10:id="rId12"/>
+          <ns0:footerReference ns0:type="default" ns10:id="rId13"/>
+          <ns0:pgSz ns0:w="11910" ns0:h="16840"/>
+          <ns0:pgMar ns0:top="357" ns0:right="1021" ns0:bottom="816" ns0:left="170" ns0:header="1701" ns0:footer="1247" ns0:gutter="0"/>
+          <ns0:cols ns0:space="708"/>
+          <ns0:docGrid ns0:linePitch="299"/>
+        </ns0:sectPr>
       </ns0:pPr>
     </ns0:p>
     <ns0:sectPr ns0:rsidR="008B2185" ns0:rsidSect="00345433">

</xml_diff>

<commit_message>
Complete CV adaptation from source content
Co-authored-by: mngenius <6729397+mngenius@users.noreply.github.com>
</commit_message>
<xml_diff>
--- a/CV-QIM-Amin LEBSIR-TOTSA-EN.docx
+++ b/CV-QIM-Amin LEBSIR-TOTSA-EN.docx
@@ -653,14 +653,8 @@
           <ns0:lang ns0:val="en-US"/>
         </ns0:rPr>
       </ns0:pPr>
-      <ns0:proofErr ns0:type="spellStart"/>
-      <ns0:proofErr ns0:type="spellEnd"/>
-      <ns0:r ns0:rsidRPr="005152C2">
-        <ns0:rPr>
-          <ns0:color ns0:val="002060"/>
-          <ns0:lang ns0:val="en-US"/>
-        </ns0:rPr>
-        <ns0:t>Data engineering and platform leader with 16 years of overall experience, including 11 years in trading environments across capital markets and energy commodities. I deliver AWS, Databricks and PySpark data platforms end to end, combining run ownership, automation and close collaboration with business and technical stakeholders.</ns0:t>
+      <ns0:r>
+        <ns0:t>Data engineering and platform leader with 16 years of overall experience, including 11 years across capital-markets and energy-trading environments. I design and run AWS, Databricks and PySpark data platforms end to end — from business-facing modelling and governed data products to run support, incident automation and industrialised delivery.</ns0:t>
       </ns0:r>
     </ns0:p>
     <ns0:p ns2:paraId="31403CF2" ns2:textId="77777777" ns0:rsidR="00345433" ns0:rsidRDefault="00345433" ns0:rsidP="00345433">
@@ -749,10 +743,8 @@
           <ns0:lang ns0:val="en-US"/>
         </ns0:rPr>
       </ns0:pPr>
-      <ns0:proofErr ns0:type="spellStart"/>
-      <ns0:proofErr ns0:type="spellEnd"/>
       <ns0:r>
-        <ns0:t>Focus : AWS, Azure, Spark, Java, Python</ns0:t>
+        <ns0:t>Focus : Energy trading, AWS, Databricks, Spark, Java, Python</ns0:t>
       </ns0:r>
     </ns0:p>
     <ns0:p ns2:paraId="31403CF2" ns2:textId="77777777" ns0:rsidR="00345433" ns0:rsidRDefault="00345433" ns0:rsidP="00345433">
@@ -773,6 +765,9 @@
           <ns0:docGrid ns0:linePitch="299"/>
         </ns0:sectPr>
       </ns0:pPr>
+      <ns0:r>
+        <ns0:t>Strengths : Run ownership, stakeholder communication, automation</ns0:t>
+      </ns0:r>
     </ns0:p>
     <ns0:p ns2:paraId="4678C4CE" ns2:textId="77777777" ns0:rsidR="005152C2" ns0:rsidRDefault="005152C2">
       <ns0:pPr>
@@ -788,6 +783,7 @@
           <ns0:szCs ns0:val="32"/>
         </ns0:rPr>
       </ns0:pPr>
+      <ns0:r/>
     </ns0:p>
     <ns0:p ns2:paraId="28B769CF" ns2:textId="40924548" ns0:rsidR="008B2185" ns0:rsidRDefault="00194A50">
       <ns0:pPr>
@@ -856,6 +852,7 @@
           <ns0:docGrid ns0:linePitch="299"/>
         </ns0:sectPr>
       </ns0:pPr>
+      <ns0:r/>
     </ns0:p>
     <ns0:p ns2:paraId="0163DFAA" ns2:textId="4AD893A7" ns0:rsidR="0065673B" ns0:rsidRPr="0065673B" ns0:rsidRDefault="0065673B" ns0:rsidP="0065673B">
       <ns0:pPr>
@@ -868,12 +865,7 @@
           <ns0:color ns0:val="00B8A2"/>
         </ns0:rPr>
       </ns0:pPr>
-      <ns0:r ns0:rsidRPr="0065673B">
-        <ns0:rPr>
-          <ns0:b/>
-          <ns0:bCs/>
-          <ns0:color ns0:val="00B8A2"/>
-        </ns0:rPr>
+      <ns0:r>
         <ns0:t>Main skills :</ns0:t>
       </ns0:r>
     </ns0:p>
@@ -892,15 +884,7 @@
           <ns0:lang ns0:val="de-CH"/>
         </ns0:rPr>
       </ns0:pPr>
-      <ns0:proofErr ns0:type="spellStart"/>
-      <ns0:proofErr ns0:type="spellEnd"/>
-      <ns0:proofErr ns0:type="spellStart"/>
-      <ns0:proofErr ns0:type="spellEnd"/>
-      <ns0:r ns0:rsidRPr="005152C2">
-        <ns0:rPr>
-          <ns0:color ns0:val="002060"/>
-          <ns0:lang ns0:val="de-CH"/>
-        </ns0:rPr>
+      <ns0:r>
         <ns0:t>Apache Spark, PySpark, Databricks, AWS, Azure, Kubernetes, Python, Java, Kafka.</ns0:t>
       </ns0:r>
     </ns0:p>
@@ -915,31 +899,8 @@
           <ns0:color ns0:val="00B8A2"/>
         </ns0:rPr>
       </ns0:pPr>
-      <ns0:r ns0:rsidRPr="0065673B">
-        <ns0:rPr>
-          <ns0:b/>
-          <ns0:bCs/>
-          <ns0:color ns0:val="00B8A2"/>
-        </ns0:rPr>
-        <ns0:t xml:space="preserve">Data &amp; </ns0:t>
-      </ns0:r>
-      <ns0:proofErr ns0:type="spellStart"/>
-      <ns0:r ns0:rsidRPr="0065673B">
-        <ns0:rPr>
-          <ns0:b/>
-          <ns0:bCs/>
-          <ns0:color ns0:val="00B8A2"/>
-        </ns0:rPr>
-        <ns0:t>lakehouse</ns0:t>
-      </ns0:r>
-      <ns0:proofErr ns0:type="spellEnd"/>
-      <ns0:r ns0:rsidRPr="0065673B">
-        <ns0:rPr>
-          <ns0:b/>
-          <ns0:bCs/>
-          <ns0:color ns0:val="00B8A2"/>
-        </ns0:rPr>
-        <ns0:t xml:space="preserve"> :</ns0:t>
+      <ns0:r>
+        <ns0:t>Data &amp; lakehouse :</ns0:t>
       </ns0:r>
     </ns0:p>
     <ns0:p ns2:paraId="5A76CEFC" ns2:textId="77777777" ns0:rsidR="00221283" ns0:rsidRPr="005152C2" ns0:rsidRDefault="0065673B" ns0:rsidP="00221283">
@@ -957,11 +918,7 @@
           <ns0:lang ns0:val="en-US"/>
         </ns0:rPr>
       </ns0:pPr>
-      <ns0:r ns0:rsidRPr="005152C2">
-        <ns0:rPr>
-          <ns0:color ns0:val="002060"/>
-          <ns0:lang ns0:val="en-US"/>
-        </ns0:rPr>
+      <ns0:r>
         <ns0:t>Apache Spark, PySpark, Iceberg, Parquet, Athena, Glue, Databricks, Delta Lake, SQL.</ns0:t>
       </ns0:r>
     </ns0:p>
@@ -976,12 +933,7 @@
           <ns0:color ns0:val="00B8A2"/>
         </ns0:rPr>
       </ns0:pPr>
-      <ns0:r ns0:rsidRPr="0065673B">
-        <ns0:rPr>
-          <ns0:b/>
-          <ns0:bCs/>
-          <ns0:color ns0:val="00B8A2"/>
-        </ns0:rPr>
+      <ns0:r>
         <ns0:t>Cloud &amp; platform :</ns0:t>
       </ns0:r>
     </ns0:p>
@@ -999,11 +951,8 @@
           <ns0:color ns0:val="002060"/>
         </ns0:rPr>
       </ns0:pPr>
-      <ns0:r ns0:rsidRPr="0065673B">
-        <ns0:rPr>
-          <ns0:color ns0:val="002060"/>
-        </ns0:rPr>
-        <ns0:t>AWS, Azure, Kubernetes, AKS, Docker, Terraform, GitHub Actions.</ns0:t>
+      <ns0:r>
+        <ns0:t>AWS, Azure, Kubernetes, AKS, Docker, Terraform, Splunk, GitHub Actions.</ns0:t>
       </ns0:r>
     </ns0:p>
     <ns0:p ns2:paraId="3BD85184" ns2:textId="77777777" ns0:rsidR="0065673B" ns0:rsidRPr="0065673B" ns0:rsidRDefault="0065673B" ns0:rsidP="0065673B">
@@ -1017,12 +966,7 @@
           <ns0:color ns0:val="00B8A2"/>
         </ns0:rPr>
       </ns0:pPr>
-      <ns0:r ns0:rsidRPr="0065673B">
-        <ns0:rPr>
-          <ns0:b/>
-          <ns0:bCs/>
-          <ns0:color ns0:val="00B8A2"/>
-        </ns0:rPr>
+      <ns0:r>
         <ns0:t>Backend &amp; delivery :</ns0:t>
       </ns0:r>
     </ns0:p>
@@ -1040,10 +984,7 @@
           <ns0:color ns0:val="002060"/>
         </ns0:rPr>
       </ns0:pPr>
-      <ns0:r ns0:rsidRPr="0065673B">
-        <ns0:rPr>
-          <ns0:color ns0:val="002060"/>
-        </ns0:rPr>
+      <ns0:r>
         <ns0:t>Java, Spring Boot, Python, Scala, Kafka, Event Hubs, PostgreSQL, CI/CD.</ns0:t>
       </ns0:r>
     </ns0:p>
@@ -1063,9 +1004,13 @@
           <ns0:docGrid ns0:linePitch="299"/>
         </ns0:sectPr>
       </ns0:pPr>
+      <ns0:r>
+        <ns0:t>Markets &amp; risk domain :</ns0:t>
+      </ns0:r>
     </ns0:p>
     <ns0:p ns2:paraId="7F4EEB6F" ns2:textId="77777777" ns0:rsidR="00345433" ns0:rsidRDefault="00345433">
       <ns0:pPr>
+        <ns0:pStyle ns0:val="Paragraphedeliste"/>
         <ns0:pBdr>
           <ns0:bottom ns0:val="single" ns0:sz="4" ns0:space="8" ns0:color="auto"/>
         </ns0:pBdr>
@@ -1078,6 +1023,9 @@
           <ns0:szCs ns0:val="32"/>
         </ns0:rPr>
       </ns0:pPr>
+      <ns0:r>
+        <ns0:t>Energy trading, commodities, market risk, counterparty risk, VaR, Greeks, Explain, PnL, FRTB, trade capture, position management.</ns0:t>
+      </ns0:r>
     </ns0:p>
     <ns0:p ns2:paraId="0D95428C" ns2:textId="4D9305C7" ns0:rsidR="008B2185" ns0:rsidRDefault="00F2442C">
       <ns0:pPr>
@@ -1291,6 +1239,7 @@
         </ns0:tabs>
         <ns0:spacing ns0:after="0"/>
       </ns0:pPr>
+      <ns0:r/>
     </ns0:p>
     <ns0:p ns2:paraId="2B09B15C" ns2:textId="77777777" ns0:rsidR="008B2185" ns0:rsidRDefault="008B2185">
       <ns0:pPr>
@@ -1300,6 +1249,7 @@
           <ns0:color ns0:val="1C2E5A"/>
         </ns0:rPr>
       </ns0:pPr>
+      <ns0:r/>
     </ns0:p>
     <ns0:p ns2:paraId="63D67AAF" ns2:textId="1C9213AE" ns0:rsidR="008B2185" ns0:rsidRDefault="00F2442C">
       <ns0:pPr>
@@ -1309,16 +1259,7 @@
           <ns0:color ns0:val="1C2E5A"/>
         </ns0:rPr>
       </ns0:pPr>
-      <ns0:r>
-        <ns0:rPr>
-          <ns0:b/>
-          <ns0:bCs/>
-          <ns0:color ns0:val="1C2E5A"/>
-          <ns0:sz ns0:val="32"/>
-          <ns0:szCs ns0:val="32"/>
-        </ns0:rPr>
-        <ns0:br ns0:type="page"/>
-      </ns0:r>
+      <ns0:r/>
     </ns0:p>
     <ns0:p ns2:paraId="4FF1F7D1" ns2:textId="1FCB8EFD" ns0:rsidR="008B2185" ns0:rsidRPr="004A713D" ns0:rsidRDefault="00F2442C" ns0:rsidP="004A713D">
       <ns0:pPr>
@@ -1395,22 +1336,9 @@
             <ns0:shd ns0:val="clear" ns0:color="auto" ns0:fill="F2F2F2" ns0:themeFill="background2" ns0:themeFillShade="F2"/>
             <ns0:vAlign ns0:val="center"/>
           </ns0:tcPr>
-          <ns0:p ns2:paraId="4A80B24E" ns2:textId="0F1C1B69" ns0:rsidR="00BC6829" ns0:rsidRDefault="00BC6829" ns0:rsidP="00BC6829">
-            <ns0:pPr>
-              <ns0:ind ns0:right="-112"/>
-              <ns0:rPr>
-                <ns0:b/>
-                <ns0:bCs/>
-                <ns0:color ns0:val="00B8A2"/>
-              </ns0:rPr>
-            </ns0:pPr>
-            <ns0:r ns0:rsidRPr="000C0081">
-              <ns0:rPr>
-                <ns0:b/>
-                <ns0:bCs/>
-                <ns0:color ns0:val="00B8A2"/>
-              </ns0:rPr>
-              <ns0:t>09.2025 – Present</ns0:t>
+          <ns0:p>
+            <ns0:r>
+              <ns0:t>09.2026 – Present</ns0:t>
             </ns0:r>
           </ns0:p>
         </ns0:tc>
@@ -1420,22 +1348,9 @@
             <ns0:shd ns0:val="clear" ns0:color="auto" ns0:fill="F2F2F2" ns0:themeFill="background2" ns0:themeFillShade="F2"/>
             <ns0:vAlign ns0:val="center"/>
           </ns0:tcPr>
-          <ns0:p ns2:paraId="46452FAE" ns2:textId="7B54577B" ns0:rsidR="00BC6829" ns0:rsidRDefault="00BC6829" ns0:rsidP="00BC6829">
-            <ns0:pPr>
-              <ns0:ind ns0:right="-337"/>
-              <ns0:rPr>
-                <ns0:b/>
-                <ns0:bCs/>
-                <ns0:color ns0:val="00B8A2"/>
-              </ns0:rPr>
-            </ns0:pPr>
+          <ns0:p>
             <ns0:r>
-              <ns0:rPr>
-                <ns0:b/>
-                <ns0:bCs/>
-                <ns0:color ns0:val="00B8A2"/>
-              </ns0:rPr>
-              <ns0:t>Engie Global Markets</ns0:t>
+              <ns0:t>ENGIE Global Markets</ns0:t>
             </ns0:r>
           </ns0:p>
         </ns0:tc>
@@ -1445,237 +1360,74 @@
           <ns0:tcPr>
             <ns0:tcW ns0:w="1984" ns0:type="dxa"/>
           </ns0:tcPr>
-          <ns0:p ns2:paraId="0FC1EBC5" ns2:textId="77777777" ns0:rsidR="00CB7AB4" ns0:rsidRDefault="00CB7AB4">
-            <ns0:pPr>
-              <ns0:ind ns0:right="-337"/>
-              <ns0:rPr>
-                <ns0:b/>
-                <ns0:bCs/>
-                <ns0:color ns0:val="00B8A2"/>
-              </ns0:rPr>
-            </ns0:pPr>
+          <ns0:p>
+            <ns0:r/>
           </ns0:p>
         </ns0:tc>
         <ns0:tc>
           <ns0:tcPr>
             <ns0:tcW ns0:w="8309" ns0:type="dxa"/>
           </ns0:tcPr>
-          <ns0:p ns2:paraId="1D7E9C51" ns2:textId="1278E7AC" ns0:rsidR="00CB7AB4" ns0:rsidRPr="005152C2" ns0:rsidRDefault="004A713D">
-            <ns0:pPr>
-              <ns0:spacing ns0:before="120" ns0:after="60"/>
-              <ns0:ind ns0:right="112"/>
-              <ns0:jc ns0:val="both"/>
-              <ns0:rPr>
-                <ns0:rFonts ns0:eastAsiaTheme="minorHAnsi"/>
-                <ns0:b/>
-                <ns0:color ns0:val="1C2E5A"/>
-                <ns0:szCs ns0:val="22"/>
-                <ns0:lang ns0:val="en-US" ns0:eastAsia="en-US"/>
-              </ns0:rPr>
-            </ns0:pPr>
-            <ns0:r ns0:rsidRPr="005152C2">
-              <ns0:rPr>
-                <ns0:rFonts ns0:eastAsiaTheme="minorHAnsi"/>
-                <ns0:b/>
-                <ns0:color ns0:val="1C2E5A"/>
-                <ns0:szCs ns0:val="22"/>
-                <ns0:lang ns0:val="en-US" ns0:eastAsia="en-US"/>
-              </ns0:rPr>
+          <ns0:p>
+            <ns0:pPr/>
+            <ns0:r>
               <ns0:t>Data Lead / Cloud Data Lead</ns0:t>
             </ns0:r>
           </ns0:p>
-          <ns0:p ns2:paraId="6C382583" ns2:textId="7020E00F" ns0:rsidR="004A713D" ns0:rsidRPr="005152C2" ns0:rsidRDefault="004A713D" ns0:rsidP="004A713D">
-            <ns0:pPr>
-              <ns0:spacing ns0:before="60" ns0:after="60"/>
-              <ns0:ind ns0:right="112"/>
-              <ns0:jc ns0:val="both"/>
-              <ns0:rPr>
-                <ns0:rFonts ns0:eastAsiaTheme="minorHAnsi"/>
-                <ns0:i/>
-                <ns0:color ns0:val="1C2E5A"/>
-                <ns0:lang ns0:val="en-US" ns0:eastAsia="en-US"/>
-              </ns0:rPr>
-            </ns0:pPr>
-            <ns0:r ns0:rsidRPr="005152C2">
-              <ns0:rPr>
-                <ns0:rFonts ns0:eastAsiaTheme="minorHAnsi"/>
-                <ns0:i/>
-                <ns0:color ns0:val="1C2E5A"/>
-                <ns0:lang ns0:val="en-US" ns0:eastAsia="en-US"/>
-              </ns0:rPr>
+          <ns0:p>
+            <ns0:pPr/>
+            <ns0:r>
               <ns0:t>Energy trading risk platform migration to AWS</ns0:t>
             </ns0:r>
           </ns0:p>
-          <ns0:p ns2:paraId="41040F1F" ns2:textId="77777777" ns0:rsidR="004A713D" ns0:rsidRPr="005152C2" ns0:rsidRDefault="004A713D" ns0:rsidP="004A713D">
+          <ns0:p>
             <ns0:pPr>
               <ns0:pStyle ns0:val="Paragraphedeliste"/>
-              <ns0:numPr>
-                <ns0:ilvl ns0:val="0"/>
-                <ns0:numId ns0:val="8"/>
-              </ns0:numPr>
-              <ns0:spacing ns0:before="120" ns0:after="60"/>
-              <ns0:ind ns0:left="709" ns0:right="112"/>
-              <ns0:rPr>
-                <ns0:rFonts ns0:ascii="Roboto Light" ns0:hAnsi="Roboto Light"/>
-                <ns0:bCs/>
-                <ns0:lang ns0:val="en-US"/>
-              </ns0:rPr>
             </ns0:pPr>
-            <ns0:r ns0:rsidRPr="005152C2">
-              <ns0:rPr>
-                <ns0:rFonts ns0:ascii="Roboto Light" ns0:hAnsi="Roboto Light" ns0:hint="cs"/>
-                <ns0:bCs/>
-                <ns0:lang ns0:val="en-US"/>
-              </ns0:rPr>
-              <ns0:t>Led migration of legacy production risk and PnL indicators from OLAP and CSV-based flows to an AWS-native platform within an energy trading environment.</ns0:t>
+            <ns0:r>
+              <ns0:t>Context: migration of legacy VaR, Greeks, CFFO, Explain and PnL production flows from Atoti/CSV processes to an AWS-native data platform.</ns0:t>
             </ns0:r>
           </ns0:p>
-          <ns0:p ns2:paraId="7F539C64" ns2:textId="77777777" ns0:rsidR="004A713D" ns0:rsidRPr="005152C2" ns0:rsidRDefault="004A713D" ns0:rsidP="004A713D">
+          <ns0:p>
             <ns0:pPr>
               <ns0:pStyle ns0:val="Paragraphedeliste"/>
-              <ns0:numPr>
-                <ns0:ilvl ns0:val="0"/>
-                <ns0:numId ns0:val="8"/>
-              </ns0:numPr>
-              <ns0:spacing ns0:before="120" ns0:after="60"/>
-              <ns0:ind ns0:left="709" ns0:right="112"/>
-              <ns0:rPr>
-                <ns0:rFonts ns0:ascii="Roboto Light" ns0:hAnsi="Roboto Light"/>
-                <ns0:bCs/>
-                <ns0:lang ns0:val="en-US"/>
-              </ns0:rPr>
             </ns0:pPr>
-            <ns0:proofErr ns0:type="spellStart"/>
-            <ns0:proofErr ns0:type="spellEnd"/>
-            <ns0:r ns0:rsidRPr="005152C2">
-              <ns0:rPr>
-                <ns0:rFonts ns0:ascii="Roboto Light" ns0:hAnsi="Roboto Light" ns0:hint="cs"/>
-                <ns0:bCs/>
-                <ns0:lang ns0:val="en-US"/>
-              </ns0:rPr>
-              <ns0:t>Designed S3, Lambda, Glue, Databricks and EventBridge patterns for event-driven ingestion, PySpark processing, monitoring and operational support.</ns0:t>
+            <ns0:r>
+              <ns0:t>Designed and delivered an event-driven AWS architecture with S3 events, Lambda dispatch, Glue/Spark processing and Splunk-based observability.</ns0:t>
             </ns0:r>
           </ns0:p>
-          <ns0:p ns2:paraId="45A3A888" ns2:textId="77777777" ns0:rsidR="004A713D" ns0:rsidRPr="005152C2" ns0:rsidRDefault="004A713D" ns0:rsidP="004A713D">
+          <ns0:p>
             <ns0:pPr>
               <ns0:pStyle ns0:val="Paragraphedeliste"/>
-              <ns0:numPr>
-                <ns0:ilvl ns0:val="0"/>
-                <ns0:numId ns0:val="8"/>
-              </ns0:numPr>
-              <ns0:spacing ns0:before="120" ns0:after="60"/>
-              <ns0:ind ns0:left="709" ns0:right="112"/>
-              <ns0:rPr>
-                <ns0:rFonts ns0:ascii="Roboto Light" ns0:hAnsi="Roboto Light"/>
-                <ns0:bCs/>
-                <ns0:lang ns0:val="en-US"/>
-              </ns0:rPr>
             </ns0:pPr>
-            <ns0:proofErr ns0:type="spellStart"/>
-            <ns0:proofErr ns0:type="spellEnd"/>
-            <ns0:proofErr ns0:type="gramStart"/>
-            <ns0:proofErr ns0:type="gramEnd"/>
-            <ns0:r ns0:rsidRPr="005152C2">
-              <ns0:rPr>
-                <ns0:rFonts ns0:ascii="Roboto Light" ns0:hAnsi="Roboto Light" ns0:hint="cs"/>
-                <ns0:bCs/>
-                <ns0:lang ns0:val="en-US"/>
-              </ns0:rPr>
-              <ns0:t>Built a no-code platform that serialises business designs to JSON and executes them on Spark and Spark SQL, reducing manual interventions and accelerating onboarding.</ns0:t>
+            <ns0:r>
+              <ns0:t>Built a no-code platform for business analysts and users: drag-and-drop design translated into Spark or Spark SQL, serialised as JSON and executed industrially through Lambda/Glue.</ns0:t>
             </ns0:r>
           </ns0:p>
-          <ns0:p ns2:paraId="32853B27" ns2:textId="77777777" ns0:rsidR="004A713D" ns0:rsidRPr="005152C2" ns0:rsidRDefault="004A713D" ns0:rsidP="004A713D">
+          <ns0:p>
             <ns0:pPr>
               <ns0:pStyle ns0:val="Paragraphedeliste"/>
-              <ns0:numPr>
-                <ns0:ilvl ns0:val="0"/>
-                <ns0:numId ns0:val="8"/>
-              </ns0:numPr>
-              <ns0:spacing ns0:before="120" ns0:after="60"/>
-              <ns0:ind ns0:left="709" ns0:right="112"/>
-              <ns0:rPr>
-                <ns0:rFonts ns0:ascii="Roboto Light" ns0:hAnsi="Roboto Light"/>
-                <ns0:bCs/>
-                <ns0:lang ns0:val="en-US"/>
-              </ns0:rPr>
             </ns0:pPr>
-            <ns0:r ns0:rsidRPr="005152C2">
-              <ns0:rPr>
-                <ns0:rFonts ns0:ascii="Roboto Light" ns0:hAnsi="Roboto Light" ns0:hint="cs"/>
-                <ns0:bCs/>
-                <ns0:lang ns0:val="en-US"/>
-              </ns0:rPr>
-              <ns0:t>Partnered with business and technical teams, handled run incidents and improved end-to-end tracking across AWS and Azure components through automation.</ns0:t>
+            <ns0:r>
+              <ns0:t>Implemented hierarchy tracking, end-to-end monitoring and cross-cloud communication between AWS and Azure components to improve run support and traceability.</ns0:t>
             </ns0:r>
           </ns0:p>
-          <ns0:p ns2:paraId="640FCAF3" ns2:textId="1D59C631" ns0:rsidR="00CB7AB4" ns0:rsidRPr="005152C2" ns0:rsidRDefault="00CB7AB4" ns0:rsidP="00B77CB8">
+          <ns0:p>
             <ns0:pPr>
-              <ns0:spacing ns0:before="120" ns0:after="60"/>
-              <ns0:ind ns0:left="349" ns0:right="112"/>
-              <ns0:jc ns0:val="both"/>
-              <ns0:rPr>
-                <ns0:rFonts ns0:ascii="Roboto Light" ns0:hAnsi="Roboto Light"/>
-                <ns0:lang ns0:val="en-US"/>
-              </ns0:rPr>
+              <ns0:pStyle ns0:val="Paragraphedeliste"/>
             </ns0:pPr>
-          </ns0:p>
-          <ns0:p ns2:paraId="1BF09E00" ns2:textId="77777777" ns0:rsidR="004A713D" ns0:rsidRPr="005152C2" ns0:rsidRDefault="00F2442C" ns0:rsidP="004A713D">
-            <ns0:pPr>
-              <ns0:spacing ns0:before="60" ns0:after="60"/>
-              <ns0:ind ns0:right="112"/>
-              <ns0:jc ns0:val="both"/>
-              <ns0:rPr>
-                <ns0:rFonts ns0:eastAsiaTheme="minorHAnsi"/>
-                <ns0:i/>
-                <ns0:color ns0:val="262626" ns0:themeColor="text1" ns0:themeTint="D9"/>
-                <ns0:sz ns0:val="18"/>
-                <ns0:szCs ns0:val="18"/>
-                <ns0:lang ns0:val="en-US" ns0:eastAsia="en-US"/>
-              </ns0:rPr>
-            </ns0:pPr>
-            <ns0:proofErr ns0:type="gramStart"/>
-            <ns0:proofErr ns0:type="gramEnd"/>
-            <ns0:proofErr ns0:type="spellStart"/>
-            <ns0:proofErr ns0:type="spellEnd"/>
-            <ns0:r ns0:rsidRPr="005152C2">
-              <ns0:rPr>
-                <ns0:rFonts ns0:eastAsiaTheme="minorHAnsi"/>
-                <ns0:i/>
-                <ns0:color ns0:val="17AF9C"/>
-                <ns0:sz ns0:val="18"/>
-                <ns0:szCs ns0:val="22"/>
-                <ns0:lang ns0:val="en-US" ns0:eastAsia="en-US"/>
-              </ns0:rPr>
-              <ns0:t>Technologies : AWS, S3, Lambda, Glue, Databricks, EventBridge, PySpark, Spark SQL, Azure</ns0:t>
+            <ns0:r>
+              <ns0:t>Migrated calculated and post-processed data from Atoti/ActiveViam and ad-hoc treatments to the new AWS target platform.</ns0:t>
             </ns0:r>
           </ns0:p>
-          <ns0:p ns2:paraId="55D23834" ns2:textId="77777777" ns0:rsidR="00C1069F" ns0:rsidRPr="005152C2" ns0:rsidRDefault="00C1069F" ns0:rsidP="004A713D">
-            <ns0:pPr>
-              <ns0:spacing ns0:before="60" ns0:after="60"/>
-              <ns0:ind ns0:right="112"/>
-              <ns0:jc ns0:val="both"/>
-              <ns0:rPr>
-                <ns0:rFonts ns0:eastAsiaTheme="minorHAnsi"/>
-                <ns0:b/>
-                <ns0:bCs/>
-                <ns0:i/>
-                <ns0:color ns0:val="262626" ns0:themeColor="text1" ns0:themeTint="D9"/>
-                <ns0:sz ns0:val="18"/>
-                <ns0:szCs ns0:val="18"/>
-                <ns0:lang ns0:val="en-US" ns0:eastAsia="en-US"/>
-              </ns0:rPr>
-            </ns0:pPr>
-          </ns0:p>
-          <ns0:p ns2:paraId="3CEAC7F0" ns2:textId="77777777" ns0:rsidR="00CB7AB4" ns0:rsidRPr="005152C2" ns0:rsidRDefault="00CB7AB4">
-            <ns0:pPr>
-              <ns0:tabs>
-                <ns0:tab ns0:val="left" ns0:pos="6521"/>
-              </ns0:tabs>
-              <ns0:rPr>
-                <ns0:color ns0:val="1C2E5A"/>
-                <ns0:lang ns0:val="en-US"/>
-              </ns0:rPr>
-            </ns0:pPr>
+          <ns0:p>
+            <ns0:pPr/>
+          </ns0:p>
+          <ns0:p>
+            <ns0:pPr/>
+            <ns0:r>
+              <ns0:t>Technologies: AWS (S3, Lambda, Glue, EventBridge), Databricks, PySpark, Spark SQL, Splunk, Azure File Storage, Atoti/ActiveViam, Python, Java, JSON, CI/CD.</ns0:t>
+            </ns0:r>
           </ns0:p>
         </ns0:tc>
       </ns0:tr>
@@ -1689,22 +1441,9 @@
             <ns0:shd ns0:val="clear" ns0:color="auto" ns0:fill="F2F2F2" ns0:themeFill="background2" ns0:themeFillShade="F2"/>
             <ns0:vAlign ns0:val="center"/>
           </ns0:tcPr>
-          <ns0:p ns2:paraId="3C3B2787" ns2:textId="77777777" ns0:rsidR="00BC6829" ns0:rsidRDefault="00BC6829" ns0:rsidP="00BC6829">
-            <ns0:pPr>
-              <ns0:ind ns0:right="-112"/>
-              <ns0:rPr>
-                <ns0:b/>
-                <ns0:bCs/>
-                <ns0:color ns0:val="00B8A2"/>
-              </ns0:rPr>
-            </ns0:pPr>
-            <ns0:r ns0:rsidRPr="000C0081">
-              <ns0:rPr>
-                <ns0:b/>
-                <ns0:bCs/>
-                <ns0:color ns0:val="00B8A2"/>
-              </ns0:rPr>
-              <ns0:t>10.2022 – 12.2025</ns0:t>
+          <ns0:p>
+            <ns0:r>
+              <ns0:t>10.2022 – 03.2026</ns0:t>
             </ns0:r>
           </ns0:p>
         </ns0:tc>
@@ -1714,21 +1453,8 @@
             <ns0:shd ns0:val="clear" ns0:color="auto" ns0:fill="F2F2F2" ns0:themeFill="background2" ns0:themeFillShade="F2"/>
             <ns0:vAlign ns0:val="center"/>
           </ns0:tcPr>
-          <ns0:p ns2:paraId="44683026" ns2:textId="77777777" ns0:rsidR="00BC6829" ns0:rsidRDefault="00BC6829" ns0:rsidP="00BC6829">
-            <ns0:pPr>
-              <ns0:ind ns0:right="-337"/>
-              <ns0:rPr>
-                <ns0:b/>
-                <ns0:bCs/>
-                <ns0:color ns0:val="00B8A2"/>
-              </ns0:rPr>
-            </ns0:pPr>
+          <ns0:p>
             <ns0:r>
-              <ns0:rPr>
-                <ns0:b/>
-                <ns0:bCs/>
-                <ns0:color ns0:val="00B8A2"/>
-              </ns0:rPr>
               <ns0:t>Société Générale Corporate &amp; Investment Banking</ns0:t>
             </ns0:r>
           </ns0:p>
@@ -1739,226 +1465,74 @@
           <ns0:tcPr>
             <ns0:tcW ns0:w="1984" ns0:type="dxa"/>
           </ns0:tcPr>
-          <ns0:p ns2:paraId="20B3B248" ns2:textId="77777777" ns0:rsidR="00CB7AB4" ns0:rsidRDefault="00CB7AB4">
-            <ns0:pPr>
-              <ns0:ind ns0:right="-337"/>
-              <ns0:rPr>
-                <ns0:b/>
-                <ns0:bCs/>
-                <ns0:color ns0:val="00B8A2"/>
-              </ns0:rPr>
-            </ns0:pPr>
+          <ns0:p>
+            <ns0:r/>
           </ns0:p>
         </ns0:tc>
         <ns0:tc>
           <ns0:tcPr>
             <ns0:tcW ns0:w="8309" ns0:type="dxa"/>
           </ns0:tcPr>
-          <ns0:p ns2:paraId="28CB4083" ns2:textId="77777777" ns0:rsidR="00CB7AB4" ns0:rsidRPr="005152C2" ns0:rsidRDefault="004A713D">
-            <ns0:pPr>
-              <ns0:spacing ns0:before="120" ns0:after="60"/>
-              <ns0:ind ns0:right="112"/>
-              <ns0:jc ns0:val="both"/>
-              <ns0:rPr>
-                <ns0:rFonts ns0:eastAsiaTheme="minorHAnsi"/>
-                <ns0:b/>
-                <ns0:color ns0:val="1C2E5A"/>
-                <ns0:szCs ns0:val="22"/>
-                <ns0:lang ns0:val="en-US" ns0:eastAsia="en-US"/>
-              </ns0:rPr>
-            </ns0:pPr>
-            <ns0:r ns0:rsidRPr="005152C2">
-              <ns0:rPr>
-                <ns0:rFonts ns0:eastAsiaTheme="minorHAnsi"/>
-                <ns0:b/>
-                <ns0:color ns0:val="1C2E5A"/>
-                <ns0:szCs ns0:val="22"/>
-                <ns0:lang ns0:val="en-US" ns0:eastAsia="en-US"/>
-              </ns0:rPr>
+          <ns0:p>
+            <ns0:pPr/>
+            <ns0:r>
               <ns0:t>Lead Developer / Data Platform Lead</ns0:t>
             </ns0:r>
           </ns0:p>
-          <ns0:p ns2:paraId="18769897" ns2:textId="77777777" ns0:rsidR="004A713D" ns0:rsidRPr="005152C2" ns0:rsidRDefault="004A713D" ns0:rsidP="004A713D">
-            <ns0:pPr>
-              <ns0:spacing ns0:before="60" ns0:after="60"/>
-              <ns0:ind ns0:right="112"/>
-              <ns0:jc ns0:val="both"/>
-              <ns0:rPr>
-                <ns0:rFonts ns0:eastAsiaTheme="minorHAnsi"/>
-                <ns0:i/>
-                <ns0:color ns0:val="1C2E5A"/>
-                <ns0:lang ns0:val="en-US" ns0:eastAsia="en-US"/>
-              </ns0:rPr>
-            </ns0:pPr>
-            <ns0:r ns0:rsidRPr="005152C2">
-              <ns0:rPr>
-                <ns0:rFonts ns0:eastAsiaTheme="minorHAnsi"/>
-                <ns0:i/>
-                <ns0:color ns0:val="1C2E5A"/>
-                <ns0:lang ns0:val="en-US" ns0:eastAsia="en-US"/>
-              </ns0:rPr>
-              <ns0:t>Fraud-control and analytics pipeline platform</ns0:t>
+          <ns0:p>
+            <ns0:pPr/>
+            <ns0:r>
+              <ns0:t>Fraud-control and analytics pipeline platform for trading operations</ns0:t>
             </ns0:r>
           </ns0:p>
-          <ns0:p ns2:paraId="18C898C6" ns2:textId="77777777" ns0:rsidR="004A713D" ns0:rsidRPr="005152C2" ns0:rsidRDefault="004A713D" ns0:rsidP="004A713D">
+          <ns0:p>
             <ns0:pPr>
               <ns0:pStyle ns0:val="Paragraphedeliste"/>
-              <ns0:numPr>
-                <ns0:ilvl ns0:val="0"/>
-                <ns0:numId ns0:val="8"/>
-              </ns0:numPr>
-              <ns0:spacing ns0:before="120" ns0:after="60"/>
-              <ns0:ind ns0:left="709" ns0:right="112"/>
-              <ns0:rPr>
-                <ns0:rFonts ns0:ascii="Roboto Light" ns0:hAnsi="Roboto Light"/>
-                <ns0:bCs/>
-                <ns0:lang ns0:val="en-US"/>
-              </ns0:rPr>
             </ns0:pPr>
-            <ns0:r ns0:rsidRPr="005152C2">
-              <ns0:rPr>
-                <ns0:rFonts ns0:ascii="Roboto Light" ns0:hAnsi="Roboto Light" ns0:hint="cs"/>
-                <ns0:bCs/>
-                <ns0:lang ns0:val="en-US"/>
-              </ns0:rPr>
-              <ns0:t>Built a Spark and PySpark ETL and execution framework for anti-fraud control designs and operational analytics.</ns0:t>
+            <ns0:r>
+              <ns0:t>Context: FOX manages anti-fraud controls for trading transactions; scope covered both control-design modelling and execution.</ns0:t>
             </ns0:r>
           </ns0:p>
-          <ns0:p ns2:paraId="62999515" ns2:textId="77777777" ns0:rsidR="004A713D" ns0:rsidRPr="005152C2" ns0:rsidRDefault="004A713D" ns0:rsidP="004A713D">
+          <ns0:p>
             <ns0:pPr>
               <ns0:pStyle ns0:val="Paragraphedeliste"/>
-              <ns0:numPr>
-                <ns0:ilvl ns0:val="0"/>
-                <ns0:numId ns0:val="8"/>
-              </ns0:numPr>
-              <ns0:spacing ns0:before="120" ns0:after="60"/>
-              <ns0:ind ns0:left="709" ns0:right="112"/>
-              <ns0:rPr>
-                <ns0:rFonts ns0:ascii="Roboto Light" ns0:hAnsi="Roboto Light"/>
-                <ns0:bCs/>
-                <ns0:lang ns0:val="en-US"/>
-              </ns0:rPr>
             </ns0:pPr>
-            <ns0:r ns0:rsidRPr="005152C2">
-              <ns0:rPr>
-                <ns0:rFonts ns0:ascii="Roboto Light" ns0:hAnsi="Roboto Light" ns0:hint="cs"/>
-                <ns0:bCs/>
-                <ns0:lang ns0:val="en-US"/>
-              </ns0:rPr>
-              <ns0:t>Developed an interpretation engine converting JSON directives into executable Spark logic.</ns0:t>
+            <ns0:r>
+              <ns0:t>Built a Spark/PySpark ETL and execution framework that translated JSON control directives into executable Spark logic.</ns0:t>
             </ns0:r>
           </ns0:p>
-          <ns0:p ns2:paraId="38F92677" ns2:textId="77777777" ns0:rsidR="004A713D" ns0:rsidRPr="005152C2" ns0:rsidRDefault="004A713D" ns0:rsidP="004A713D">
+          <ns0:p>
             <ns0:pPr>
               <ns0:pStyle ns0:val="Paragraphedeliste"/>
-              <ns0:numPr>
-                <ns0:ilvl ns0:val="0"/>
-                <ns0:numId ns0:val="8"/>
-              </ns0:numPr>
-              <ns0:spacing ns0:before="120" ns0:after="60"/>
-              <ns0:ind ns0:left="709" ns0:right="112"/>
-              <ns0:rPr>
-                <ns0:rFonts ns0:ascii="Roboto Light" ns0:hAnsi="Roboto Light"/>
-                <ns0:bCs/>
-                <ns0:lang ns0:val="en-US"/>
-              </ns0:rPr>
             </ns0:pPr>
-            <ns0:r ns0:rsidRPr="005152C2">
-              <ns0:rPr>
-                <ns0:rFonts ns0:ascii="Roboto Light" ns0:hAnsi="Roboto Light" ns0:hint="cs"/>
-                <ns0:bCs/>
-                <ns0:lang ns0:val="en-US"/>
-              </ns0:rPr>
-              <ns0:t>Implemented job execution, monitoring, incident diagnosis and automated recovery services around Spark workloads.</ns0:t>
+            <ns0:r>
+              <ns0:t>Developed a microservice layer for Spark job execution, monitoring, updates and operational follow-up.</ns0:t>
             </ns0:r>
           </ns0:p>
-          <ns0:p ns2:paraId="494562EB" ns2:textId="77777777" ns0:rsidR="004A713D" ns0:rsidRPr="005152C2" ns0:rsidRDefault="004A713D" ns0:rsidP="004A713D">
+          <ns0:p>
             <ns0:pPr>
               <ns0:pStyle ns0:val="Paragraphedeliste"/>
-              <ns0:numPr>
-                <ns0:ilvl ns0:val="0"/>
-                <ns0:numId ns0:val="8"/>
-              </ns0:numPr>
-              <ns0:spacing ns0:before="120" ns0:after="60"/>
-              <ns0:ind ns0:left="709" ns0:right="112"/>
-              <ns0:rPr>
-                <ns0:rFonts ns0:ascii="Roboto Light" ns0:hAnsi="Roboto Light"/>
-                <ns0:bCs/>
-                <ns0:lang ns0:val="en-US"/>
-              </ns0:rPr>
-            </ns0:pPr>
-            <ns0:r ns0:rsidRPr="005152C2">
-              <ns0:rPr>
-                <ns0:rFonts ns0:ascii="Roboto Light" ns0:hAnsi="Roboto Light" ns0:hint="cs"/>
-                <ns0:bCs/>
-                <ns0:lang ns0:val="en-US"/>
-              </ns0:rPr>
-              <ns0:t>Owned orchestration, cloud infrastructure, health monitoring and complex Spark SQL control scenarios with a strong focus on support and industrialisation.</ns0:t>
-            </ns0:r>
-          </ns0:p>
-          <ns0:p ns2:paraId="05F0BA59" ns2:textId="77777777" ns0:rsidR="00CB7AB4" ns0:rsidRPr="005152C2" ns0:rsidRDefault="00CB7AB4" ns0:rsidP="00B77CB8">
-            <ns0:pPr>
-              <ns0:spacing ns0:before="120" ns0:after="60"/>
-              <ns0:ind ns0:left="349" ns0:right="112"/>
-              <ns0:jc ns0:val="both"/>
-              <ns0:rPr>
-                <ns0:rFonts ns0:ascii="Roboto Light" ns0:hAnsi="Roboto Light"/>
-                <ns0:lang ns0:val="en-US"/>
-              </ns0:rPr>
-            </ns0:pPr>
-          </ns0:p>
-          <ns0:p ns2:paraId="7F29AE29" ns2:textId="77777777" ns0:rsidR="004A713D" ns0:rsidRDefault="00F2442C" ns0:rsidP="004A713D">
-            <ns0:pPr>
-              <ns0:spacing ns0:before="60" ns0:after="60"/>
-              <ns0:ind ns0:right="112"/>
-              <ns0:jc ns0:val="both"/>
-              <ns0:rPr>
-                <ns0:rFonts ns0:eastAsiaTheme="minorHAnsi"/>
-                <ns0:i/>
-                <ns0:color ns0:val="262626" ns0:themeColor="text1" ns0:themeTint="D9"/>
-                <ns0:sz ns0:val="18"/>
-                <ns0:szCs ns0:val="18"/>
-                <ns0:lang ns0:eastAsia="en-US"/>
-              </ns0:rPr>
             </ns0:pPr>
             <ns0:r>
-              <ns0:rPr>
-                <ns0:rFonts ns0:eastAsiaTheme="minorHAnsi"/>
-                <ns0:i/>
-                <ns0:color ns0:val="17AF9C"/>
-                <ns0:sz ns0:val="18"/>
-                <ns0:szCs ns0:val="22"/>
-                <ns0:lang ns0:eastAsia="en-US"/>
-              </ns0:rPr>
-              <ns0:t>Technologies : Spark, PySpark, JSON, Spark SQL</ns0:t>
+              <ns0:t>Implemented Airflow orchestration, Spark SQL control scenarios, and health monitoring for the orchestration stack with Grafana.</ns0:t>
             </ns0:r>
           </ns0:p>
-          <ns0:p ns2:paraId="7D0B662F" ns2:textId="77777777" ns0:rsidR="00C1069F" ns0:rsidRPr="004A713D" ns0:rsidRDefault="00C1069F" ns0:rsidP="004A713D">
+          <ns0:p>
             <ns0:pPr>
-              <ns0:spacing ns0:before="60" ns0:after="60"/>
-              <ns0:ind ns0:right="112"/>
-              <ns0:jc ns0:val="both"/>
-              <ns0:rPr>
-                <ns0:rFonts ns0:eastAsiaTheme="minorHAnsi"/>
-                <ns0:b/>
-                <ns0:bCs/>
-                <ns0:i/>
-                <ns0:color ns0:val="262626" ns0:themeColor="text1" ns0:themeTint="D9"/>
-                <ns0:sz ns0:val="18"/>
-                <ns0:szCs ns0:val="18"/>
-                <ns0:lang ns0:eastAsia="en-US"/>
-              </ns0:rPr>
+              <ns0:pStyle ns0:val="Paragraphedeliste"/>
             </ns0:pPr>
-          </ns0:p>
-          <ns0:p ns2:paraId="395C0CB0" ns2:textId="77777777" ns0:rsidR="00CB7AB4" ns0:rsidRDefault="00CB7AB4">
-            <ns0:pPr>
-              <ns0:tabs>
-                <ns0:tab ns0:val="left" ns0:pos="6521"/>
-              </ns0:tabs>
-              <ns0:rPr>
-                <ns0:color ns0:val="1C2E5A"/>
-              </ns0:rPr>
-            </ns0:pPr>
+            <ns0:r>
+              <ns0:t>Modelled and maintained the cloud runtime across Kubernetes and big-data components with a strong focus on support and industrialisation.</ns0:t>
+            </ns0:r>
+          </ns0:p>
+          <ns0:p>
+            <ns0:pPr/>
+          </ns0:p>
+          <ns0:p>
+            <ns0:pPr/>
+            <ns0:r>
+              <ns0:t>Technologies: Apache Spark/Hadoop, PySpark, Azure Event Hub, Airflow, Livy, Python, SQL, Java 21, Scala, Hive, Azure, Kubernetes, Spring Boot, Microservices, Jenkins, Grafana, CI/CD.</ns0:t>
+            </ns0:r>
           </ns0:p>
         </ns0:tc>
       </ns0:tr>
@@ -1972,21 +1546,8 @@
             <ns0:shd ns0:val="clear" ns0:color="auto" ns0:fill="F2F2F2" ns0:themeFill="background2" ns0:themeFillShade="F2"/>
             <ns0:vAlign ns0:val="center"/>
           </ns0:tcPr>
-          <ns0:p ns2:paraId="3E9432DC" ns2:textId="77777777" ns0:rsidR="00BC6829" ns0:rsidRDefault="00BC6829" ns0:rsidP="00BC6829">
-            <ns0:pPr>
-              <ns0:ind ns0:right="-112"/>
-              <ns0:rPr>
-                <ns0:b/>
-                <ns0:bCs/>
-                <ns0:color ns0:val="00B8A2"/>
-              </ns0:rPr>
-            </ns0:pPr>
-            <ns0:r ns0:rsidRPr="000C0081">
-              <ns0:rPr>
-                <ns0:b/>
-                <ns0:bCs/>
-                <ns0:color ns0:val="00B8A2"/>
-              </ns0:rPr>
+          <ns0:p>
+            <ns0:r>
               <ns0:t>10.2021 – 10.2022</ns0:t>
             </ns0:r>
           </ns0:p>
@@ -1997,21 +1558,8 @@
             <ns0:shd ns0:val="clear" ns0:color="auto" ns0:fill="F2F2F2" ns0:themeFill="background2" ns0:themeFillShade="F2"/>
             <ns0:vAlign ns0:val="center"/>
           </ns0:tcPr>
-          <ns0:p ns2:paraId="566FF9D0" ns2:textId="77777777" ns0:rsidR="00BC6829" ns0:rsidRDefault="00BC6829" ns0:rsidP="00BC6829">
-            <ns0:pPr>
-              <ns0:ind ns0:right="-337"/>
-              <ns0:rPr>
-                <ns0:b/>
-                <ns0:bCs/>
-                <ns0:color ns0:val="00B8A2"/>
-              </ns0:rPr>
-            </ns0:pPr>
+          <ns0:p>
             <ns0:r>
-              <ns0:rPr>
-                <ns0:b/>
-                <ns0:bCs/>
-                <ns0:color ns0:val="00B8A2"/>
-              </ns0:rPr>
               <ns0:t>Natixis Corporate &amp; Investment Banking</ns0:t>
             </ns0:r>
           </ns0:p>
@@ -2022,371 +1570,58 @@
           <ns0:tcPr>
             <ns0:tcW ns0:w="1984" ns0:type="dxa"/>
           </ns0:tcPr>
-          <ns0:p ns2:paraId="52F66ED2" ns2:textId="77777777" ns0:rsidR="00CB7AB4" ns0:rsidRDefault="00CB7AB4">
-            <ns0:pPr>
-              <ns0:ind ns0:right="-337"/>
-              <ns0:rPr>
-                <ns0:b/>
-                <ns0:bCs/>
-                <ns0:color ns0:val="00B8A2"/>
-              </ns0:rPr>
-            </ns0:pPr>
+          <ns0:p>
+            <ns0:r/>
           </ns0:p>
         </ns0:tc>
         <ns0:tc>
           <ns0:tcPr>
             <ns0:tcW ns0:w="8309" ns0:type="dxa"/>
           </ns0:tcPr>
-          <ns0:p ns2:paraId="53065923" ns2:textId="77777777" ns0:rsidR="00CB7AB4" ns0:rsidRPr="005152C2" ns0:rsidRDefault="004A713D">
-            <ns0:pPr>
-              <ns0:spacing ns0:before="120" ns0:after="60"/>
-              <ns0:ind ns0:right="112"/>
-              <ns0:jc ns0:val="both"/>
-              <ns0:rPr>
-                <ns0:rFonts ns0:eastAsiaTheme="minorHAnsi"/>
-                <ns0:b/>
-                <ns0:color ns0:val="1C2E5A"/>
-                <ns0:szCs ns0:val="22"/>
-                <ns0:lang ns0:val="en-US" ns0:eastAsia="en-US"/>
-              </ns0:rPr>
-            </ns0:pPr>
-            <ns0:r ns0:rsidRPr="005152C2">
-              <ns0:rPr>
-                <ns0:rFonts ns0:eastAsiaTheme="minorHAnsi"/>
-                <ns0:b/>
-                <ns0:color ns0:val="1C2E5A"/>
-                <ns0:szCs ns0:val="22"/>
-                <ns0:lang ns0:val="en-US" ns0:eastAsia="en-US"/>
-              </ns0:rPr>
+          <ns0:p>
+            <ns0:pPr/>
+            <ns0:r>
               <ns0:t>Consultant, Java / Big Data</ns0:t>
             </ns0:r>
           </ns0:p>
-          <ns0:p ns2:paraId="35966E4E" ns2:textId="77777777" ns0:rsidR="004A713D" ns0:rsidRPr="005152C2" ns0:rsidRDefault="004A713D" ns0:rsidP="004A713D">
-            <ns0:pPr>
-              <ns0:spacing ns0:before="60" ns0:after="60"/>
-              <ns0:ind ns0:right="112"/>
-              <ns0:jc ns0:val="both"/>
-              <ns0:rPr>
-                <ns0:rFonts ns0:eastAsiaTheme="minorHAnsi"/>
-                <ns0:i/>
-                <ns0:color ns0:val="1C2E5A"/>
-                <ns0:lang ns0:val="en-US" ns0:eastAsia="en-US"/>
-              </ns0:rPr>
-            </ns0:pPr>
-            <ns0:r ns0:rsidRPr="005152C2">
-              <ns0:rPr>
-                <ns0:rFonts ns0:eastAsiaTheme="minorHAnsi"/>
-                <ns0:i/>
-                <ns0:color ns0:val="1C2E5A"/>
-                <ns0:lang ns0:val="en-US" ns0:eastAsia="en-US"/>
-              </ns0:rPr>
-              <ns0:t xml:space="preserve">Contributed to counterparty risk architecture </ns0:t>
+          <ns0:p>
+            <ns0:pPr/>
+            <ns0:r>
+              <ns0:t>Counterparty-risk R&amp;D architecture and delivery enablement</ns0:t>
             </ns0:r>
-            <ns0:proofErr ns0:type="spellStart"/>
-            <ns0:r ns0:rsidRPr="005152C2">
-              <ns0:rPr>
-                <ns0:rFonts ns0:eastAsiaTheme="minorHAnsi"/>
-                <ns0:i/>
-                <ns0:color ns0:val="1C2E5A"/>
-                <ns0:lang ns0:val="en-US" ns0:eastAsia="en-US"/>
-              </ns0:rPr>
-              <ns0:t>modernisation</ns0:t>
-            </ns0:r>
-            <ns0:proofErr ns0:type="spellEnd"/>
-            <ns0:r ns0:rsidRPr="005152C2">
-              <ns0:rPr>
-                <ns0:rFonts ns0:eastAsiaTheme="minorHAnsi"/>
-                <ns0:i/>
-                <ns0:color ns0:val="1C2E5A"/>
-                <ns0:lang ns0:val="en-US" ns0:eastAsia="en-US"/>
-              </ns0:rPr>
-              <ns0:t xml:space="preserve"> with microservices and CI/CD standards.</ns0:t>
-            </ns0:r>
-          </ns0:p>
-          <ns0:p ns2:paraId="671270F6" ns2:textId="77777777" ns0:rsidR="004A713D" ns0:rsidRPr="005152C2" ns0:rsidRDefault="004A713D" ns0:rsidP="004A713D">
+          </ns0:p>
+          <ns0:p>
             <ns0:pPr>
               <ns0:pStyle ns0:val="Paragraphedeliste"/>
-              <ns0:numPr>
-                <ns0:ilvl ns0:val="0"/>
-                <ns0:numId ns0:val="8"/>
-              </ns0:numPr>
-              <ns0:spacing ns0:before="120" ns0:after="60"/>
-              <ns0:ind ns0:left="709" ns0:right="112"/>
-              <ns0:rPr>
-                <ns0:rFonts ns0:ascii="Roboto Light" ns0:hAnsi="Roboto Light"/>
-                <ns0:bCs/>
-                <ns0:lang ns0:val="en-US"/>
-              </ns0:rPr>
             </ns0:pPr>
-            <ns0:r ns0:rsidRPr="005152C2">
-              <ns0:rPr>
-                <ns0:rFonts ns0:ascii="Roboto Light" ns0:hAnsi="Roboto Light" ns0:hint="cs"/>
-                <ns0:bCs/>
-                <ns0:lang ns0:val="en-US"/>
-              </ns0:rPr>
-              <ns0:t xml:space="preserve">Implemented distributed </ns0:t>
+            <ns0:r>
+              <ns0:t>Context: counterparty-risk R&amp;D team defining microservice architecture, engineering standards and CI/CD pipelines.</ns0:t>
             </ns0:r>
-            <ns0:proofErr ns0:type="gramStart"/>
-            <ns0:r ns0:rsidRPr="005152C2">
-              <ns0:rPr>
-                <ns0:rFonts ns0:ascii="Roboto Light" ns0:hAnsi="Roboto Light" ns0:hint="cs"/>
-                <ns0:bCs/>
-                <ns0:lang ns0:val="en-US"/>
-              </ns0:rPr>
-              <ns0:t>cache</ns0:t>
-            </ns0:r>
-            <ns0:proofErr ns0:type="gramEnd"/>
-            <ns0:r ns0:rsidRPr="005152C2">
-              <ns0:rPr>
-                <ns0:rFonts ns0:ascii="Roboto Light" ns0:hAnsi="Roboto Light" ns0:hint="cs"/>
-                <ns0:bCs/>
-                <ns0:lang ns0:val="en-US"/>
-              </ns0:rPr>
-              <ns0:t xml:space="preserve"> and publisher-consumer patterns to improve risk-calculation performance.</ns0:t>
-            </ns0:r>
-          </ns0:p>
-          <ns0:p ns2:paraId="49848A46" ns2:textId="77777777" ns0:rsidR="004A713D" ns0:rsidRPr="005152C2" ns0:rsidRDefault="004A713D" ns0:rsidP="004A713D">
+          </ns0:p>
+          <ns0:p>
             <ns0:pPr>
               <ns0:pStyle ns0:val="Paragraphedeliste"/>
-              <ns0:numPr>
-                <ns0:ilvl ns0:val="0"/>
-                <ns0:numId ns0:val="8"/>
-              </ns0:numPr>
-              <ns0:spacing ns0:before="120" ns0:after="60"/>
-              <ns0:ind ns0:left="709" ns0:right="112"/>
-              <ns0:rPr>
-                <ns0:rFonts ns0:ascii="Roboto Light" ns0:hAnsi="Roboto Light"/>
-                <ns0:bCs/>
-                <ns0:lang ns0:val="en-US"/>
-              </ns0:rPr>
-            </ns0:pPr>
-            <ns0:r ns0:rsidRPr="005152C2">
-              <ns0:rPr>
-                <ns0:rFonts ns0:ascii="Roboto Light" ns0:hAnsi="Roboto Light" ns0:hint="cs"/>
-                <ns0:bCs/>
-                <ns0:lang ns0:val="en-US"/>
-              </ns0:rPr>
-              <ns0:t xml:space="preserve">Built shared Jenkins pipeline libraries to </ns0:t>
-            </ns0:r>
-            <ns0:proofErr ns0:type="spellStart"/>
-            <ns0:r ns0:rsidRPr="005152C2">
-              <ns0:rPr>
-                <ns0:rFonts ns0:ascii="Roboto Light" ns0:hAnsi="Roboto Light" ns0:hint="cs"/>
-                <ns0:bCs/>
-                <ns0:lang ns0:val="en-US"/>
-              </ns0:rPr>
-              <ns0:t>standardise</ns0:t>
-            </ns0:r>
-            <ns0:proofErr ns0:type="spellEnd"/>
-            <ns0:r ns0:rsidRPr="005152C2">
-              <ns0:rPr>
-                <ns0:rFonts ns0:ascii="Roboto Light" ns0:hAnsi="Roboto Light" ns0:hint="cs"/>
-                <ns0:bCs/>
-                <ns0:lang ns0:val="en-US"/>
-              </ns0:rPr>
-              <ns0:t xml:space="preserve"> delivery workflows across teams.</ns0:t>
-            </ns0:r>
-          </ns0:p>
-          <ns0:p ns2:paraId="7CB97166" ns2:textId="77777777" ns0:rsidR="00CB7AB4" ns0:rsidRPr="005152C2" ns0:rsidRDefault="00CB7AB4" ns0:rsidP="00B77CB8">
-            <ns0:pPr>
-              <ns0:spacing ns0:before="120" ns0:after="60"/>
-              <ns0:ind ns0:left="349" ns0:right="112"/>
-              <ns0:jc ns0:val="both"/>
-              <ns0:rPr>
-                <ns0:rFonts ns0:ascii="Roboto Light" ns0:hAnsi="Roboto Light"/>
-                <ns0:lang ns0:val="en-US"/>
-              </ns0:rPr>
-            </ns0:pPr>
-          </ns0:p>
-          <ns0:p ns2:paraId="71404B51" ns2:textId="77777777" ns0:rsidR="004A713D" ns0:rsidRDefault="00F2442C" ns0:rsidP="004A713D">
-            <ns0:pPr>
-              <ns0:spacing ns0:before="60" ns0:after="60"/>
-              <ns0:ind ns0:right="112"/>
-              <ns0:jc ns0:val="both"/>
-              <ns0:rPr>
-                <ns0:rFonts ns0:eastAsiaTheme="minorHAnsi"/>
-                <ns0:i/>
-                <ns0:color ns0:val="262626" ns0:themeColor="text1" ns0:themeTint="D9"/>
-                <ns0:sz ns0:val="18"/>
-                <ns0:szCs ns0:val="18"/>
-                <ns0:lang ns0:eastAsia="en-US"/>
-              </ns0:rPr>
             </ns0:pPr>
             <ns0:r>
-              <ns0:rPr>
-                <ns0:rFonts ns0:eastAsiaTheme="minorHAnsi"/>
-                <ns0:i/>
-                <ns0:color ns0:val="17AF9C"/>
-                <ns0:sz ns0:val="18"/>
-                <ns0:szCs ns0:val="22"/>
-                <ns0:lang ns0:eastAsia="en-US"/>
-              </ns0:rPr>
-              <ns0:t>Technologies :</ns0:t>
+              <ns0:t>Implemented a level-2 distributed cache with Chronicle Map and gRPC / Protocol Buffers to accelerate risk-calculation tasks.</ns0:t>
             </ns0:r>
+          </ns0:p>
+          <ns0:p>
+            <ns0:pPr>
+              <ns0:pStyle ns0:val="Paragraphedeliste"/>
+            </ns0:pPr>
             <ns0:r>
-              <ns0:rPr>
-                <ns0:rFonts ns0:eastAsiaTheme="minorHAnsi"/>
-                <ns0:i/>
-                <ns0:sz ns0:val="18"/>
-                <ns0:szCs ns0:val="22"/>
-                <ns0:lang ns0:eastAsia="en-US"/>
-              </ns0:rPr>
-              <ns0:t xml:space="preserve"> </ns0:t>
+              <ns0:t>Built publisher-consumer patterns with Chronicle Queues and delivered a shared Jenkins library encapsulating CI/CD logic.</ns0:t>
             </ns0:r>
-            <ns0:r ns0:rsidR="004A713D" ns0:rsidRPr="004A713D">
-              <ns0:rPr>
-                <ns0:rFonts ns0:eastAsiaTheme="minorHAnsi"/>
-                <ns0:i/>
-                <ns0:color ns0:val="262626" ns0:themeColor="text1" ns0:themeTint="D9"/>
-                <ns0:sz ns0:val="18"/>
-                <ns0:szCs ns0:val="18"/>
-                <ns0:lang ns0:eastAsia="en-US"/>
-              </ns0:rPr>
-              <ns0:t xml:space="preserve">Java, </ns0:t>
+          </ns0:p>
+          <ns0:p>
+            <ns0:pPr/>
+          </ns0:p>
+          <ns0:p>
+            <ns0:pPr/>
+            <ns0:r>
+              <ns0:t>Technologies: Java 11, Spring Boot, Microservices, Chronicle Map, Chronicle Queue, gRPC, Protocol Buffers, Jenkins, REST, Groovy, CI/CD, Git, Maven, Linux, JUnit, Mockito.</ns0:t>
             </ns0:r>
-            <ns0:proofErr ns0:type="spellStart"/>
-            <ns0:r ns0:rsidR="004A713D" ns0:rsidRPr="004A713D">
-              <ns0:rPr>
-                <ns0:rFonts ns0:eastAsiaTheme="minorHAnsi"/>
-                <ns0:i/>
-                <ns0:color ns0:val="262626" ns0:themeColor="text1" ns0:themeTint="D9"/>
-                <ns0:sz ns0:val="18"/>
-                <ns0:szCs ns0:val="18"/>
-                <ns0:lang ns0:eastAsia="en-US"/>
-              </ns0:rPr>
-              <ns0:t>Microservices</ns0:t>
-            </ns0:r>
-            <ns0:proofErr ns0:type="spellEnd"/>
-            <ns0:r ns0:rsidR="004A713D" ns0:rsidRPr="004A713D">
-              <ns0:rPr>
-                <ns0:rFonts ns0:eastAsiaTheme="minorHAnsi"/>
-                <ns0:i/>
-                <ns0:color ns0:val="262626" ns0:themeColor="text1" ns0:themeTint="D9"/>
-                <ns0:sz ns0:val="18"/>
-                <ns0:szCs ns0:val="18"/>
-                <ns0:lang ns0:eastAsia="en-US"/>
-              </ns0:rPr>
-              <ns0:t>, CI/CD, Jenkins</ns0:t>
-            </ns0:r>
-          </ns0:p>
-          <ns0:p ns2:paraId="31853305" ns2:textId="77777777" ns0:rsidR="005152C2" ns0:rsidRDefault="005152C2" ns0:rsidP="004A713D">
-            <ns0:pPr>
-              <ns0:spacing ns0:before="60" ns0:after="60"/>
-              <ns0:ind ns0:right="112"/>
-              <ns0:jc ns0:val="both"/>
-              <ns0:rPr>
-                <ns0:rFonts ns0:eastAsiaTheme="minorHAnsi"/>
-                <ns0:i/>
-                <ns0:color ns0:val="262626" ns0:themeColor="text1" ns0:themeTint="D9"/>
-                <ns0:sz ns0:val="18"/>
-                <ns0:szCs ns0:val="18"/>
-                <ns0:lang ns0:eastAsia="en-US"/>
-              </ns0:rPr>
-            </ns0:pPr>
-          </ns0:p>
-          <ns0:p ns2:paraId="37A42EBE" ns2:textId="77777777" ns0:rsidR="005152C2" ns0:rsidRDefault="005152C2" ns0:rsidP="004A713D">
-            <ns0:pPr>
-              <ns0:spacing ns0:before="60" ns0:after="60"/>
-              <ns0:ind ns0:right="112"/>
-              <ns0:jc ns0:val="both"/>
-              <ns0:rPr>
-                <ns0:rFonts ns0:eastAsiaTheme="minorHAnsi"/>
-                <ns0:i/>
-                <ns0:color ns0:val="262626" ns0:themeColor="text1" ns0:themeTint="D9"/>
-                <ns0:sz ns0:val="18"/>
-                <ns0:szCs ns0:val="18"/>
-                <ns0:lang ns0:eastAsia="en-US"/>
-              </ns0:rPr>
-            </ns0:pPr>
-          </ns0:p>
-          <ns0:p ns2:paraId="4F4145BD" ns2:textId="77777777" ns0:rsidR="005152C2" ns0:rsidRDefault="005152C2" ns0:rsidP="004A713D">
-            <ns0:pPr>
-              <ns0:spacing ns0:before="60" ns0:after="60"/>
-              <ns0:ind ns0:right="112"/>
-              <ns0:jc ns0:val="both"/>
-              <ns0:rPr>
-                <ns0:rFonts ns0:eastAsiaTheme="minorHAnsi"/>
-                <ns0:i/>
-                <ns0:color ns0:val="262626" ns0:themeColor="text1" ns0:themeTint="D9"/>
-                <ns0:sz ns0:val="18"/>
-                <ns0:szCs ns0:val="18"/>
-                <ns0:lang ns0:eastAsia="en-US"/>
-              </ns0:rPr>
-            </ns0:pPr>
-          </ns0:p>
-          <ns0:p ns2:paraId="7AE42822" ns2:textId="77777777" ns0:rsidR="005152C2" ns0:rsidRDefault="005152C2" ns0:rsidP="004A713D">
-            <ns0:pPr>
-              <ns0:spacing ns0:before="60" ns0:after="60"/>
-              <ns0:ind ns0:right="112"/>
-              <ns0:jc ns0:val="both"/>
-              <ns0:rPr>
-                <ns0:rFonts ns0:eastAsiaTheme="minorHAnsi"/>
-                <ns0:i/>
-                <ns0:color ns0:val="262626" ns0:themeColor="text1" ns0:themeTint="D9"/>
-                <ns0:sz ns0:val="18"/>
-                <ns0:szCs ns0:val="18"/>
-                <ns0:lang ns0:eastAsia="en-US"/>
-              </ns0:rPr>
-            </ns0:pPr>
-          </ns0:p>
-          <ns0:p ns2:paraId="67ADF0CC" ns2:textId="77777777" ns0:rsidR="005152C2" ns0:rsidRDefault="005152C2" ns0:rsidP="004A713D">
-            <ns0:pPr>
-              <ns0:spacing ns0:before="60" ns0:after="60"/>
-              <ns0:ind ns0:right="112"/>
-              <ns0:jc ns0:val="both"/>
-              <ns0:rPr>
-                <ns0:rFonts ns0:eastAsiaTheme="minorHAnsi"/>
-                <ns0:i/>
-                <ns0:color ns0:val="262626" ns0:themeColor="text1" ns0:themeTint="D9"/>
-                <ns0:sz ns0:val="18"/>
-                <ns0:szCs ns0:val="18"/>
-                <ns0:lang ns0:eastAsia="en-US"/>
-              </ns0:rPr>
-            </ns0:pPr>
-          </ns0:p>
-          <ns0:p ns2:paraId="4A96469B" ns2:textId="77777777" ns0:rsidR="00C1069F" ns0:rsidRDefault="00C1069F" ns0:rsidP="004A713D">
-            <ns0:pPr>
-              <ns0:spacing ns0:before="60" ns0:after="60"/>
-              <ns0:ind ns0:right="112"/>
-              <ns0:jc ns0:val="both"/>
-              <ns0:rPr>
-                <ns0:rFonts ns0:eastAsiaTheme="minorHAnsi"/>
-                <ns0:b/>
-                <ns0:bCs/>
-                <ns0:i/>
-                <ns0:color ns0:val="262626" ns0:themeColor="text1" ns0:themeTint="D9"/>
-                <ns0:sz ns0:val="18"/>
-                <ns0:szCs ns0:val="18"/>
-                <ns0:lang ns0:eastAsia="en-US"/>
-              </ns0:rPr>
-            </ns0:pPr>
-          </ns0:p>
-          <ns0:p ns2:paraId="277F17DA" ns2:textId="77777777" ns0:rsidR="005152C2" ns0:rsidRPr="004A713D" ns0:rsidRDefault="005152C2" ns0:rsidP="004A713D">
-            <ns0:pPr>
-              <ns0:spacing ns0:before="60" ns0:after="60"/>
-              <ns0:ind ns0:right="112"/>
-              <ns0:jc ns0:val="both"/>
-              <ns0:rPr>
-                <ns0:rFonts ns0:eastAsiaTheme="minorHAnsi"/>
-                <ns0:b/>
-                <ns0:bCs/>
-                <ns0:i/>
-                <ns0:color ns0:val="262626" ns0:themeColor="text1" ns0:themeTint="D9"/>
-                <ns0:sz ns0:val="18"/>
-                <ns0:szCs ns0:val="18"/>
-                <ns0:lang ns0:eastAsia="en-US"/>
-              </ns0:rPr>
-            </ns0:pPr>
-          </ns0:p>
-          <ns0:p ns2:paraId="021F7C9B" ns2:textId="77777777" ns0:rsidR="00CB7AB4" ns0:rsidRDefault="00CB7AB4">
-            <ns0:pPr>
-              <ns0:tabs>
-                <ns0:tab ns0:val="left" ns0:pos="6521"/>
-              </ns0:tabs>
-              <ns0:rPr>
-                <ns0:color ns0:val="1C2E5A"/>
-              </ns0:rPr>
-            </ns0:pPr>
           </ns0:p>
         </ns0:tc>
       </ns0:tr>
@@ -2400,22 +1635,8 @@
             <ns0:shd ns0:val="clear" ns0:color="auto" ns0:fill="F2F2F2" ns0:themeFill="background2" ns0:themeFillShade="F2"/>
             <ns0:vAlign ns0:val="center"/>
           </ns0:tcPr>
-          <ns0:p ns2:paraId="3BA72ECE" ns2:textId="77777777" ns0:rsidR="00BC6829" ns0:rsidRDefault="00BC6829" ns0:rsidP="00BC6829">
-            <ns0:pPr>
-              <ns0:ind ns0:right="-112"/>
-              <ns0:rPr>
-                <ns0:b/>
-                <ns0:bCs/>
-                <ns0:color ns0:val="00B8A2"/>
-              </ns0:rPr>
-            </ns0:pPr>
-            <ns0:r ns0:rsidRPr="000C0081">
-              <ns0:rPr>
-                <ns0:b/>
-                <ns0:bCs/>
-                <ns0:color ns0:val="00B8A2"/>
-              </ns0:rPr>
-              <ns0:lastRenderedPageBreak/>
+          <ns0:p>
+            <ns0:r>
               <ns0:t>06.2018 – 10.2021</ns0:t>
             </ns0:r>
           </ns0:p>
@@ -2426,21 +1647,8 @@
             <ns0:shd ns0:val="clear" ns0:color="auto" ns0:fill="F2F2F2" ns0:themeFill="background2" ns0:themeFillShade="F2"/>
             <ns0:vAlign ns0:val="center"/>
           </ns0:tcPr>
-          <ns0:p ns2:paraId="17BB5E56" ns2:textId="77777777" ns0:rsidR="00BC6829" ns0:rsidRDefault="00BC6829" ns0:rsidP="00BC6829">
-            <ns0:pPr>
-              <ns0:ind ns0:right="-337"/>
-              <ns0:rPr>
-                <ns0:b/>
-                <ns0:bCs/>
-                <ns0:color ns0:val="00B8A2"/>
-              </ns0:rPr>
-            </ns0:pPr>
+          <ns0:p>
             <ns0:r>
-              <ns0:rPr>
-                <ns0:b/>
-                <ns0:bCs/>
-                <ns0:color ns0:val="00B8A2"/>
-              </ns0:rPr>
               <ns0:t>Société Générale Corporate &amp; Investment Banking</ns0:t>
             </ns0:r>
           </ns0:p>
@@ -2451,199 +1659,66 @@
           <ns0:tcPr>
             <ns0:tcW ns0:w="1984" ns0:type="dxa"/>
           </ns0:tcPr>
-          <ns0:p ns2:paraId="57071E5A" ns2:textId="77777777" ns0:rsidR="00CB7AB4" ns0:rsidRDefault="00CB7AB4">
-            <ns0:pPr>
-              <ns0:ind ns0:right="-337"/>
-              <ns0:rPr>
-                <ns0:b/>
-                <ns0:bCs/>
-                <ns0:color ns0:val="00B8A2"/>
-              </ns0:rPr>
-            </ns0:pPr>
+          <ns0:p>
+            <ns0:r/>
           </ns0:p>
         </ns0:tc>
         <ns0:tc>
           <ns0:tcPr>
             <ns0:tcW ns0:w="8309" ns0:type="dxa"/>
           </ns0:tcPr>
-          <ns0:p ns2:paraId="47244F0B" ns2:textId="77777777" ns0:rsidR="00CB7AB4" ns0:rsidRPr="005152C2" ns0:rsidRDefault="004A713D">
-            <ns0:pPr>
-              <ns0:spacing ns0:before="120" ns0:after="60"/>
-              <ns0:ind ns0:right="112"/>
-              <ns0:jc ns0:val="both"/>
-              <ns0:rPr>
-                <ns0:rFonts ns0:eastAsiaTheme="minorHAnsi"/>
-                <ns0:b/>
-                <ns0:color ns0:val="1C2E5A"/>
-                <ns0:szCs ns0:val="22"/>
-                <ns0:lang ns0:val="en-US" ns0:eastAsia="en-US"/>
-              </ns0:rPr>
-            </ns0:pPr>
-            <ns0:r ns0:rsidRPr="005152C2">
-              <ns0:rPr>
-                <ns0:rFonts ns0:eastAsiaTheme="minorHAnsi"/>
-                <ns0:b/>
-                <ns0:color ns0:val="1C2E5A"/>
-                <ns0:szCs ns0:val="22"/>
-                <ns0:lang ns0:val="en-US" ns0:eastAsia="en-US"/>
-              </ns0:rPr>
+          <ns0:p>
+            <ns0:pPr/>
+            <ns0:r>
               <ns0:t>Senior Java / Big Data Developer</ns0:t>
             </ns0:r>
           </ns0:p>
-          <ns0:p ns2:paraId="56F9257F" ns2:textId="77777777" ns0:rsidR="004A713D" ns0:rsidRPr="005152C2" ns0:rsidRDefault="004A713D" ns0:rsidP="004A713D">
-            <ns0:pPr>
-              <ns0:spacing ns0:before="60" ns0:after="60"/>
-              <ns0:ind ns0:right="112"/>
-              <ns0:jc ns0:val="both"/>
-              <ns0:rPr>
-                <ns0:rFonts ns0:eastAsiaTheme="minorHAnsi"/>
-                <ns0:i/>
-                <ns0:color ns0:val="1C2E5A"/>
-                <ns0:lang ns0:val="en-US" ns0:eastAsia="en-US"/>
-              </ns0:rPr>
-            </ns0:pPr>
-            <ns0:r ns0:rsidRPr="005152C2">
-              <ns0:rPr>
-                <ns0:rFonts ns0:eastAsiaTheme="minorHAnsi"/>
-                <ns0:i/>
-                <ns0:color ns0:val="1C2E5A"/>
-                <ns0:lang ns0:val="en-US" ns0:eastAsia="en-US"/>
-              </ns0:rPr>
-              <ns0:t>Delivered big-data execution frameworks for FRTB default-risk metrics on Azure-based platforms.</ns0:t>
+          <ns0:p>
+            <ns0:pPr/>
+            <ns0:r>
+              <ns0:t>FRTB default-risk metrics and Azure big-data delivery</ns0:t>
             </ns0:r>
           </ns0:p>
-          <ns0:p ns2:paraId="2F20646F" ns2:textId="77777777" ns0:rsidR="004A713D" ns0:rsidRPr="005152C2" ns0:rsidRDefault="004A713D" ns0:rsidP="004A713D">
+          <ns0:p>
             <ns0:pPr>
               <ns0:pStyle ns0:val="Paragraphedeliste"/>
-              <ns0:numPr>
-                <ns0:ilvl ns0:val="0"/>
-                <ns0:numId ns0:val="8"/>
-              </ns0:numPr>
-              <ns0:spacing ns0:before="120" ns0:after="60"/>
-              <ns0:ind ns0:left="709" ns0:right="112"/>
-              <ns0:rPr>
-                <ns0:rFonts ns0:ascii="Roboto Light" ns0:hAnsi="Roboto Light"/>
-                <ns0:bCs/>
-                <ns0:lang ns0:val="en-US"/>
-              </ns0:rPr>
             </ns0:pPr>
-            <ns0:r ns0:rsidRPr="005152C2">
-              <ns0:rPr>
-                <ns0:rFonts ns0:ascii="Roboto Light" ns0:hAnsi="Roboto Light" ns0:hint="cs"/>
-                <ns0:bCs/>
-                <ns0:lang ns0:val="en-US"/>
-              </ns0:rPr>
-              <ns0:t>Designed Kafka-driven messaging and result distribution toward downstream OLAP consumers.</ns0:t>
+            <ns0:r>
+              <ns0:t>Context: Fundamental Review of the Trading Book default-risk scope on a big-data platform requiring close coordination with business stakeholders and application teams.</ns0:t>
             </ns0:r>
           </ns0:p>
-          <ns0:p ns2:paraId="08B9D45D" ns2:textId="77777777" ns0:rsidR="004A713D" ns0:rsidRPr="005152C2" ns0:rsidRDefault="004A713D" ns0:rsidP="004A713D">
+          <ns0:p>
             <ns0:pPr>
               <ns0:pStyle ns0:val="Paragraphedeliste"/>
-              <ns0:numPr>
-                <ns0:ilvl ns0:val="0"/>
-                <ns0:numId ns0:val="8"/>
-              </ns0:numPr>
-              <ns0:spacing ns0:before="120" ns0:after="60"/>
-              <ns0:ind ns0:left="709" ns0:right="112"/>
-              <ns0:rPr>
-                <ns0:rFonts ns0:ascii="Roboto Light" ns0:hAnsi="Roboto Light"/>
-                <ns0:bCs/>
-                <ns0:lang ns0:val="en-US"/>
-              </ns0:rPr>
-            </ns0:pPr>
-            <ns0:r ns0:rsidRPr="005152C2">
-              <ns0:rPr>
-                <ns0:rFonts ns0:ascii="Roboto Light" ns0:hAnsi="Roboto Light" ns0:hint="cs"/>
-                <ns0:bCs/>
-                <ns0:lang ns0:val="en-US"/>
-              </ns0:rPr>
-              <ns0:t>Migrated data projects from on-premises data lake stacks to Azure and maintained production services.</ns0:t>
-            </ns0:r>
-          </ns0:p>
-          <ns0:p ns2:paraId="5C14A5B0" ns2:textId="77777777" ns0:rsidR="00CB7AB4" ns0:rsidRPr="005152C2" ns0:rsidRDefault="00CB7AB4" ns0:rsidP="00B77CB8">
-            <ns0:pPr>
-              <ns0:spacing ns0:before="120" ns0:after="60"/>
-              <ns0:ind ns0:left="349" ns0:right="112"/>
-              <ns0:jc ns0:val="both"/>
-              <ns0:rPr>
-                <ns0:rFonts ns0:ascii="Roboto Light" ns0:hAnsi="Roboto Light"/>
-                <ns0:lang ns0:val="en-US"/>
-              </ns0:rPr>
-            </ns0:pPr>
-          </ns0:p>
-          <ns0:p ns2:paraId="1F2529BB" ns2:textId="77777777" ns0:rsidR="004A713D" ns0:rsidRDefault="00F2442C" ns0:rsidP="004A713D">
-            <ns0:pPr>
-              <ns0:spacing ns0:before="60" ns0:after="60"/>
-              <ns0:ind ns0:right="112"/>
-              <ns0:jc ns0:val="both"/>
-              <ns0:rPr>
-                <ns0:rFonts ns0:eastAsiaTheme="minorHAnsi"/>
-                <ns0:i/>
-                <ns0:color ns0:val="262626" ns0:themeColor="text1" ns0:themeTint="D9"/>
-                <ns0:sz ns0:val="18"/>
-                <ns0:szCs ns0:val="18"/>
-                <ns0:lang ns0:eastAsia="en-US"/>
-              </ns0:rPr>
             </ns0:pPr>
             <ns0:r>
-              <ns0:rPr>
-                <ns0:rFonts ns0:eastAsiaTheme="minorHAnsi"/>
-                <ns0:i/>
-                <ns0:color ns0:val="17AF9C"/>
-                <ns0:sz ns0:val="18"/>
-                <ns0:szCs ns0:val="22"/>
-                <ns0:lang ns0:eastAsia="en-US"/>
-              </ns0:rPr>
-              <ns0:t>Technologies :</ns0:t>
+              <ns0:t>Designed Kafka-driven execution flows for FRTB default-risk calculations and published results to downstream OLAP consumers through Kafka and HTTP streaming.</ns0:t>
             </ns0:r>
+          </ns0:p>
+          <ns0:p>
+            <ns0:pPr>
+              <ns0:pStyle ns0:val="Paragraphedeliste"/>
+            </ns0:pPr>
             <ns0:r>
-              <ns0:rPr>
-                <ns0:rFonts ns0:eastAsiaTheme="minorHAnsi"/>
-                <ns0:i/>
-                <ns0:sz ns0:val="18"/>
-                <ns0:szCs ns0:val="22"/>
-                <ns0:lang ns0:eastAsia="en-US"/>
-              </ns0:rPr>
-              <ns0:t xml:space="preserve"> </ns0:t>
+              <ns0:t>Implemented DRC standard-method rules across Equity LGD and Credit quality grids, then delivered production releases using pricer data.</ns0:t>
             </ns0:r>
-            <ns0:r ns0:rsidR="004A713D" ns0:rsidRPr="004A713D">
-              <ns0:rPr>
-                <ns0:rFonts ns0:eastAsiaTheme="minorHAnsi"/>
-                <ns0:i/>
-                <ns0:color ns0:val="262626" ns0:themeColor="text1" ns0:themeTint="D9"/>
-                <ns0:sz ns0:val="18"/>
-                <ns0:szCs ns0:val="18"/>
-                <ns0:lang ns0:eastAsia="en-US"/>
-              </ns0:rPr>
-              <ns0:t>Java, Big Data, Azure, Kafka, OLAP</ns0:t>
+          </ns0:p>
+          <ns0:p>
+            <ns0:pPr>
+              <ns0:pStyle ns0:val="Paragraphedeliste"/>
+            </ns0:pPr>
+            <ns0:r>
+              <ns0:t>Migrated projects from on-premises data lake stacks to Azure, including technical adaptations, plugins and production maintenance.</ns0:t>
             </ns0:r>
           </ns0:p>
-          <ns0:p ns2:paraId="6FBEA7C6" ns2:textId="77777777" ns0:rsidR="00C1069F" ns0:rsidRPr="004A713D" ns0:rsidRDefault="00C1069F" ns0:rsidP="004A713D">
-            <ns0:pPr>
-              <ns0:spacing ns0:before="60" ns0:after="60"/>
-              <ns0:ind ns0:right="112"/>
-              <ns0:jc ns0:val="both"/>
-              <ns0:rPr>
-                <ns0:rFonts ns0:eastAsiaTheme="minorHAnsi"/>
-                <ns0:b/>
-                <ns0:bCs/>
-                <ns0:i/>
-                <ns0:color ns0:val="262626" ns0:themeColor="text1" ns0:themeTint="D9"/>
-                <ns0:sz ns0:val="18"/>
-                <ns0:szCs ns0:val="18"/>
-                <ns0:lang ns0:eastAsia="en-US"/>
-              </ns0:rPr>
-            </ns0:pPr>
-          </ns0:p>
-          <ns0:p ns2:paraId="003743A8" ns2:textId="77777777" ns0:rsidR="00CB7AB4" ns0:rsidRDefault="00CB7AB4">
-            <ns0:pPr>
-              <ns0:tabs>
-                <ns0:tab ns0:val="left" ns0:pos="6521"/>
-              </ns0:tabs>
-              <ns0:rPr>
-                <ns0:color ns0:val="1C2E5A"/>
-              </ns0:rPr>
-            </ns0:pPr>
+          <ns0:p>
+            <ns0:pPr/>
+          </ns0:p>
+          <ns0:p>
+            <ns0:pPr/>
+            <ns0:r>
+              <ns0:t>Technologies: Apache Spark, Hadoop, Kafka, Java 8, Scala, Hive, Data Lake, Azure, ActiveViam, Spring Boot, Microservices, Jenkins, REST, Git, Gradle, Linux, JUnit, Mockito.</ns0:t>
+            </ns0:r>
           </ns0:p>
         </ns0:tc>
       </ns0:tr>
@@ -2657,21 +1732,8 @@
             <ns0:shd ns0:val="clear" ns0:color="auto" ns0:fill="F2F2F2" ns0:themeFill="background2" ns0:themeFillShade="F2"/>
             <ns0:vAlign ns0:val="center"/>
           </ns0:tcPr>
-          <ns0:p ns2:paraId="097964DF" ns2:textId="77777777" ns0:rsidR="00BC6829" ns0:rsidRDefault="00BC6829" ns0:rsidP="00BC6829">
-            <ns0:pPr>
-              <ns0:ind ns0:right="-112"/>
-              <ns0:rPr>
-                <ns0:b/>
-                <ns0:bCs/>
-                <ns0:color ns0:val="00B8A2"/>
-              </ns0:rPr>
-            </ns0:pPr>
-            <ns0:r ns0:rsidRPr="000C0081">
-              <ns0:rPr>
-                <ns0:b/>
-                <ns0:bCs/>
-                <ns0:color ns0:val="00B8A2"/>
-              </ns0:rPr>
+          <ns0:p>
+            <ns0:r>
               <ns0:t>01.2017 – 05.2018</ns0:t>
             </ns0:r>
           </ns0:p>
@@ -2682,21 +1744,8 @@
             <ns0:shd ns0:val="clear" ns0:color="auto" ns0:fill="F2F2F2" ns0:themeFill="background2" ns0:themeFillShade="F2"/>
             <ns0:vAlign ns0:val="center"/>
           </ns0:tcPr>
-          <ns0:p ns2:paraId="111F82D3" ns2:textId="77777777" ns0:rsidR="00BC6829" ns0:rsidRDefault="00BC6829" ns0:rsidP="00BC6829">
-            <ns0:pPr>
-              <ns0:ind ns0:right="-337"/>
-              <ns0:rPr>
-                <ns0:b/>
-                <ns0:bCs/>
-                <ns0:color ns0:val="00B8A2"/>
-              </ns0:rPr>
-            </ns0:pPr>
+          <ns0:p>
             <ns0:r>
-              <ns0:rPr>
-                <ns0:b/>
-                <ns0:bCs/>
-                <ns0:color ns0:val="00B8A2"/>
-              </ns0:rPr>
               <ns0:t>HSBC Global Markets</ns0:t>
             </ns0:r>
           </ns0:p>
@@ -2707,255 +1756,66 @@
           <ns0:tcPr>
             <ns0:tcW ns0:w="1984" ns0:type="dxa"/>
           </ns0:tcPr>
-          <ns0:p ns2:paraId="4344E62F" ns2:textId="77777777" ns0:rsidR="00CB7AB4" ns0:rsidRDefault="00CB7AB4">
-            <ns0:pPr>
-              <ns0:ind ns0:right="-337"/>
-              <ns0:rPr>
-                <ns0:b/>
-                <ns0:bCs/>
-                <ns0:color ns0:val="00B8A2"/>
-              </ns0:rPr>
-            </ns0:pPr>
+          <ns0:p>
+            <ns0:r/>
           </ns0:p>
         </ns0:tc>
         <ns0:tc>
           <ns0:tcPr>
             <ns0:tcW ns0:w="8309" ns0:type="dxa"/>
           </ns0:tcPr>
-          <ns0:p ns2:paraId="453F6C3F" ns2:textId="77777777" ns0:rsidR="00CB7AB4" ns0:rsidRPr="005152C2" ns0:rsidRDefault="004A713D">
-            <ns0:pPr>
-              <ns0:spacing ns0:before="120" ns0:after="60"/>
-              <ns0:ind ns0:right="112"/>
-              <ns0:jc ns0:val="both"/>
-              <ns0:rPr>
-                <ns0:rFonts ns0:eastAsiaTheme="minorHAnsi"/>
-                <ns0:b/>
-                <ns0:color ns0:val="1C2E5A"/>
-                <ns0:szCs ns0:val="22"/>
-                <ns0:lang ns0:val="en-US" ns0:eastAsia="en-US"/>
-              </ns0:rPr>
-            </ns0:pPr>
-            <ns0:r ns0:rsidRPr="005152C2">
-              <ns0:rPr>
-                <ns0:rFonts ns0:eastAsiaTheme="minorHAnsi"/>
-                <ns0:b/>
-                <ns0:color ns0:val="1C2E5A"/>
-                <ns0:szCs ns0:val="22"/>
-                <ns0:lang ns0:val="en-US" ns0:eastAsia="en-US"/>
-              </ns0:rPr>
+          <ns0:p>
+            <ns0:pPr/>
+            <ns0:r>
               <ns0:t>Consultant, Distributed Systems</ns0:t>
             </ns0:r>
           </ns0:p>
-          <ns0:p ns2:paraId="2D2883A8" ns2:textId="77777777" ns0:rsidR="004A713D" ns0:rsidRPr="005152C2" ns0:rsidRDefault="004A713D" ns0:rsidP="004A713D">
-            <ns0:pPr>
-              <ns0:spacing ns0:before="60" ns0:after="60"/>
-              <ns0:ind ns0:right="112"/>
-              <ns0:jc ns0:val="both"/>
-              <ns0:rPr>
-                <ns0:rFonts ns0:eastAsiaTheme="minorHAnsi"/>
-                <ns0:i/>
-                <ns0:color ns0:val="1C2E5A"/>
-                <ns0:lang ns0:val="en-US" ns0:eastAsia="en-US"/>
-              </ns0:rPr>
-            </ns0:pPr>
-            <ns0:r ns0:rsidRPr="005152C2">
-              <ns0:rPr>
-                <ns0:rFonts ns0:eastAsiaTheme="minorHAnsi"/>
-                <ns0:i/>
-                <ns0:color ns0:val="1C2E5A"/>
-                <ns0:lang ns0:val="en-US" ns0:eastAsia="en-US"/>
-              </ns0:rPr>
-              <ns0:t xml:space="preserve">Led development for fixed-income functionality within a cross-asset risk and </ns0:t>
+          <ns0:p>
+            <ns0:pPr/>
+            <ns0:r>
+              <ns0:t>Cross-asset market-risk and PnL platform</ns0:t>
             </ns0:r>
-            <ns0:proofErr ns0:type="spellStart"/>
-            <ns0:r ns0:rsidRPr="005152C2">
-              <ns0:rPr>
-                <ns0:rFonts ns0:eastAsiaTheme="minorHAnsi"/>
-                <ns0:i/>
-                <ns0:color ns0:val="1C2E5A"/>
-                <ns0:lang ns0:val="en-US" ns0:eastAsia="en-US"/>
-              </ns0:rPr>
-              <ns0:t>PnL</ns0:t>
-            </ns0:r>
-            <ns0:proofErr ns0:type="spellEnd"/>
-            <ns0:r ns0:rsidRPr="005152C2">
-              <ns0:rPr>
-                <ns0:rFonts ns0:eastAsiaTheme="minorHAnsi"/>
-                <ns0:i/>
-                <ns0:color ns0:val="1C2E5A"/>
-                <ns0:lang ns0:val="en-US" ns0:eastAsia="en-US"/>
-              </ns0:rPr>
-              <ns0:t xml:space="preserve"> platform.</ns0:t>
-            </ns0:r>
-          </ns0:p>
-          <ns0:p ns2:paraId="064F848C" ns2:textId="77777777" ns0:rsidR="004A713D" ns0:rsidRPr="005152C2" ns0:rsidRDefault="004A713D" ns0:rsidP="004A713D">
+          </ns0:p>
+          <ns0:p>
             <ns0:pPr>
               <ns0:pStyle ns0:val="Paragraphedeliste"/>
-              <ns0:numPr>
-                <ns0:ilvl ns0:val="0"/>
-                <ns0:numId ns0:val="8"/>
-              </ns0:numPr>
-              <ns0:spacing ns0:before="120" ns0:after="60"/>
-              <ns0:ind ns0:left="709" ns0:right="112"/>
-              <ns0:rPr>
-                <ns0:rFonts ns0:ascii="Roboto Light" ns0:hAnsi="Roboto Light"/>
-                <ns0:bCs/>
-                <ns0:lang ns0:val="en-US"/>
-              </ns0:rPr>
             </ns0:pPr>
-            <ns0:r ns0:rsidRPr="005152C2">
-              <ns0:rPr>
-                <ns0:rFonts ns0:ascii="Roboto Light" ns0:hAnsi="Roboto Light" ns0:hint="cs"/>
-                <ns0:bCs/>
-                <ns0:lang ns0:val="en-US"/>
-              </ns0:rPr>
-              <ns0:t xml:space="preserve">Coordinated offshore teams and built shared </ns0:t>
+            <ns0:r>
+              <ns0:t>Context: cross-asset platform covering market-risk and PnL calculations across asset classes, with fixed-income delivery ownership.</ns0:t>
             </ns0:r>
-            <ns0:proofErr ns0:type="gramStart"/>
-            <ns0:r ns0:rsidRPr="005152C2">
-              <ns0:rPr>
-                <ns0:rFonts ns0:ascii="Roboto Light" ns0:hAnsi="Roboto Light" ns0:hint="cs"/>
-                <ns0:bCs/>
-                <ns0:lang ns0:val="en-US"/>
-              </ns0:rPr>
-              <ns0:t>cache</ns0:t>
-            </ns0:r>
-            <ns0:proofErr ns0:type="gramEnd"/>
-            <ns0:r ns0:rsidRPr="005152C2">
-              <ns0:rPr>
-                <ns0:rFonts ns0:ascii="Roboto Light" ns0:hAnsi="Roboto Light" ns0:hint="cs"/>
-                <ns0:bCs/>
-                <ns0:lang ns0:val="en-US"/>
-              </ns0:rPr>
-              <ns0:t>, workflow and REST service capabilities.</ns0:t>
-            </ns0:r>
-          </ns0:p>
-          <ns0:p ns2:paraId="339CB166" ns2:textId="77777777" ns0:rsidR="004A713D" ns0:rsidRPr="005152C2" ns0:rsidRDefault="004A713D" ns0:rsidP="004A713D">
+          </ns0:p>
+          <ns0:p>
             <ns0:pPr>
               <ns0:pStyle ns0:val="Paragraphedeliste"/>
-              <ns0:numPr>
-                <ns0:ilvl ns0:val="0"/>
-                <ns0:numId ns0:val="8"/>
-              </ns0:numPr>
-              <ns0:spacing ns0:before="120" ns0:after="60"/>
-              <ns0:ind ns0:left="709" ns0:right="112"/>
-              <ns0:rPr>
-                <ns0:rFonts ns0:ascii="Roboto Light" ns0:hAnsi="Roboto Light"/>
-                <ns0:bCs/>
-                <ns0:lang ns0:val="en-US"/>
-              </ns0:rPr>
-            </ns0:pPr>
-            <ns0:r ns0:rsidRPr="005152C2">
-              <ns0:rPr>
-                <ns0:rFonts ns0:ascii="Roboto Light" ns0:hAnsi="Roboto Light" ns0:hint="cs"/>
-                <ns0:bCs/>
-                <ns0:lang ns0:val="en-US"/>
-              </ns0:rPr>
-              <ns0:t xml:space="preserve">Supported CI/CD and performance </ns0:t>
-            </ns0:r>
-            <ns0:proofErr ns0:type="spellStart"/>
-            <ns0:r ns0:rsidRPr="005152C2">
-              <ns0:rPr>
-                <ns0:rFonts ns0:ascii="Roboto Light" ns0:hAnsi="Roboto Light" ns0:hint="cs"/>
-                <ns0:bCs/>
-                <ns0:lang ns0:val="en-US"/>
-              </ns0:rPr>
-              <ns0:t>optimisation</ns0:t>
-            </ns0:r>
-            <ns0:proofErr ns0:type="spellEnd"/>
-            <ns0:r ns0:rsidRPr="005152C2">
-              <ns0:rPr>
-                <ns0:rFonts ns0:ascii="Roboto Light" ns0:hAnsi="Roboto Light" ns0:hint="cs"/>
-                <ns0:bCs/>
-                <ns0:lang ns0:val="en-US"/>
-              </ns0:rPr>
-              <ns0:t xml:space="preserve"> across distributed compute grids.</ns0:t>
-            </ns0:r>
-          </ns0:p>
-          <ns0:p ns2:paraId="1D4E54EC" ns2:textId="77777777" ns0:rsidR="00CB7AB4" ns0:rsidRPr="005152C2" ns0:rsidRDefault="00CB7AB4" ns0:rsidP="00B77CB8">
-            <ns0:pPr>
-              <ns0:spacing ns0:before="120" ns0:after="60"/>
-              <ns0:ind ns0:left="349" ns0:right="112"/>
-              <ns0:jc ns0:val="both"/>
-              <ns0:rPr>
-                <ns0:rFonts ns0:ascii="Roboto Light" ns0:hAnsi="Roboto Light"/>
-                <ns0:lang ns0:val="en-US"/>
-              </ns0:rPr>
-            </ns0:pPr>
-          </ns0:p>
-          <ns0:p ns2:paraId="611CA46B" ns2:textId="77777777" ns0:rsidR="004A713D" ns0:rsidRDefault="00F2442C" ns0:rsidP="004A713D">
-            <ns0:pPr>
-              <ns0:spacing ns0:before="60" ns0:after="60"/>
-              <ns0:ind ns0:right="112"/>
-              <ns0:jc ns0:val="both"/>
-              <ns0:rPr>
-                <ns0:rFonts ns0:eastAsiaTheme="minorHAnsi"/>
-                <ns0:i/>
-                <ns0:color ns0:val="262626" ns0:themeColor="text1" ns0:themeTint="D9"/>
-                <ns0:sz ns0:val="18"/>
-                <ns0:szCs ns0:val="18"/>
-                <ns0:lang ns0:eastAsia="en-US"/>
-              </ns0:rPr>
             </ns0:pPr>
             <ns0:r>
-              <ns0:rPr>
-                <ns0:rFonts ns0:eastAsiaTheme="minorHAnsi"/>
-                <ns0:i/>
-                <ns0:color ns0:val="17AF9C"/>
-                <ns0:sz ns0:val="18"/>
-                <ns0:szCs ns0:val="22"/>
-                <ns0:lang ns0:eastAsia="en-US"/>
-              </ns0:rPr>
-              <ns0:t>Technologies :</ns0:t>
+              <ns0:t>Acted as point of contact for fixed-income development and support, leading offshore teams across Guangzhou, Bucharest and Pune.</ns0:t>
             </ns0:r>
+          </ns0:p>
+          <ns0:p>
+            <ns0:pPr>
+              <ns0:pStyle ns0:val="Paragraphedeliste"/>
+            </ns0:pPr>
             <ns0:r>
-              <ns0:rPr>
-                <ns0:rFonts ns0:eastAsiaTheme="minorHAnsi"/>
-                <ns0:i/>
-                <ns0:sz ns0:val="18"/>
-                <ns0:szCs ns0:val="22"/>
-                <ns0:lang ns0:eastAsia="en-US"/>
-              </ns0:rPr>
-              <ns0:t xml:space="preserve"> </ns0:t>
+              <ns0:t>Built on-demand trade loading with Coherence shared cache, optimised workflows and memory usage in distributed DataSynapse grids, and delivered REST microservices plus lifecycle tooling.</ns0:t>
             </ns0:r>
-            <ns0:r ns0:rsidR="004A713D" ns0:rsidRPr="004A713D">
-              <ns0:rPr>
-                <ns0:rFonts ns0:eastAsiaTheme="minorHAnsi"/>
-                <ns0:i/>
-                <ns0:color ns0:val="262626" ns0:themeColor="text1" ns0:themeTint="D9"/>
-                <ns0:sz ns0:val="18"/>
-                <ns0:szCs ns0:val="18"/>
-                <ns0:lang ns0:eastAsia="en-US"/>
-              </ns0:rPr>
-              <ns0:t>REST, CI/CD</ns0:t>
+          </ns0:p>
+          <ns0:p>
+            <ns0:pPr>
+              <ns0:pStyle ns0:val="Paragraphedeliste"/>
+            </ns0:pPr>
+            <ns0:r>
+              <ns0:t>Supported CI/CD with TeamCity, Jenkins and Ansible.</ns0:t>
             </ns0:r>
           </ns0:p>
-          <ns0:p ns2:paraId="22DC900A" ns2:textId="77777777" ns0:rsidR="00C1069F" ns0:rsidRPr="004A713D" ns0:rsidRDefault="00C1069F" ns0:rsidP="004A713D">
-            <ns0:pPr>
-              <ns0:spacing ns0:before="60" ns0:after="60"/>
-              <ns0:ind ns0:right="112"/>
-              <ns0:jc ns0:val="both"/>
-              <ns0:rPr>
-                <ns0:rFonts ns0:eastAsiaTheme="minorHAnsi"/>
-                <ns0:b/>
-                <ns0:bCs/>
-                <ns0:i/>
-                <ns0:color ns0:val="262626" ns0:themeColor="text1" ns0:themeTint="D9"/>
-                <ns0:sz ns0:val="18"/>
-                <ns0:szCs ns0:val="18"/>
-                <ns0:lang ns0:eastAsia="en-US"/>
-              </ns0:rPr>
-            </ns0:pPr>
-          </ns0:p>
-          <ns0:p ns2:paraId="028E8A15" ns2:textId="77777777" ns0:rsidR="00CB7AB4" ns0:rsidRDefault="00CB7AB4">
-            <ns0:pPr>
-              <ns0:tabs>
-                <ns0:tab ns0:val="left" ns0:pos="6521"/>
-              </ns0:tabs>
-              <ns0:rPr>
-                <ns0:color ns0:val="1C2E5A"/>
-              </ns0:rPr>
-            </ns0:pPr>
+          <ns0:p>
+            <ns0:pPr/>
+          </ns0:p>
+          <ns0:p>
+            <ns0:pPr/>
+            <ns0:r>
+              <ns0:t>Technologies: Java 8, DataSynapse, Coherence, Spring, Akka, Microservices, TeamCity, Jenkins, Ansible, REST, Git, Gradle, Maven, JUnit, Mockito.</ns0:t>
+            </ns0:r>
           </ns0:p>
         </ns0:tc>
       </ns0:tr>
@@ -2969,21 +1829,8 @@
             <ns0:shd ns0:val="clear" ns0:color="auto" ns0:fill="F2F2F2" ns0:themeFill="background2" ns0:themeFillShade="F2"/>
             <ns0:vAlign ns0:val="center"/>
           </ns0:tcPr>
-          <ns0:p ns2:paraId="7BFDA1B0" ns2:textId="77777777" ns0:rsidR="00BC6829" ns0:rsidRDefault="00BC6829" ns0:rsidP="00BC6829">
-            <ns0:pPr>
-              <ns0:ind ns0:right="-112"/>
-              <ns0:rPr>
-                <ns0:b/>
-                <ns0:bCs/>
-                <ns0:color ns0:val="00B8A2"/>
-              </ns0:rPr>
-            </ns0:pPr>
-            <ns0:r ns0:rsidRPr="000C0081">
-              <ns0:rPr>
-                <ns0:b/>
-                <ns0:bCs/>
-                <ns0:color ns0:val="00B8A2"/>
-              </ns0:rPr>
+          <ns0:p>
+            <ns0:r>
               <ns0:t>04.2014 – 01.2017</ns0:t>
             </ns0:r>
           </ns0:p>
@@ -2994,21 +1841,8 @@
             <ns0:shd ns0:val="clear" ns0:color="auto" ns0:fill="F2F2F2" ns0:themeFill="background2" ns0:themeFillShade="F2"/>
             <ns0:vAlign ns0:val="center"/>
           </ns0:tcPr>
-          <ns0:p ns2:paraId="4C30E502" ns2:textId="77777777" ns0:rsidR="00BC6829" ns0:rsidRDefault="00BC6829" ns0:rsidP="00BC6829">
-            <ns0:pPr>
-              <ns0:ind ns0:right="-337"/>
-              <ns0:rPr>
-                <ns0:b/>
-                <ns0:bCs/>
-                <ns0:color ns0:val="00B8A2"/>
-              </ns0:rPr>
-            </ns0:pPr>
+          <ns0:p>
             <ns0:r>
-              <ns0:rPr>
-                <ns0:b/>
-                <ns0:bCs/>
-                <ns0:color ns0:val="00B8A2"/>
-              </ns0:rPr>
               <ns0:t>Société Générale Corporate &amp; Investment Banking</ns0:t>
             </ns0:r>
           </ns0:p>
@@ -3019,199 +1853,66 @@
           <ns0:tcPr>
             <ns0:tcW ns0:w="1984" ns0:type="dxa"/>
           </ns0:tcPr>
-          <ns0:p ns2:paraId="283330A9" ns2:textId="77777777" ns0:rsidR="00CB7AB4" ns0:rsidRDefault="00CB7AB4">
-            <ns0:pPr>
-              <ns0:ind ns0:right="-337"/>
-              <ns0:rPr>
-                <ns0:b/>
-                <ns0:bCs/>
-                <ns0:color ns0:val="00B8A2"/>
-              </ns0:rPr>
-            </ns0:pPr>
+          <ns0:p>
+            <ns0:r/>
           </ns0:p>
         </ns0:tc>
         <ns0:tc>
           <ns0:tcPr>
             <ns0:tcW ns0:w="8309" ns0:type="dxa"/>
           </ns0:tcPr>
-          <ns0:p ns2:paraId="4EDE9298" ns2:textId="77777777" ns0:rsidR="00CB7AB4" ns0:rsidRPr="005152C2" ns0:rsidRDefault="004A713D">
-            <ns0:pPr>
-              <ns0:spacing ns0:before="120" ns0:after="60"/>
-              <ns0:ind ns0:right="112"/>
-              <ns0:jc ns0:val="both"/>
-              <ns0:rPr>
-                <ns0:rFonts ns0:eastAsiaTheme="minorHAnsi"/>
-                <ns0:b/>
-                <ns0:color ns0:val="1C2E5A"/>
-                <ns0:szCs ns0:val="22"/>
-                <ns0:lang ns0:val="en-US" ns0:eastAsia="en-US"/>
-              </ns0:rPr>
-            </ns0:pPr>
-            <ns0:r ns0:rsidRPr="005152C2">
-              <ns0:rPr>
-                <ns0:rFonts ns0:eastAsiaTheme="minorHAnsi"/>
-                <ns0:b/>
-                <ns0:color ns0:val="1C2E5A"/>
-                <ns0:szCs ns0:val="22"/>
-                <ns0:lang ns0:val="en-US" ns0:eastAsia="en-US"/>
-              </ns0:rPr>
+          <ns0:p>
+            <ns0:pPr/>
+            <ns0:r>
               <ns0:t>Java Core / SQL Developer</ns0:t>
             </ns0:r>
           </ns0:p>
-          <ns0:p ns2:paraId="4BAAAAD5" ns2:textId="77777777" ns0:rsidR="004A713D" ns0:rsidRPr="005152C2" ns0:rsidRDefault="004A713D" ns0:rsidP="004A713D">
-            <ns0:pPr>
-              <ns0:spacing ns0:before="60" ns0:after="60"/>
-              <ns0:ind ns0:right="112"/>
-              <ns0:jc ns0:val="both"/>
-              <ns0:rPr>
-                <ns0:rFonts ns0:eastAsiaTheme="minorHAnsi"/>
-                <ns0:i/>
-                <ns0:color ns0:val="1C2E5A"/>
-                <ns0:lang ns0:val="en-US" ns0:eastAsia="en-US"/>
-              </ns0:rPr>
-            </ns0:pPr>
-            <ns0:r ns0:rsidRPr="005152C2">
-              <ns0:rPr>
-                <ns0:rFonts ns0:eastAsiaTheme="minorHAnsi"/>
-                <ns0:i/>
-                <ns0:color ns0:val="1C2E5A"/>
-                <ns0:lang ns0:val="en-US" ns0:eastAsia="en-US"/>
-              </ns0:rPr>
-              <ns0:t>Built low-latency trade capture and position-management components for synthetic prime brokerage workflows.</ns0:t>
+          <ns0:p>
+            <ns0:pPr/>
+            <ns0:r>
+              <ns0:t>Synthetic Prime Brokerage trade-capture and lifecycle platform</ns0:t>
             </ns0:r>
           </ns0:p>
-          <ns0:p ns2:paraId="6D689082" ns2:textId="77777777" ns0:rsidR="004A713D" ns0:rsidRPr="005152C2" ns0:rsidRDefault="004A713D" ns0:rsidP="004A713D">
+          <ns0:p>
             <ns0:pPr>
               <ns0:pStyle ns0:val="Paragraphedeliste"/>
-              <ns0:numPr>
-                <ns0:ilvl ns0:val="0"/>
-                <ns0:numId ns0:val="8"/>
-              </ns0:numPr>
-              <ns0:spacing ns0:before="120" ns0:after="60"/>
-              <ns0:ind ns0:left="709" ns0:right="112"/>
-              <ns0:rPr>
-                <ns0:rFonts ns0:ascii="Roboto Light" ns0:hAnsi="Roboto Light"/>
-                <ns0:bCs/>
-                <ns0:lang ns0:val="en-US"/>
-              </ns0:rPr>
-            </ns0:pPr>
-            <ns0:r ns0:rsidRPr="005152C2">
-              <ns0:rPr>
-                <ns0:rFonts ns0:ascii="Roboto Light" ns0:hAnsi="Roboto Light" ns0:hint="cs"/>
-                <ns0:bCs/>
-                <ns0:lang ns0:val="en-US"/>
-              </ns0:rPr>
-              <ns0:t>Delivered re-rating and historical replay APIs, BDD test suites and high-touch production support.</ns0:t>
-            </ns0:r>
-          </ns0:p>
-          <ns0:p ns2:paraId="5F7CB0FA" ns2:textId="77777777" ns0:rsidR="00CB7AB4" ns0:rsidRPr="005152C2" ns0:rsidRDefault="00CB7AB4" ns0:rsidP="00B77CB8">
-            <ns0:pPr>
-              <ns0:spacing ns0:before="120" ns0:after="60"/>
-              <ns0:ind ns0:left="349" ns0:right="112"/>
-              <ns0:jc ns0:val="both"/>
-              <ns0:rPr>
-                <ns0:rFonts ns0:ascii="Roboto Light" ns0:hAnsi="Roboto Light"/>
-                <ns0:lang ns0:val="en-US"/>
-              </ns0:rPr>
-            </ns0:pPr>
-          </ns0:p>
-          <ns0:p ns2:paraId="4D9E5A6F" ns2:textId="77777777" ns0:rsidR="004A713D" ns0:rsidRDefault="00F2442C" ns0:rsidP="004A713D">
-            <ns0:pPr>
-              <ns0:spacing ns0:before="60" ns0:after="60"/>
-              <ns0:ind ns0:right="112"/>
-              <ns0:jc ns0:val="both"/>
-              <ns0:rPr>
-                <ns0:rFonts ns0:eastAsiaTheme="minorHAnsi"/>
-                <ns0:i/>
-                <ns0:color ns0:val="262626" ns0:themeColor="text1" ns0:themeTint="D9"/>
-                <ns0:sz ns0:val="18"/>
-                <ns0:szCs ns0:val="18"/>
-                <ns0:lang ns0:eastAsia="en-US"/>
-              </ns0:rPr>
             </ns0:pPr>
             <ns0:r>
-              <ns0:rPr>
-                <ns0:rFonts ns0:eastAsiaTheme="minorHAnsi"/>
-                <ns0:i/>
-                <ns0:color ns0:val="17AF9C"/>
-                <ns0:sz ns0:val="18"/>
-                <ns0:szCs ns0:val="22"/>
-                <ns0:lang ns0:eastAsia="en-US"/>
-              </ns0:rPr>
-              <ns0:t>Technologies :</ns0:t>
+              <ns0:t>Context: Dynamic Portfolio Swap workflow spanning trade capture, valuation, payments, accounting and client reporting.</ns0:t>
             </ns0:r>
+          </ns0:p>
+          <ns0:p>
+            <ns0:pPr>
+              <ns0:pStyle ns0:val="Paragraphedeliste"/>
+            </ns0:pPr>
             <ns0:r>
-              <ns0:rPr>
-                <ns0:rFonts ns0:eastAsiaTheme="minorHAnsi"/>
-                <ns0:i/>
-                <ns0:sz ns0:val="18"/>
-                <ns0:szCs ns0:val="22"/>
-                <ns0:lang ns0:eastAsia="en-US"/>
-              </ns0:rPr>
-              <ns0:t xml:space="preserve"> </ns0:t>
+              <ns0:t>Built low-latency Java components for trade capture, position management and cashflow valuation using java.util.concurrent and blocking-queue patterns.</ns0:t>
             </ns0:r>
-            <ns0:r ns0:rsidR="004A713D" ns0:rsidRPr="004A713D">
-              <ns0:rPr>
-                <ns0:rFonts ns0:eastAsiaTheme="minorHAnsi"/>
-                <ns0:i/>
-                <ns0:color ns0:val="262626" ns0:themeColor="text1" ns0:themeTint="D9"/>
-                <ns0:sz ns0:val="18"/>
-                <ns0:szCs ns0:val="18"/>
-                <ns0:lang ns0:eastAsia="en-US"/>
-              </ns0:rPr>
-              <ns0:t xml:space="preserve">Java </ns0:t>
+          </ns0:p>
+          <ns0:p>
+            <ns0:pPr>
+              <ns0:pStyle ns0:val="Paragraphedeliste"/>
+            </ns0:pPr>
+            <ns0:r>
+              <ns0:t>Delivered a re-rating API with 45-day history replay and prepared BDD test suites with Cucumber.</ns0:t>
             </ns0:r>
-            <ns0:proofErr ns0:type="spellStart"/>
-            <ns0:r ns0:rsidR="004A713D" ns0:rsidRPr="004A713D">
-              <ns0:rPr>
-                <ns0:rFonts ns0:eastAsiaTheme="minorHAnsi"/>
-                <ns0:i/>
-                <ns0:color ns0:val="262626" ns0:themeColor="text1" ns0:themeTint="D9"/>
-                <ns0:sz ns0:val="18"/>
-                <ns0:szCs ns0:val="18"/>
-                <ns0:lang ns0:eastAsia="en-US"/>
-              </ns0:rPr>
-              <ns0:t>Core</ns0:t>
+          </ns0:p>
+          <ns0:p>
+            <ns0:pPr>
+              <ns0:pStyle ns0:val="Paragraphedeliste"/>
+            </ns0:pPr>
+            <ns0:r>
+              <ns0:t>Provided high-touch production support and troubleshooting with end users and global support teams.</ns0:t>
             </ns0:r>
-            <ns0:proofErr ns0:type="spellEnd"/>
-            <ns0:r ns0:rsidR="004A713D" ns0:rsidRPr="004A713D">
-              <ns0:rPr>
-                <ns0:rFonts ns0:eastAsiaTheme="minorHAnsi"/>
-                <ns0:i/>
-                <ns0:color ns0:val="262626" ns0:themeColor="text1" ns0:themeTint="D9"/>
-                <ns0:sz ns0:val="18"/>
-                <ns0:szCs ns0:val="18"/>
-                <ns0:lang ns0:eastAsia="en-US"/>
-              </ns0:rPr>
-              <ns0:t>, SQL, APIs, BDD</ns0:t>
+          </ns0:p>
+          <ns0:p>
+            <ns0:pPr/>
+          </ns0:p>
+          <ns0:p>
+            <ns0:pPr/>
+            <ns0:r>
+              <ns0:t>Technologies: Java 8, Oracle 11g, Cucumber, Ehcache, Apache CXF, REST, Jersey, Swing, Spring 3 / Boot, Hibernate JPA, Git, Maven 3, Jenkins, Nexus, Sonar.</ns0:t>
             </ns0:r>
-          </ns0:p>
-          <ns0:p ns2:paraId="4F003894" ns2:textId="77777777" ns0:rsidR="00C1069F" ns0:rsidRPr="004A713D" ns0:rsidRDefault="00C1069F" ns0:rsidP="004A713D">
-            <ns0:pPr>
-              <ns0:spacing ns0:before="60" ns0:after="60"/>
-              <ns0:ind ns0:right="112"/>
-              <ns0:jc ns0:val="both"/>
-              <ns0:rPr>
-                <ns0:rFonts ns0:eastAsiaTheme="minorHAnsi"/>
-                <ns0:b/>
-                <ns0:bCs/>
-                <ns0:i/>
-                <ns0:color ns0:val="262626" ns0:themeColor="text1" ns0:themeTint="D9"/>
-                <ns0:sz ns0:val="18"/>
-                <ns0:szCs ns0:val="18"/>
-                <ns0:lang ns0:eastAsia="en-US"/>
-              </ns0:rPr>
-            </ns0:pPr>
-          </ns0:p>
-          <ns0:p ns2:paraId="568760F4" ns2:textId="77777777" ns0:rsidR="00CB7AB4" ns0:rsidRDefault="00CB7AB4">
-            <ns0:pPr>
-              <ns0:tabs>
-                <ns0:tab ns0:val="left" ns0:pos="6521"/>
-              </ns0:tabs>
-              <ns0:rPr>
-                <ns0:color ns0:val="1C2E5A"/>
-              </ns0:rPr>
-            </ns0:pPr>
           </ns0:p>
         </ns0:tc>
       </ns0:tr>
@@ -3225,21 +1926,8 @@
             <ns0:shd ns0:val="clear" ns0:color="auto" ns0:fill="F2F2F2" ns0:themeFill="background2" ns0:themeFillShade="F2"/>
             <ns0:vAlign ns0:val="center"/>
           </ns0:tcPr>
-          <ns0:p ns2:paraId="544C7E9B" ns2:textId="77777777" ns0:rsidR="00BC6829" ns0:rsidRDefault="00BC6829" ns0:rsidP="00BC6829">
-            <ns0:pPr>
-              <ns0:ind ns0:right="-112"/>
-              <ns0:rPr>
-                <ns0:b/>
-                <ns0:bCs/>
-                <ns0:color ns0:val="00B8A2"/>
-              </ns0:rPr>
-            </ns0:pPr>
-            <ns0:r ns0:rsidRPr="000C0081">
-              <ns0:rPr>
-                <ns0:b/>
-                <ns0:bCs/>
-                <ns0:color ns0:val="00B8A2"/>
-              </ns0:rPr>
+          <ns0:p>
+            <ns0:r>
               <ns0:t>01.2012 – 04.2014</ns0:t>
             </ns0:r>
           </ns0:p>
@@ -3250,21 +1938,8 @@
             <ns0:shd ns0:val="clear" ns0:color="auto" ns0:fill="F2F2F2" ns0:themeFill="background2" ns0:themeFillShade="F2"/>
             <ns0:vAlign ns0:val="center"/>
           </ns0:tcPr>
-          <ns0:p ns2:paraId="15A1D548" ns2:textId="77777777" ns0:rsidR="00BC6829" ns0:rsidRDefault="00BC6829" ns0:rsidP="00BC6829">
-            <ns0:pPr>
-              <ns0:ind ns0:right="-337"/>
-              <ns0:rPr>
-                <ns0:b/>
-                <ns0:bCs/>
-                <ns0:color ns0:val="00B8A2"/>
-              </ns0:rPr>
-            </ns0:pPr>
+          <ns0:p>
             <ns0:r>
-              <ns0:rPr>
-                <ns0:b/>
-                <ns0:bCs/>
-                <ns0:color ns0:val="00B8A2"/>
-              </ns0:rPr>
               <ns0:t>PMC Carrus Group</ns0:t>
             </ns0:r>
           </ns0:p>
@@ -3275,175 +1950,66 @@
           <ns0:tcPr>
             <ns0:tcW ns0:w="1984" ns0:type="dxa"/>
           </ns0:tcPr>
-          <ns0:p ns2:paraId="506FFFD1" ns2:textId="77777777" ns0:rsidR="00CB7AB4" ns0:rsidRDefault="00CB7AB4">
-            <ns0:pPr>
-              <ns0:ind ns0:right="-337"/>
-              <ns0:rPr>
-                <ns0:b/>
-                <ns0:bCs/>
-                <ns0:color ns0:val="00B8A2"/>
-              </ns0:rPr>
-            </ns0:pPr>
+          <ns0:p>
+            <ns0:r/>
           </ns0:p>
         </ns0:tc>
         <ns0:tc>
           <ns0:tcPr>
             <ns0:tcW ns0:w="8309" ns0:type="dxa"/>
           </ns0:tcPr>
-          <ns0:p ns2:paraId="73B5D129" ns2:textId="77777777" ns0:rsidR="00CB7AB4" ns0:rsidRPr="005152C2" ns0:rsidRDefault="004A713D">
-            <ns0:pPr>
-              <ns0:spacing ns0:before="120" ns0:after="60"/>
-              <ns0:ind ns0:right="112"/>
-              <ns0:jc ns0:val="both"/>
-              <ns0:rPr>
-                <ns0:rFonts ns0:eastAsiaTheme="minorHAnsi"/>
-                <ns0:b/>
-                <ns0:color ns0:val="1C2E5A"/>
-                <ns0:szCs ns0:val="22"/>
-                <ns0:lang ns0:val="en-US" ns0:eastAsia="en-US"/>
-              </ns0:rPr>
-            </ns0:pPr>
-            <ns0:r ns0:rsidRPr="005152C2">
-              <ns0:rPr>
-                <ns0:rFonts ns0:eastAsiaTheme="minorHAnsi"/>
-                <ns0:b/>
-                <ns0:color ns0:val="1C2E5A"/>
-                <ns0:szCs ns0:val="22"/>
-                <ns0:lang ns0:val="en-US" ns0:eastAsia="en-US"/>
-              </ns0:rPr>
+          <ns0:p>
+            <ns0:pPr/>
+            <ns0:r>
               <ns0:t>Java / JEE Developer</ns0:t>
             </ns0:r>
           </ns0:p>
-          <ns0:p ns2:paraId="212602BD" ns2:textId="77777777" ns0:rsidR="004A713D" ns0:rsidRPr="005152C2" ns0:rsidRDefault="004A713D" ns0:rsidP="004A713D">
-            <ns0:pPr>
-              <ns0:spacing ns0:before="60" ns0:after="60"/>
-              <ns0:ind ns0:right="112"/>
-              <ns0:jc ns0:val="both"/>
-              <ns0:rPr>
-                <ns0:rFonts ns0:eastAsiaTheme="minorHAnsi"/>
-                <ns0:i/>
-                <ns0:color ns0:val="1C2E5A"/>
-                <ns0:lang ns0:val="en-US" ns0:eastAsia="en-US"/>
-              </ns0:rPr>
-            </ns0:pPr>
-            <ns0:r ns0:rsidRPr="005152C2">
-              <ns0:rPr>
-                <ns0:rFonts ns0:eastAsiaTheme="minorHAnsi"/>
-                <ns0:i/>
-                <ns0:color ns0:val="1C2E5A"/>
-                <ns0:lang ns0:val="en-US" ns0:eastAsia="en-US"/>
-              </ns0:rPr>
-              <ns0:t>Developed alerting and integration services for real-time betting transaction systems.</ns0:t>
+          <ns0:p>
+            <ns0:pPr/>
+            <ns0:r>
+              <ns0:t>Real-time betting transaction systems and alerting services</ns0:t>
             </ns0:r>
           </ns0:p>
-          <ns0:p ns2:paraId="4A43D56A" ns2:textId="77777777" ns0:rsidR="004A713D" ns0:rsidRPr="005152C2" ns0:rsidRDefault="004A713D" ns0:rsidP="004A713D">
+          <ns0:p>
             <ns0:pPr>
               <ns0:pStyle ns0:val="Paragraphedeliste"/>
-              <ns0:numPr>
-                <ns0:ilvl ns0:val="0"/>
-                <ns0:numId ns0:val="8"/>
-              </ns0:numPr>
-              <ns0:spacing ns0:before="120" ns0:after="60"/>
-              <ns0:ind ns0:left="709" ns0:right="112"/>
-              <ns0:rPr>
-                <ns0:rFonts ns0:ascii="Roboto Light" ns0:hAnsi="Roboto Light"/>
-                <ns0:bCs/>
-                <ns0:lang ns0:val="en-US"/>
-              </ns0:rPr>
-            </ns0:pPr>
-            <ns0:r ns0:rsidRPr="005152C2">
-              <ns0:rPr>
-                <ns0:rFonts ns0:ascii="Roboto Light" ns0:hAnsi="Roboto Light" ns0:hint="cs"/>
-                <ns0:bCs/>
-                <ns0:lang ns0:val="en-US"/>
-              </ns0:rPr>
-              <ns0:t>Implemented messaging, server-push and database procedures, and coached junior developers.</ns0:t>
-            </ns0:r>
-          </ns0:p>
-          <ns0:p ns2:paraId="275F2BA9" ns2:textId="77777777" ns0:rsidR="00CB7AB4" ns0:rsidRPr="005152C2" ns0:rsidRDefault="00CB7AB4" ns0:rsidP="00B77CB8">
-            <ns0:pPr>
-              <ns0:spacing ns0:before="120" ns0:after="60"/>
-              <ns0:ind ns0:left="349" ns0:right="112"/>
-              <ns0:jc ns0:val="both"/>
-              <ns0:rPr>
-                <ns0:rFonts ns0:ascii="Roboto Light" ns0:hAnsi="Roboto Light"/>
-                <ns0:lang ns0:val="en-US"/>
-              </ns0:rPr>
-            </ns0:pPr>
-          </ns0:p>
-          <ns0:p ns2:paraId="091AB84E" ns2:textId="77777777" ns0:rsidR="004A713D" ns0:rsidRDefault="00F2442C" ns0:rsidP="004A713D">
-            <ns0:pPr>
-              <ns0:spacing ns0:before="60" ns0:after="60"/>
-              <ns0:ind ns0:right="112"/>
-              <ns0:jc ns0:val="both"/>
-              <ns0:rPr>
-                <ns0:rFonts ns0:eastAsiaTheme="minorHAnsi"/>
-                <ns0:i/>
-                <ns0:color ns0:val="262626" ns0:themeColor="text1" ns0:themeTint="D9"/>
-                <ns0:sz ns0:val="18"/>
-                <ns0:szCs ns0:val="18"/>
-                <ns0:lang ns0:eastAsia="en-US"/>
-              </ns0:rPr>
             </ns0:pPr>
             <ns0:r>
-              <ns0:rPr>
-                <ns0:rFonts ns0:eastAsiaTheme="minorHAnsi"/>
-                <ns0:i/>
-                <ns0:color ns0:val="17AF9C"/>
-                <ns0:sz ns0:val="18"/>
-                <ns0:szCs ns0:val="22"/>
-                <ns0:lang ns0:eastAsia="en-US"/>
-              </ns0:rPr>
-              <ns0:t>Technologies :</ns0:t>
+              <ns0:t>Context: real-time horse-betting transaction systems with alerting, integration and operational supervision needs.</ns0:t>
             </ns0:r>
+          </ns0:p>
+          <ns0:p>
+            <ns0:pPr>
+              <ns0:pStyle ns0:val="Paragraphedeliste"/>
+            </ns0:pPr>
             <ns0:r>
-              <ns0:rPr>
-                <ns0:rFonts ns0:eastAsiaTheme="minorHAnsi"/>
-                <ns0:i/>
-                <ns0:sz ns0:val="18"/>
-                <ns0:szCs ns0:val="22"/>
-                <ns0:lang ns0:eastAsia="en-US"/>
-              </ns0:rPr>
-              <ns0:t xml:space="preserve"> </ns0:t>
+              <ns0:t>Built alerting and integration services with message-driven EJBs and Java CCI to exchange with heterogeneous information-system components.</ns0:t>
             </ns0:r>
-            <ns0:r ns0:rsidR="004A713D" ns0:rsidRPr="004A713D">
-              <ns0:rPr>
-                <ns0:rFonts ns0:eastAsiaTheme="minorHAnsi"/>
-                <ns0:i/>
-                <ns0:color ns0:val="262626" ns0:themeColor="text1" ns0:themeTint="D9"/>
-                <ns0:sz ns0:val="18"/>
-                <ns0:szCs ns0:val="18"/>
-                <ns0:lang ns0:eastAsia="en-US"/>
-              </ns0:rPr>
-              <ns0:t>Java, JEE</ns0:t>
+          </ns0:p>
+          <ns0:p>
+            <ns0:pPr>
+              <ns0:pStyle ns0:val="Paragraphedeliste"/>
+            </ns0:pPr>
+            <ns0:r>
+              <ns0:t>Implemented server-push synchronisation for the UI, stored procedures and shell scripting, and configured Apache HTTP / JBoss SOA environments.</ns0:t>
             </ns0:r>
           </ns0:p>
-          <ns0:p ns2:paraId="611D4DDE" ns2:textId="77777777" ns0:rsidR="00C1069F" ns0:rsidRPr="004A713D" ns0:rsidRDefault="00C1069F" ns0:rsidP="004A713D">
+          <ns0:p>
             <ns0:pPr>
-              <ns0:spacing ns0:before="60" ns0:after="60"/>
-              <ns0:ind ns0:right="112"/>
-              <ns0:jc ns0:val="both"/>
-              <ns0:rPr>
-                <ns0:rFonts ns0:eastAsiaTheme="minorHAnsi"/>
-                <ns0:b/>
-                <ns0:bCs/>
-                <ns0:i/>
-                <ns0:color ns0:val="262626" ns0:themeColor="text1" ns0:themeTint="D9"/>
-                <ns0:sz ns0:val="18"/>
-                <ns0:szCs ns0:val="18"/>
-                <ns0:lang ns0:eastAsia="en-US"/>
-              </ns0:rPr>
+              <ns0:pStyle ns0:val="Paragraphedeliste"/>
             </ns0:pPr>
-          </ns0:p>
-          <ns0:p ns2:paraId="3C412D11" ns2:textId="77777777" ns0:rsidR="00CB7AB4" ns0:rsidRDefault="00CB7AB4">
-            <ns0:pPr>
-              <ns0:tabs>
-                <ns0:tab ns0:val="left" ns0:pos="6521"/>
-              </ns0:tabs>
-              <ns0:rPr>
-                <ns0:color ns0:val="1C2E5A"/>
-              </ns0:rPr>
-            </ns0:pPr>
+            <ns0:r>
+              <ns0:t>Mentored three junior developers.</ns0:t>
+            </ns0:r>
+          </ns0:p>
+          <ns0:p>
+            <ns0:pPr/>
+          </ns0:p>
+          <ns0:p>
+            <ns0:pPr/>
+            <ns0:r>
+              <ns0:t>Technologies: Java / JEE, JSP, Servlet, EJB 3, JCA, JBoss, ZK, Sybase, T-SQL, XML, Shell, Maven, SVN, Jenkins, Windows, Linux.</ns0:t>
+            </ns0:r>
           </ns0:p>
         </ns0:tc>
       </ns0:tr>
@@ -3457,21 +2023,8 @@
             <ns0:shd ns0:val="clear" ns0:color="auto" ns0:fill="F2F2F2" ns0:themeFill="background2" ns0:themeFillShade="F2"/>
             <ns0:vAlign ns0:val="center"/>
           </ns0:tcPr>
-          <ns0:p ns2:paraId="39C16788" ns2:textId="77777777" ns0:rsidR="00BC6829" ns0:rsidRDefault="00BC6829" ns0:rsidP="00BC6829">
-            <ns0:pPr>
-              <ns0:ind ns0:right="-112"/>
-              <ns0:rPr>
-                <ns0:b/>
-                <ns0:bCs/>
-                <ns0:color ns0:val="00B8A2"/>
-              </ns0:rPr>
-            </ns0:pPr>
-            <ns0:r ns0:rsidRPr="000C0081">
-              <ns0:rPr>
-                <ns0:b/>
-                <ns0:bCs/>
-                <ns0:color ns0:val="00B8A2"/>
-              </ns0:rPr>
+          <ns0:p>
+            <ns0:r>
               <ns0:t>07.2010 – 12.2011</ns0:t>
             </ns0:r>
           </ns0:p>
@@ -3482,21 +2035,8 @@
             <ns0:shd ns0:val="clear" ns0:color="auto" ns0:fill="F2F2F2" ns0:themeFill="background2" ns0:themeFillShade="F2"/>
             <ns0:vAlign ns0:val="center"/>
           </ns0:tcPr>
-          <ns0:p ns2:paraId="4BAD9370" ns2:textId="77777777" ns0:rsidR="00BC6829" ns0:rsidRDefault="00BC6829" ns0:rsidP="00BC6829">
-            <ns0:pPr>
-              <ns0:ind ns0:right="-337"/>
-              <ns0:rPr>
-                <ns0:b/>
-                <ns0:bCs/>
-                <ns0:color ns0:val="00B8A2"/>
-              </ns0:rPr>
-            </ns0:pPr>
+          <ns0:p>
             <ns0:r>
-              <ns0:rPr>
-                <ns0:b/>
-                <ns0:bCs/>
-                <ns0:color ns0:val="00B8A2"/>
-              </ns0:rPr>
               <ns0:t>VINCI / Cofiroute</ns0:t>
             </ns0:r>
           </ns0:p>
@@ -3507,127 +2047,49 @@
           <ns0:tcPr>
             <ns0:tcW ns0:w="1984" ns0:type="dxa"/>
           </ns0:tcPr>
-          <ns0:p ns2:paraId="19DFC4C9" ns2:textId="77777777" ns0:rsidR="00CB7AB4" ns0:rsidRDefault="00CB7AB4">
-            <ns0:pPr>
-              <ns0:ind ns0:right="-337"/>
-              <ns0:rPr>
-                <ns0:b/>
-                <ns0:bCs/>
-                <ns0:color ns0:val="00B8A2"/>
-              </ns0:rPr>
-            </ns0:pPr>
+          <ns0:p>
+            <ns0:r/>
           </ns0:p>
         </ns0:tc>
         <ns0:tc>
           <ns0:tcPr>
             <ns0:tcW ns0:w="8309" ns0:type="dxa"/>
           </ns0:tcPr>
-          <ns0:p ns2:paraId="388D0FF0" ns2:textId="77777777" ns0:rsidR="00CB7AB4" ns0:rsidRPr="005152C2" ns0:rsidRDefault="004A713D">
-            <ns0:pPr>
-              <ns0:spacing ns0:before="120" ns0:after="60"/>
-              <ns0:ind ns0:right="112"/>
-              <ns0:jc ns0:val="both"/>
-              <ns0:rPr>
-                <ns0:rFonts ns0:eastAsiaTheme="minorHAnsi"/>
-                <ns0:b/>
-                <ns0:color ns0:val="1C2E5A"/>
-                <ns0:szCs ns0:val="22"/>
-                <ns0:lang ns0:val="en-US" ns0:eastAsia="en-US"/>
-              </ns0:rPr>
-            </ns0:pPr>
-            <ns0:r ns0:rsidRPr="005152C2">
-              <ns0:rPr>
-                <ns0:rFonts ns0:eastAsiaTheme="minorHAnsi"/>
-                <ns0:b/>
-                <ns0:color ns0:val="1C2E5A"/>
-                <ns0:szCs ns0:val="22"/>
-                <ns0:lang ns0:val="en-US" ns0:eastAsia="en-US"/>
-              </ns0:rPr>
+          <ns0:p>
+            <ns0:pPr/>
+            <ns0:r>
               <ns0:t>Java Consultant</ns0:t>
             </ns0:r>
           </ns0:p>
-          <ns0:p ns2:paraId="16A93784" ns2:textId="77777777" ns0:rsidR="004A713D" ns0:rsidRPr="005152C2" ns0:rsidRDefault="004A713D" ns0:rsidP="004A713D">
+          <ns0:p>
+            <ns0:pPr/>
+            <ns0:r>
+              <ns0:t>Automated tolling data conversion and fraud-supervision tooling</ns0:t>
+            </ns0:r>
+          </ns0:p>
+          <ns0:p>
             <ns0:pPr>
-              <ns0:spacing ns0:before="60" ns0:after="60"/>
-              <ns0:ind ns0:right="112"/>
-              <ns0:jc ns0:val="both"/>
-              <ns0:rPr>
-                <ns0:rFonts ns0:eastAsiaTheme="minorHAnsi"/>
-                <ns0:i/>
-                <ns0:color ns0:val="1C2E5A"/>
-                <ns0:lang ns0:val="en-US" ns0:eastAsia="en-US"/>
-              </ns0:rPr>
-            </ns0:pPr>
-            <ns0:r ns0:rsidRPr="005152C2">
-              <ns0:rPr>
-                <ns0:rFonts ns0:eastAsiaTheme="minorHAnsi"/>
-                <ns0:i/>
-                <ns0:color ns0:val="1C2E5A"/>
-                <ns0:lang ns0:val="en-US" ns0:eastAsia="en-US"/>
-              </ns0:rPr>
-              <ns0:t>Built file-conversion and supervision applications using Java, Spring Batch, XML and Oracle.</ns0:t>
-            </ns0:r>
-          </ns0:p>
-          <ns0:p ns2:paraId="3A000320" ns2:textId="77777777" ns0:rsidR="005152C2" ns0:rsidRDefault="005152C2" ns0:rsidP="005152C2">
-            <ns0:pPr>
-              <ns0:spacing ns0:before="60" ns0:after="60"/>
-              <ns0:ind ns0:right="112"/>
-              <ns0:jc ns0:val="both"/>
-              <ns0:rPr>
-                <ns0:rFonts ns0:eastAsiaTheme="minorHAnsi"/>
-                <ns0:i/>
-                <ns0:color ns0:val="17AF9C"/>
-                <ns0:sz ns0:val="18"/>
-                <ns0:szCs ns0:val="22"/>
-                <ns0:lang ns0:eastAsia="en-US"/>
-              </ns0:rPr>
-            </ns0:pPr>
-          </ns0:p>
-          <ns0:p ns2:paraId="145CEA89" ns2:textId="51C2D206" ns0:rsidR="005152C2" ns0:rsidRPr="005152C2" ns0:rsidRDefault="00F2442C" ns0:rsidP="005152C2">
-            <ns0:pPr>
-              <ns0:spacing ns0:before="60" ns0:after="60"/>
-              <ns0:ind ns0:right="112"/>
-              <ns0:jc ns0:val="both"/>
-              <ns0:rPr>
-                <ns0:rFonts ns0:eastAsiaTheme="minorHAnsi"/>
-                <ns0:i/>
-                <ns0:color ns0:val="262626" ns0:themeColor="text1" ns0:themeTint="D9"/>
-                <ns0:sz ns0:val="18"/>
-                <ns0:szCs ns0:val="18"/>
-                <ns0:lang ns0:eastAsia="en-US"/>
-              </ns0:rPr>
+              <ns0:pStyle ns0:val="Paragraphedeliste"/>
             </ns0:pPr>
             <ns0:r>
-              <ns0:rPr>
-                <ns0:rFonts ns0:eastAsiaTheme="minorHAnsi"/>
-                <ns0:i/>
-                <ns0:color ns0:val="17AF9C"/>
-                <ns0:sz ns0:val="18"/>
-                <ns0:szCs ns0:val="22"/>
-                <ns0:lang ns0:eastAsia="en-US"/>
-              </ns0:rPr>
-              <ns0:t>Technologies :</ns0:t>
+              <ns0:t>Context: automated tolling and fraud-supervision systems for Cofiroute.</ns0:t>
             </ns0:r>
+          </ns0:p>
+          <ns0:p>
+            <ns0:pPr>
+              <ns0:pStyle ns0:val="Paragraphedeliste"/>
+            </ns0:pPr>
             <ns0:r>
-              <ns0:rPr>
-                <ns0:rFonts ns0:eastAsiaTheme="minorHAnsi"/>
-                <ns0:i/>
-                <ns0:sz ns0:val="18"/>
-                <ns0:szCs ns0:val="22"/>
-                <ns0:lang ns0:eastAsia="en-US"/>
-              </ns0:rPr>
-              <ns0:t xml:space="preserve"> </ns0:t>
+              <ns0:t>Built flat-file to XML conversion workflows with Spring Batch and JAXB plus a web supervision application using JSP and Ext JS.</ns0:t>
             </ns0:r>
-            <ns0:r ns0:rsidR="004A713D" ns0:rsidRPr="004A713D">
-              <ns0:rPr>
-                <ns0:rFonts ns0:eastAsiaTheme="minorHAnsi"/>
-                <ns0:i/>
-                <ns0:color ns0:val="262626" ns0:themeColor="text1" ns0:themeTint="D9"/>
-                <ns0:sz ns0:val="18"/>
-                <ns0:szCs ns0:val="18"/>
-                <ns0:lang ns0:eastAsia="en-US"/>
-              </ns0:rPr>
-              <ns0:t>Java, Spring Batch, XML, Oracle</ns0:t>
+          </ns0:p>
+          <ns0:p>
+            <ns0:pPr/>
+          </ns0:p>
+          <ns0:p>
+            <ns0:pPr/>
+            <ns0:r>
+              <ns0:t>Technologies: Oracle 11g, Java / JEE, Spring MVC / Batch / Security, Hibernate, SQL / PL-SQL, XML / XSD, JavaScript, Ext JS, Tomcat, SVN.</ns0:t>
             </ns0:r>
           </ns0:p>
         </ns0:tc>
@@ -3642,6 +2104,7 @@
           <ns0:color ns0:val="1C2E5A"/>
         </ns0:rPr>
       </ns0:pPr>
+      <ns0:r/>
     </ns0:p>
     <ns0:p ns2:paraId="31403CF2" ns2:textId="77777777" ns0:rsidR="00345433" ns0:rsidRDefault="00345433" ns0:rsidP="00345433">
       <ns0:pPr>
@@ -3661,6 +2124,7 @@
           <ns0:docGrid ns0:linePitch="299"/>
         </ns0:sectPr>
       </ns0:pPr>
+      <ns0:r/>
     </ns0:p>
     <ns0:p ns2:paraId="28B769CF" ns2:textId="40924548" ns0:rsidR="008B2185" ns0:rsidRDefault="00194A50">
       <ns0:pPr>
@@ -3702,6 +2166,7 @@
           <ns0:docGrid ns0:linePitch="299"/>
         </ns0:sectPr>
       </ns0:pPr>
+      <ns0:r/>
     </ns0:p>
     <ns0:p ns2:paraId="0163DFAA" ns2:textId="4AD893A7" ns0:rsidR="0065673B" ns0:rsidRPr="0065673B" ns0:rsidRDefault="0065673B" ns0:rsidP="0065673B">
       <ns0:pPr>
@@ -3715,7 +2180,7 @@
         </ns0:rPr>
       </ns0:pPr>
       <ns0:r>
-        <ns0:t>No-code risk pipeline platform with safe promotion rails</ns0:t>
+        <ns0:t>No-code platform for business-controlled risk processing</ns0:t>
       </ns0:r>
     </ns0:p>
     <ns0:p ns2:paraId="13C1D1AB" ns2:textId="5BD209F2" ns0:rsidR="008B2185" ns0:rsidRDefault="005152C2" ns0:rsidP="00BE58E5">
@@ -3728,10 +2193,8 @@
           <ns0:lang ns0:val="en-US"/>
         </ns0:rPr>
       </ns0:pPr>
-      <ns0:proofErr ns0:type="spellStart"/>
-      <ns0:proofErr ns0:type="spellEnd"/>
       <ns0:r>
-        <ns0:t>Designed a JSON-driven pipeline model that lets analysts and business teams define processing logic while the platform compiles it into Spark and Spark SQL execution. Wrapped it in a controlled lifecycle with draft, validated and live states, immutable versions, automated validation gates and approval-based promotion to production.</ns0:t>
+        <ns0:t>Designed a JSON-driven platform that lets business analysts and delivery teams model processing logic through guided flows while the runtime compiles it into Spark and Spark SQL execution with controlled promotion to production.</ns0:t>
       </ns0:r>
     </ns0:p>
     <ns0:p ns2:paraId="0163DFAA" ns2:textId="4AD893A7" ns0:rsidR="0065673B" ns0:rsidRPr="0065673B" ns0:rsidRDefault="0065673B" ns0:rsidP="0065673B">
@@ -3746,7 +2209,7 @@
         </ns0:rPr>
       </ns0:pPr>
       <ns0:r>
-        <ns0:t>Governed business screens over raw S3 and risk data</ns0:t>
+        <ns0:t>Governed business views over raw risk data</ns0:t>
       </ns0:r>
     </ns0:p>
     <ns0:p ns2:paraId="13C1D1AB" ns2:textId="5BD209F2" ns0:rsidR="008B2185" ns0:rsidRDefault="005152C2" ns0:rsidP="00BE58E5">
@@ -3759,10 +2222,8 @@
           <ns0:lang ns0:val="en-US"/>
         </ns0:rPr>
       </ns0:pPr>
-      <ns0:proofErr ns0:type="spellStart"/>
-      <ns0:proofErr ns0:type="spellEnd"/>
       <ns0:r>
-        <ns0:t>Built the path from catalogued raw data to business-facing screens: automatic data catalog indexing, admin-configured views, drill-down and drill-through navigation, per-scenario analysis, and correct re-aggregation logic for additive and non-additive measures such as VaR.</ns0:t>
+        <ns0:t>Built the path from catalogued raw data to business-facing screens: automatic data catalog indexing, admin-configured views, drill-down and drill-through navigation, scenario analysis, and correct re-aggregation logic for additive and non-additive measures such as VaR.</ns0:t>
       </ns0:r>
     </ns0:p>
     <ns0:p ns2:paraId="0163DFAA" ns2:textId="4AD893A7" ns0:rsidR="0065673B" ns0:rsidRPr="0065673B" ns0:rsidRDefault="0065673B" ns0:rsidP="0065673B">
@@ -3777,7 +2238,7 @@
         </ns0:rPr>
       </ns0:pPr>
       <ns0:r>
-        <ns0:t>Cross-cloud event-driven migration of production risk workloads</ns0:t>
+        <ns0:t>Cross-cloud migration of energy and market-risk workloads</ns0:t>
       </ns0:r>
     </ns0:p>
     <ns0:p ns2:paraId="13C1D1AB" ns2:textId="5BD209F2" ns0:rsidR="008B2185" ns0:rsidRDefault="005152C2" ns0:rsidP="00BE58E5">
@@ -3790,8 +2251,6 @@
           <ns0:lang ns0:val="en-US"/>
         </ns0:rPr>
       </ns0:pPr>
-      <ns0:proofErr ns0:type="spellStart"/>
-      <ns0:proofErr ns0:type="spellEnd"/>
       <ns0:r>
         <ns0:t>Replaced file-watching integrations with AWS event-driven components using S3, Lambda, Glue and EventBridge, while bridging AWS and Azure workloads and preserving traceability, monitoring and delivery control across the migration path.</ns0:t>
       </ns0:r>
@@ -3808,7 +2267,7 @@
         </ns0:rPr>
       </ns0:pPr>
       <ns0:r>
-        <ns0:t>Lakehouse patterns that transfer cleanly to Databricks</ns0:t>
+        <ns0:t>Lakehouse patterns ready for Databricks scale-out</ns0:t>
       </ns0:r>
     </ns0:p>
     <ns0:p ns2:paraId="13C1D1AB" ns2:textId="5BD209F2" ns0:rsidR="008B2185" ns0:rsidRDefault="005152C2" ns0:rsidP="00BE58E5">
@@ -3821,10 +2280,8 @@
           <ns0:lang ns0:val="en-US"/>
         </ns0:rPr>
       </ns0:pPr>
-      <ns0:proofErr ns0:type="spellStart"/>
-      <ns0:proofErr ns0:type="spellEnd"/>
       <ns0:r>
-        <ns0:t>Applied Spark, Iceberg, Athena and governance patterns that map directly to Delta Lake, Unity Catalog, Databricks SQL and Delta Live Tables, with particular depth in data correctness, release discipline and performance-aware risk aggregation.</ns0:t>
+        <ns0:t>Applied Spark, Iceberg, Athena and governance patterns that transfer directly to Delta Lake, Unity Catalog, Databricks SQL and Delta Live Tables, with particular depth in data correctness, release discipline and performance-aware risk aggregation.</ns0:t>
       </ns0:r>
     </ns0:p>
     <ns0:p ns2:paraId="0163DFAA" ns2:textId="4AD893A7" ns0:rsidR="0065673B" ns0:rsidRPr="0065673B" ns0:rsidRDefault="0065673B" ns0:rsidP="0065673B">
@@ -3839,7 +2296,7 @@
         </ns0:rPr>
       </ns0:pPr>
       <ns0:r>
-        <ns0:t>Platform engineering that keeps delivery boring</ns0:t>
+        <ns0:t>Operational ownership: support, automation and industrialisation</ns0:t>
       </ns0:r>
     </ns0:p>
     <ns0:p ns2:paraId="13C1D1AB" ns2:textId="5BD209F2" ns0:rsidR="008B2185" ns0:rsidRDefault="005152C2" ns0:rsidP="00BE58E5">
@@ -3852,10 +2309,8 @@
           <ns0:lang ns0:val="en-US"/>
         </ns0:rPr>
       </ns0:pPr>
-      <ns0:proofErr ns0:type="spellStart"/>
-      <ns0:proofErr ns0:type="spellEnd"/>
       <ns0:r>
-        <ns0:t>Built reusable CI/CD assets, Kubernetes-based runtime foundations, passwordless cloud authentication patterns, and cost-control automation aimed at making data and platform systems reproducible, secure and inexpensive when idle.</ns0:t>
+        <ns0:t>Built reusable CI/CD assets, observability patterns, passwordless cloud authentication flows and cost-control automation aimed at reducing manual interventions and keeping production data platforms reliable and inexpensive when idle.</ns0:t>
       </ns0:r>
     </ns0:p>
     <ns0:p ns2:paraId="31403CF2" ns2:textId="77777777" ns0:rsidR="00345433" ns0:rsidRDefault="00345433" ns0:rsidP="00345433">
@@ -3876,6 +2331,7 @@
           <ns0:docGrid ns0:linePitch="299"/>
         </ns0:sectPr>
       </ns0:pPr>
+      <ns0:r/>
     </ns0:p>
     <ns0:p ns2:paraId="28B769CF" ns2:textId="40924548" ns0:rsidR="008B2185" ns0:rsidRDefault="00194A50">
       <ns0:pPr>
@@ -3917,6 +2373,7 @@
           <ns0:docGrid ns0:linePitch="299"/>
         </ns0:sectPr>
       </ns0:pPr>
+      <ns0:r/>
     </ns0:p>
     <ns0:p ns2:paraId="4FF2DE45" ns2:textId="560A55F1" ns0:rsidR="00221283" ns0:rsidRPr="005152C2" ns0:rsidRDefault="0065673B" ns0:rsidP="00221283">
       <ns0:pPr>
@@ -3933,12 +2390,8 @@
           <ns0:lang ns0:val="de-CH"/>
         </ns0:rPr>
       </ns0:pPr>
-      <ns0:proofErr ns0:type="spellStart"/>
-      <ns0:proofErr ns0:type="spellEnd"/>
-      <ns0:proofErr ns0:type="spellStart"/>
-      <ns0:proofErr ns0:type="spellEnd"/>
       <ns0:r>
-        <ns0:t>Risk data products with auditability and release control</ns0:t>
+        <ns0:t>Risk and trading data products with auditability and release control</ns0:t>
       </ns0:r>
     </ns0:p>
     <ns0:p ns2:paraId="4FF2DE45" ns2:textId="560A55F1" ns0:rsidR="00221283" ns0:rsidRPr="005152C2" ns0:rsidRDefault="0065673B" ns0:rsidP="00221283">
@@ -3956,12 +2409,8 @@
           <ns0:lang ns0:val="de-CH"/>
         </ns0:rPr>
       </ns0:pPr>
-      <ns0:proofErr ns0:type="spellStart"/>
-      <ns0:proofErr ns0:type="spellEnd"/>
-      <ns0:proofErr ns0:type="spellStart"/>
-      <ns0:proofErr ns0:type="spellEnd"/>
       <ns0:r>
-        <ns0:t>Serverless and Spark-based data processing on AWS</ns0:t>
+        <ns0:t>Event-driven and Spark-based data processing on AWS and Databricks</ns0:t>
       </ns0:r>
     </ns0:p>
     <ns0:p ns2:paraId="4FF2DE45" ns2:textId="560A55F1" ns0:rsidR="00221283" ns0:rsidRPr="005152C2" ns0:rsidRDefault="0065673B" ns0:rsidP="00221283">
@@ -3979,12 +2428,8 @@
           <ns0:lang ns0:val="de-CH"/>
         </ns0:rPr>
       </ns0:pPr>
-      <ns0:proofErr ns0:type="spellStart"/>
-      <ns0:proofErr ns0:type="spellEnd"/>
-      <ns0:proofErr ns0:type="spellStart"/>
-      <ns0:proofErr ns0:type="spellEnd"/>
       <ns0:r>
-        <ns0:t>Catalog, discovery and governed access to data assets</ns0:t>
+        <ns0:t>Catalog, discovery and governed access to risk and business data assets</ns0:t>
       </ns0:r>
     </ns0:p>
     <ns0:p ns2:paraId="4FF2DE45" ns2:textId="560A55F1" ns0:rsidR="00221283" ns0:rsidRPr="005152C2" ns0:rsidRDefault="0065673B" ns0:rsidP="00221283">
@@ -4002,12 +2447,8 @@
           <ns0:lang ns0:val="de-CH"/>
         </ns0:rPr>
       </ns0:pPr>
-      <ns0:proofErr ns0:type="spellStart"/>
-      <ns0:proofErr ns0:type="spellEnd"/>
-      <ns0:proofErr ns0:type="spellStart"/>
-      <ns0:proofErr ns0:type="spellEnd"/>
       <ns0:r>
-        <ns0:t>Interactive drill and aggregation paths for business users</ns0:t>
+        <ns0:t>Interactive drill, explain and aggregation paths for business users</ns0:t>
       </ns0:r>
     </ns0:p>
     <ns0:p ns2:paraId="4FF2DE45" ns2:textId="560A55F1" ns0:rsidR="00221283" ns0:rsidRPr="005152C2" ns0:rsidRDefault="0065673B" ns0:rsidP="00221283">
@@ -4025,12 +2466,8 @@
           <ns0:lang ns0:val="de-CH"/>
         </ns0:rPr>
       </ns0:pPr>
-      <ns0:proofErr ns0:type="spellStart"/>
-      <ns0:proofErr ns0:type="spellEnd"/>
-      <ns0:proofErr ns0:type="spellStart"/>
-      <ns0:proofErr ns0:type="spellEnd"/>
       <ns0:r>
-        <ns0:t>Correct treatment of non-additive metrics such as VaR</ns0:t>
+        <ns0:t>Correct treatment of non-additive metrics such as VaR and PnL explains</ns0:t>
       </ns0:r>
     </ns0:p>
     <ns0:p ns2:paraId="4FF2DE45" ns2:textId="560A55F1" ns0:rsidR="00221283" ns0:rsidRPr="005152C2" ns0:rsidRDefault="0065673B" ns0:rsidP="00221283">
@@ -4048,12 +2485,8 @@
           <ns0:lang ns0:val="de-CH"/>
         </ns0:rPr>
       </ns0:pPr>
-      <ns0:proofErr ns0:type="spellStart"/>
-      <ns0:proofErr ns0:type="spellEnd"/>
-      <ns0:proofErr ns0:type="spellStart"/>
-      <ns0:proofErr ns0:type="spellEnd"/>
       <ns0:r>
-        <ns0:t>Reusable developer platforms and CI/CD templates</ns0:t>
+        <ns0:t>Reusable developer platforms, CI/CD templates and delivery guardrails</ns0:t>
       </ns0:r>
     </ns0:p>
     <ns0:p ns2:paraId="4FF2DE45" ns2:textId="560A55F1" ns0:rsidR="00221283" ns0:rsidRPr="005152C2" ns0:rsidRDefault="0065673B" ns0:rsidP="00221283">
@@ -4071,12 +2504,8 @@
           <ns0:lang ns0:val="de-CH"/>
         </ns0:rPr>
       </ns0:pPr>
-      <ns0:proofErr ns0:type="spellStart"/>
-      <ns0:proofErr ns0:type="spellEnd"/>
-      <ns0:proofErr ns0:type="spellStart"/>
-      <ns0:proofErr ns0:type="spellEnd"/>
       <ns0:r>
-        <ns0:t>Hybrid and cross-cloud operating models</ns0:t>
+        <ns0:t>Hybrid and cross-cloud operating models across AWS and Azure</ns0:t>
       </ns0:r>
     </ns0:p>
     <ns0:p ns2:paraId="4FF2DE45" ns2:textId="560A55F1" ns0:rsidR="00221283" ns0:rsidRPr="005152C2" ns0:rsidRDefault="0065673B" ns0:rsidP="00221283">
@@ -4094,12 +2523,8 @@
           <ns0:lang ns0:val="de-CH"/>
         </ns0:rPr>
       </ns0:pPr>
-      <ns0:proofErr ns0:type="spellStart"/>
-      <ns0:proofErr ns0:type="spellEnd"/>
-      <ns0:proofErr ns0:type="spellStart"/>
-      <ns0:proofErr ns0:type="spellEnd"/>
       <ns0:r>
-        <ns0:t>Cost-aware runtime design and scale-to-zero instincts</ns0:t>
+        <ns0:t>Support, observability and automation for critical production workflows</ns0:t>
       </ns0:r>
     </ns0:p>
     <ns0:p ns2:paraId="31403CF2" ns2:textId="77777777" ns0:rsidR="00345433" ns0:rsidRDefault="00345433" ns0:rsidP="00345433">
@@ -4120,6 +2545,7 @@
           <ns0:docGrid ns0:linePitch="299"/>
         </ns0:sectPr>
       </ns0:pPr>
+      <ns0:r/>
     </ns0:p>
     <ns0:sectPr ns0:rsidR="008B2185" ns0:rsidSect="00345433">
       <ns0:type ns0:val="continuous"/>

</xml_diff>